<commit_message>
Report: clean submission version, natural Vietnamese prose, 20 pages
Co-Authored-By: Claude Opus 5.5 (1M context) <noreply@anthropic.com>
</commit_message>
<xml_diff>
--- a/report_vi/BaoCao_HDH_Nhom3Stars.docx
+++ b/report_vi/BaoCao_HDH_Nhom3Stars.docx
@@ -10,7 +10,7 @@
         <w:rPr>
           <w:b/>
         </w:rPr>
-        <w:t>Trường: Đại học Bách khoa Hà Nội (HUST); Học phần: Hệ điều hành</w:t>
+        <w:t>ĐẠI HỌC BÁCH KHOA HÀ NỘI</w:t>
       </w:r>
     </w:p>
     <w:p>
@@ -21,7 +21,7 @@
         <w:rPr>
           <w:b/>
         </w:rPr>
-        <w:t>Đề tài: NỀN TẢNG THỰC THI EDGE-AI KHÔNG ĐỒNG NHẤT (Heterogeneous Edge-AI Runtime)</w:t>
+        <w:t>BÁO CÁO BÀI TẬP LỚN</w:t>
       </w:r>
     </w:p>
     <w:p>
@@ -29,15 +29,207 @@
         <w:pStyle w:val="Cover"/>
       </w:pPr>
       <w:r>
+        <w:rPr>
+          <w:b/>
+        </w:rPr>
+        <w:t>HỌC PHẦN: HỆ ĐIỀU HÀNH</w:t>
+      </w:r>
+    </w:p>
+    <w:p>
+      <w:pPr>
+        <w:pStyle w:val="CoverTitle"/>
+      </w:pPr>
+      <w:r>
+        <w:rPr>
+          <w:b/>
+        </w:rPr>
+        <w:t>NỀN TẢNG THỰC THI EDGE-AI KHÔNG ĐỒNG NHẤT</w:t>
+      </w:r>
+    </w:p>
+    <w:p>
+      <w:pPr>
+        <w:pStyle w:val="Cover"/>
+      </w:pPr>
+      <w:r>
+        <w:rPr>
+          <w:i/>
+        </w:rPr>
+        <w:t>Heterogeneous Edge-AI Runtime</w:t>
+      </w:r>
+    </w:p>
+    <w:p>
+      <w:pPr>
+        <w:pStyle w:val="Cover"/>
+      </w:pPr>
+      <w:r>
         <w:t>Nhóm thực hiện: 3 Stars</w:t>
       </w:r>
     </w:p>
+    <w:tbl>
+      <w:tblPr>
+        <w:tblW w:w="9071" w:type="dxa"/>
+        <w:tblInd w:w="10" w:type="dxa"/>
+        <w:tblBorders>
+          <w:top w:val="single" w:sz="4" w:space="0" w:color="808080"/>
+          <w:left w:val="single" w:sz="4" w:space="0" w:color="808080"/>
+          <w:bottom w:val="single" w:sz="4" w:space="0" w:color="808080"/>
+          <w:right w:val="single" w:sz="4" w:space="0" w:color="808080"/>
+          <w:insideH w:val="single" w:sz="4" w:space="0" w:color="808080"/>
+          <w:insideV w:val="single" w:sz="4" w:space="0" w:color="808080"/>
+        </w:tblBorders>
+        <w:tblLayout w:type="fixed"/>
+        <w:tblCellMar>
+          <w:top w:w="60" w:type="dxa"/>
+          <w:left w:w="10" w:type="dxa"/>
+          <w:bottom w:w="60" w:type="dxa"/>
+          <w:right w:w="10" w:type="dxa"/>
+        </w:tblCellMar>
+        <w:tblLook w:val="04A0" w:firstRow="1" w:lastRow="0" w:firstColumn="1" w:lastColumn="0" w:noHBand="0" w:noVBand="1"/>
+      </w:tblPr>
+      <w:tblGrid>
+        <w:gridCol w:w="4535"/>
+        <w:gridCol w:w="4536"/>
+      </w:tblGrid>
+      <w:tr>
+        <w:trPr>
+          <w:cantSplit/>
+          <w:tblHeader/>
+        </w:trPr>
+        <w:tc>
+          <w:tcPr>
+            <w:tcW w:w="4535" w:type="dxa"/>
+            <w:shd w:val="clear" w:color="auto" w:fill="E8EEF4"/>
+          </w:tcPr>
+          <w:p>
+            <w:pPr>
+              <w:pStyle w:val="CoverTable"/>
+            </w:pPr>
+            <w:r>
+              <w:rPr>
+                <w:b/>
+              </w:rPr>
+              <w:t>Họ và tên</w:t>
+            </w:r>
+          </w:p>
+        </w:tc>
+        <w:tc>
+          <w:tcPr>
+            <w:tcW w:w="4535" w:type="dxa"/>
+            <w:shd w:val="clear" w:color="auto" w:fill="E8EEF4"/>
+          </w:tcPr>
+          <w:p>
+            <w:pPr>
+              <w:pStyle w:val="CoverTable"/>
+            </w:pPr>
+            <w:r>
+              <w:rPr>
+                <w:b/>
+              </w:rPr>
+              <w:t>MSSV</w:t>
+            </w:r>
+          </w:p>
+        </w:tc>
+      </w:tr>
+      <w:tr>
+        <w:trPr>
+          <w:cantSplit/>
+        </w:trPr>
+        <w:tc>
+          <w:tcPr>
+            <w:tcW w:w="4535" w:type="dxa"/>
+          </w:tcPr>
+          <w:p>
+            <w:pPr>
+              <w:pStyle w:val="CoverTable"/>
+            </w:pPr>
+            <w:r>
+              <w:t>Nguyễn Quốc Khánh (nhóm trưởng)</w:t>
+            </w:r>
+          </w:p>
+        </w:tc>
+        <w:tc>
+          <w:tcPr>
+            <w:tcW w:w="4535" w:type="dxa"/>
+          </w:tcPr>
+          <w:p>
+            <w:pPr>
+              <w:pStyle w:val="CoverTable"/>
+            </w:pPr>
+            <w:r>
+              <w:t>20233464</w:t>
+            </w:r>
+          </w:p>
+        </w:tc>
+      </w:tr>
+      <w:tr>
+        <w:trPr>
+          <w:cantSplit/>
+        </w:trPr>
+        <w:tc>
+          <w:tcPr>
+            <w:tcW w:w="4535" w:type="dxa"/>
+          </w:tcPr>
+          <w:p>
+            <w:pPr>
+              <w:pStyle w:val="CoverTable"/>
+            </w:pPr>
+            <w:r>
+              <w:t>Nguyễn Trung Hiếu</w:t>
+            </w:r>
+          </w:p>
+        </w:tc>
+        <w:tc>
+          <w:tcPr>
+            <w:tcW w:w="4535" w:type="dxa"/>
+          </w:tcPr>
+          <w:p>
+            <w:pPr>
+              <w:pStyle w:val="CoverTable"/>
+            </w:pPr>
+            <w:r>
+              <w:t>20233398</w:t>
+            </w:r>
+          </w:p>
+        </w:tc>
+      </w:tr>
+      <w:tr>
+        <w:trPr>
+          <w:cantSplit/>
+        </w:trPr>
+        <w:tc>
+          <w:tcPr>
+            <w:tcW w:w="4535" w:type="dxa"/>
+          </w:tcPr>
+          <w:p>
+            <w:pPr>
+              <w:pStyle w:val="CoverTable"/>
+            </w:pPr>
+            <w:r>
+              <w:t>Nguyễn Quang Vinh</w:t>
+            </w:r>
+          </w:p>
+        </w:tc>
+        <w:tc>
+          <w:tcPr>
+            <w:tcW w:w="4535" w:type="dxa"/>
+          </w:tcPr>
+          <w:p>
+            <w:pPr>
+              <w:pStyle w:val="CoverTable"/>
+            </w:pPr>
+            <w:r>
+              <w:t>20233718</w:t>
+            </w:r>
+          </w:p>
+        </w:tc>
+      </w:tr>
+    </w:tbl>
     <w:p>
       <w:pPr>
         <w:pStyle w:val="Cover"/>
       </w:pPr>
       <w:r>
-        <w:t>Nguyễn Quốc Khánh – 20233464 (Nhóm trưởng)</w:t>
+        <w:t>Giảng viên hướng dẫn: TS. Nguyễn Quang Minh</w:t>
       </w:r>
     </w:p>
     <w:p>
@@ -45,39 +237,15 @@
         <w:pStyle w:val="Cover"/>
       </w:pPr>
       <w:r>
-        <w:t>Nguyễn Trung Hiếu – 20233398</w:t>
-      </w:r>
-    </w:p>
-    <w:p>
-      <w:pPr>
-        <w:pStyle w:val="Cover"/>
-      </w:pPr>
-      <w:r>
-        <w:t>Nguyễn Quang Vinh – 20233718</w:t>
-      </w:r>
-    </w:p>
-    <w:p>
-      <w:pPr>
-        <w:pStyle w:val="Cover"/>
-      </w:pPr>
-      <w:r>
-        <w:t>Giảng viên hướng dẫn: TS. Nguyễn Quang Minh</w:t>
-      </w:r>
-    </w:p>
-    <w:p>
-      <w:pPr>
-        <w:pStyle w:val="Cover"/>
-      </w:pPr>
-      <w:r>
         <w:t>Mã lớp bài tập: 173876</w:t>
       </w:r>
     </w:p>
     <w:p>
       <w:pPr>
-        <w:pStyle w:val="Cover"/>
-      </w:pPr>
-      <w:r>
-        <w:t>Hà Nội, tháng 10/​2026</w:t>
+        <w:pStyle w:val="CoverDate"/>
+      </w:pPr>
+      <w:r>
+        <w:t>Hà Nội, 10/2026</w:t>
       </w:r>
     </w:p>
     <w:p>
@@ -95,18 +263,15 @@
       </w:pPr>
       <w:r>
         <w:lastRenderedPageBreak/>
-        <w:t>Tóm tắt</w:t>
-      </w:r>
-    </w:p>
-    <w:p>
-      <w:r>
-        <w:t>Báo cáo trình bày nền tảng thực thi Edge-AI không đồng nhất đang trong quá trình triển khai cho học phần Hệ điều hành. Raspberry Pi chạy Ubuntu xử lý suy luận; STM32 chạy FreeRTOS giám sát độc lập qua UART. Nghiên cứu tập trung vào lập lịch, tranh chấp tài nguyên, truyền thông và độ tươi dữ liệu. Bốn câu hỏi nghiên cứu xem xét ảnh hưởng của tải, cấu hình thực thi, thay thế dữ liệu chờ và phản ứng khi Linux gặp lỗi. Kết quả sơ bộ cho thấy ưu tiên thời gian thực cải thiện đuôi trễ đánh thức nhưng không loại b</w:t>
-      </w:r>
-      <w:r>
-        <w:t>ỏ tranh chấp bộ nhớ. Thay thế kết quả tại bridge không xử lý được tồn đọng trước suy luận. Quan sát phần cứng hỗ trợ phân biệt mất heartbeat với kết quả cũ dù heartbeat còn hoạt động. Tuy nhiên, nhiều lượt đo bị gắn cờ do điện áp thấp; bằng chứng phần mềm và phần cứng có phạm vi khác nhau. Báo cáo giữ nguyên các loại trừ, phân biệt số đã đo với số đã tính và cấu hình dự kiến. Các quan sát chưa chứng minh giới hạn thời gian xấu nhất hoặc an toàn cơ cấu chấp hành. Lộ trình tiếp theo ưu tiên nguồn điện, phép đ</w:t>
-      </w:r>
-      <w:r>
-        <w:t>o lặp và đối chiếu thời gian độc lập.</w:t>
+        <w:t>TÓM TẮT</w:t>
+      </w:r>
+    </w:p>
+    <w:p>
+      <w:r>
+        <w:t>Báo cáo trình bày nền tảng thực thi Edge-AI không đồng nhất đang trong quá trình triển khai cho học phần Hệ điều hành. Nhóm dùng Raspberry Pi chạy Ubuntu để xử lý suy luận, trong khi STM32 chạy FreeRTOS giám sát độc lập qua UART. Nhóm khảo sát ảnh hưởng của lập lịch, tranh chấp tài nguyên và hàng đợi tới độ tươi. Các câu hỏi xoay quanh tải, cấu hình, hàng đợi và phản ứng khi Linux lỗi. Kết quả sơ bộ ghi nhận ưu tiên thời gian thực cải thiện đuôi trễ đánh thức, nhưng tranh chấp bộ nhớ vẫn còn và thay kết quả</w:t>
+      </w:r>
+      <w:r>
+        <w:t xml:space="preserve"> tại bridge chưa giải quyết được tồn đọng trước suy luận. UART và GPIO giúp đối chiếu log, phân biệt mất heartbeat với kết quả cũ dù heartbeat vẫn đến. Công việc tiếp theo tập trung vào nguồn điện, phép đo lặp và đối chiếu thời gian độc lập.</w:t>
       </w:r>
     </w:p>
     <w:p>
@@ -122,26 +287,6 @@
     </w:p>
     <w:p>
       <w:r>
-        <w:rPr>
-          <w:b/>
-        </w:rPr>
-        <w:t>Quy ước bằng chứng.</w:t>
-      </w:r>
-      <w:r>
-        <w:t xml:space="preserve"> “Đã đo” là quan sát được lưu trong dữ liệu; “đã tính” là phép tính từ cấu hình hoặc dữ liệu đã đo; “dự kiến” là thiết kế, giả thuyết hay tham số chưa hiệu chuẩn; “chưa biết” là thiếu bằng chứng. FLAGGED là có cờ cần giải thích; INVALID là lượt đo bị loại trong phạm vi đánh giá tương ứng. Mọi kết quả thực nghiệm trong báo cáo đều là </w:t>
-      </w:r>
-      <w:r>
-        <w:rPr>
-          <w:b/>
-        </w:rPr>
-        <w:t>kết quả sơ bộ</w:t>
-      </w:r>
-      <w:r>
-        <w:t>, kể cả khi được chấp nhận theo quy tắc tại thời điểm thu thập.</w:t>
-      </w:r>
-    </w:p>
-    <w:p>
-      <w:r>
         <w:br w:type="page"/>
       </w:r>
     </w:p>
@@ -151,7 +296,7 @@
       </w:pPr>
       <w:r>
         <w:lastRenderedPageBreak/>
-        <w:t>Mục lục</w:t>
+        <w:t>MỤC LỤC</w:t>
       </w:r>
     </w:p>
     <w:p>
@@ -161,7 +306,13 @@
           <w:tab w:val="right" w:leader="dot" w:pos="9061"/>
         </w:tabs>
         <w:rPr>
+          <w:rFonts w:asciiTheme="minorHAnsi" w:eastAsiaTheme="minorEastAsia" w:hAnsiTheme="minorHAnsi" w:cstheme="minorBidi"/>
           <w:noProof/>
+          <w:kern w:val="2"/>
+          <w:sz w:val="24"/>
+          <w:szCs w:val="24"/>
+          <w:lang w:val="en-VN"/>
+          <w14:ligatures w14:val="standardContextual"/>
         </w:rPr>
       </w:pPr>
       <w:r>
@@ -173,13 +324,13 @@
       <w:r>
         <w:fldChar w:fldCharType="separate"/>
       </w:r>
-      <w:hyperlink w:anchor="_Toc243148432" w:history="1">
+      <w:hyperlink w:anchor="_Toc243150038" w:history="1">
         <w:r>
           <w:rPr>
             <w:rStyle w:val="Hyperlink"/>
             <w:noProof/>
           </w:rPr>
-          <w:t>1 Giới thiệu</w:t>
+          <w:t>CHƯƠNG 1. GIỚI THIỆU</w:t>
         </w:r>
         <w:r>
           <w:rPr>
@@ -200,7 +351,7 @@
             <w:noProof/>
             <w:webHidden/>
           </w:rPr>
-          <w:instrText xml:space="preserve"> PAGEREF _Toc243148432 \h </w:instrText>
+          <w:instrText xml:space="preserve"> PAGEREF _Toc243150038 \h </w:instrText>
         </w:r>
         <w:r>
           <w:rPr>
@@ -238,10 +389,16 @@
           <w:tab w:val="right" w:leader="dot" w:pos="9061"/>
         </w:tabs>
         <w:rPr>
+          <w:rFonts w:asciiTheme="minorHAnsi" w:eastAsiaTheme="minorEastAsia" w:hAnsiTheme="minorHAnsi" w:cstheme="minorBidi"/>
           <w:noProof/>
+          <w:kern w:val="2"/>
+          <w:sz w:val="24"/>
+          <w:szCs w:val="24"/>
+          <w:lang w:val="en-VN"/>
+          <w14:ligatures w14:val="standardContextual"/>
         </w:rPr>
       </w:pPr>
-      <w:hyperlink w:anchor="_Toc243148433" w:history="1">
+      <w:hyperlink w:anchor="_Toc243150039" w:history="1">
         <w:r>
           <w:rPr>
             <w:rStyle w:val="Hyperlink"/>
@@ -268,7 +425,7 @@
             <w:noProof/>
             <w:webHidden/>
           </w:rPr>
-          <w:instrText xml:space="preserve"> PAGEREF _Toc243148433 \h </w:instrText>
+          <w:instrText xml:space="preserve"> PAGEREF _Toc243150039 \h </w:instrText>
         </w:r>
         <w:r>
           <w:rPr>
@@ -306,10 +463,16 @@
           <w:tab w:val="right" w:leader="dot" w:pos="9061"/>
         </w:tabs>
         <w:rPr>
+          <w:rFonts w:asciiTheme="minorHAnsi" w:eastAsiaTheme="minorEastAsia" w:hAnsiTheme="minorHAnsi" w:cstheme="minorBidi"/>
           <w:noProof/>
+          <w:kern w:val="2"/>
+          <w:sz w:val="24"/>
+          <w:szCs w:val="24"/>
+          <w:lang w:val="en-VN"/>
+          <w14:ligatures w14:val="standardContextual"/>
         </w:rPr>
       </w:pPr>
-      <w:hyperlink w:anchor="_Toc243148434" w:history="1">
+      <w:hyperlink w:anchor="_Toc243150040" w:history="1">
         <w:r>
           <w:rPr>
             <w:rStyle w:val="Hyperlink"/>
@@ -336,7 +499,7 @@
             <w:noProof/>
             <w:webHidden/>
           </w:rPr>
-          <w:instrText xml:space="preserve"> PAGEREF _Toc243148434 \h </w:instrText>
+          <w:instrText xml:space="preserve"> PAGEREF _Toc243150040 \h </w:instrText>
         </w:r>
         <w:r>
           <w:rPr>
@@ -374,16 +537,22 @@
           <w:tab w:val="right" w:leader="dot" w:pos="9061"/>
         </w:tabs>
         <w:rPr>
+          <w:rFonts w:asciiTheme="minorHAnsi" w:eastAsiaTheme="minorEastAsia" w:hAnsiTheme="minorHAnsi" w:cstheme="minorBidi"/>
           <w:noProof/>
+          <w:kern w:val="2"/>
+          <w:sz w:val="24"/>
+          <w:szCs w:val="24"/>
+          <w:lang w:val="en-VN"/>
+          <w14:ligatures w14:val="standardContextual"/>
         </w:rPr>
       </w:pPr>
-      <w:hyperlink w:anchor="_Toc243148435" w:history="1">
+      <w:hyperlink w:anchor="_Toc243150041" w:history="1">
         <w:r>
           <w:rPr>
             <w:rStyle w:val="Hyperlink"/>
             <w:noProof/>
           </w:rPr>
-          <w:t>2 Cơ sở lý thuyết và các công trình liên quan</w:t>
+          <w:t>CHƯƠNG 2. CƠ SỞ LÝ THUYẾT VÀ CÁC CÔNG TRÌNH LIÊN QUAN</w:t>
         </w:r>
         <w:r>
           <w:rPr>
@@ -404,7 +573,7 @@
             <w:noProof/>
             <w:webHidden/>
           </w:rPr>
-          <w:instrText xml:space="preserve"> PAGEREF _Toc243148435 \h </w:instrText>
+          <w:instrText xml:space="preserve"> PAGEREF _Toc243150041 \h </w:instrText>
         </w:r>
         <w:r>
           <w:rPr>
@@ -442,10 +611,16 @@
           <w:tab w:val="right" w:leader="dot" w:pos="9061"/>
         </w:tabs>
         <w:rPr>
+          <w:rFonts w:asciiTheme="minorHAnsi" w:eastAsiaTheme="minorEastAsia" w:hAnsiTheme="minorHAnsi" w:cstheme="minorBidi"/>
           <w:noProof/>
+          <w:kern w:val="2"/>
+          <w:sz w:val="24"/>
+          <w:szCs w:val="24"/>
+          <w:lang w:val="en-VN"/>
+          <w14:ligatures w14:val="standardContextual"/>
         </w:rPr>
       </w:pPr>
-      <w:hyperlink w:anchor="_Toc243148436" w:history="1">
+      <w:hyperlink w:anchor="_Toc243150042" w:history="1">
         <w:r>
           <w:rPr>
             <w:rStyle w:val="Hyperlink"/>
@@ -472,7 +647,7 @@
             <w:noProof/>
             <w:webHidden/>
           </w:rPr>
-          <w:instrText xml:space="preserve"> PAGEREF _Toc243148436 \h </w:instrText>
+          <w:instrText xml:space="preserve"> PAGEREF _Toc243150042 \h </w:instrText>
         </w:r>
         <w:r>
           <w:rPr>
@@ -510,10 +685,16 @@
           <w:tab w:val="right" w:leader="dot" w:pos="9061"/>
         </w:tabs>
         <w:rPr>
+          <w:rFonts w:asciiTheme="minorHAnsi" w:eastAsiaTheme="minorEastAsia" w:hAnsiTheme="minorHAnsi" w:cstheme="minorBidi"/>
           <w:noProof/>
+          <w:kern w:val="2"/>
+          <w:sz w:val="24"/>
+          <w:szCs w:val="24"/>
+          <w:lang w:val="en-VN"/>
+          <w14:ligatures w14:val="standardContextual"/>
         </w:rPr>
       </w:pPr>
-      <w:hyperlink w:anchor="_Toc243148437" w:history="1">
+      <w:hyperlink w:anchor="_Toc243150043" w:history="1">
         <w:r>
           <w:rPr>
             <w:rStyle w:val="Hyperlink"/>
@@ -540,7 +721,7 @@
             <w:noProof/>
             <w:webHidden/>
           </w:rPr>
-          <w:instrText xml:space="preserve"> PAGEREF _Toc243148437 \h </w:instrText>
+          <w:instrText xml:space="preserve"> PAGEREF _Toc243150043 \h </w:instrText>
         </w:r>
         <w:r>
           <w:rPr>
@@ -578,16 +759,22 @@
           <w:tab w:val="right" w:leader="dot" w:pos="9061"/>
         </w:tabs>
         <w:rPr>
+          <w:rFonts w:asciiTheme="minorHAnsi" w:eastAsiaTheme="minorEastAsia" w:hAnsiTheme="minorHAnsi" w:cstheme="minorBidi"/>
           <w:noProof/>
+          <w:kern w:val="2"/>
+          <w:sz w:val="24"/>
+          <w:szCs w:val="24"/>
+          <w:lang w:val="en-VN"/>
+          <w14:ligatures w14:val="standardContextual"/>
         </w:rPr>
       </w:pPr>
-      <w:hyperlink w:anchor="_Toc243148438" w:history="1">
+      <w:hyperlink w:anchor="_Toc243150044" w:history="1">
         <w:r>
           <w:rPr>
             <w:rStyle w:val="Hyperlink"/>
             <w:noProof/>
           </w:rPr>
-          <w:t>2.3 Age of Information và dữ liệu còn giá trị</w:t>
+          <w:t>2.3 Độ tươi dữ liệu và giá trị của kết quả</w:t>
         </w:r>
         <w:r>
           <w:rPr>
@@ -608,7 +795,7 @@
             <w:noProof/>
             <w:webHidden/>
           </w:rPr>
-          <w:instrText xml:space="preserve"> PAGEREF _Toc243148438 \h </w:instrText>
+          <w:instrText xml:space="preserve"> PAGEREF _Toc243150044 \h </w:instrText>
         </w:r>
         <w:r>
           <w:rPr>
@@ -646,10 +833,16 @@
           <w:tab w:val="right" w:leader="dot" w:pos="9061"/>
         </w:tabs>
         <w:rPr>
+          <w:rFonts w:asciiTheme="minorHAnsi" w:eastAsiaTheme="minorEastAsia" w:hAnsiTheme="minorHAnsi" w:cstheme="minorBidi"/>
           <w:noProof/>
+          <w:kern w:val="2"/>
+          <w:sz w:val="24"/>
+          <w:szCs w:val="24"/>
+          <w:lang w:val="en-VN"/>
+          <w14:ligatures w14:val="standardContextual"/>
         </w:rPr>
       </w:pPr>
-      <w:hyperlink w:anchor="_Toc243148439" w:history="1">
+      <w:hyperlink w:anchor="_Toc243150045" w:history="1">
         <w:r>
           <w:rPr>
             <w:rStyle w:val="Hyperlink"/>
@@ -676,7 +869,7 @@
             <w:noProof/>
             <w:webHidden/>
           </w:rPr>
-          <w:instrText xml:space="preserve"> PAGEREF _Toc243148439 \h </w:instrText>
+          <w:instrText xml:space="preserve"> PAGEREF _Toc243150045 \h </w:instrText>
         </w:r>
         <w:r>
           <w:rPr>
@@ -714,16 +907,22 @@
           <w:tab w:val="right" w:leader="dot" w:pos="9061"/>
         </w:tabs>
         <w:rPr>
+          <w:rFonts w:asciiTheme="minorHAnsi" w:eastAsiaTheme="minorEastAsia" w:hAnsiTheme="minorHAnsi" w:cstheme="minorBidi"/>
           <w:noProof/>
+          <w:kern w:val="2"/>
+          <w:sz w:val="24"/>
+          <w:szCs w:val="24"/>
+          <w:lang w:val="en-VN"/>
+          <w14:ligatures w14:val="standardContextual"/>
         </w:rPr>
       </w:pPr>
-      <w:hyperlink w:anchor="_Toc243148440" w:history="1">
+      <w:hyperlink w:anchor="_Toc243150046" w:history="1">
         <w:r>
           <w:rPr>
             <w:rStyle w:val="Hyperlink"/>
             <w:noProof/>
           </w:rPr>
-          <w:t>3 Thiết kế hệ thống</w:t>
+          <w:t>CHƯƠNG 3. THIẾT KẾ HỆ THỐNG</w:t>
         </w:r>
         <w:r>
           <w:rPr>
@@ -744,7 +943,7 @@
             <w:noProof/>
             <w:webHidden/>
           </w:rPr>
-          <w:instrText xml:space="preserve"> PAGEREF _Toc243148440 \h </w:instrText>
+          <w:instrText xml:space="preserve"> PAGEREF _Toc243150046 \h </w:instrText>
         </w:r>
         <w:r>
           <w:rPr>
@@ -782,10 +981,16 @@
           <w:tab w:val="right" w:leader="dot" w:pos="9061"/>
         </w:tabs>
         <w:rPr>
+          <w:rFonts w:asciiTheme="minorHAnsi" w:eastAsiaTheme="minorEastAsia" w:hAnsiTheme="minorHAnsi" w:cstheme="minorBidi"/>
           <w:noProof/>
+          <w:kern w:val="2"/>
+          <w:sz w:val="24"/>
+          <w:szCs w:val="24"/>
+          <w:lang w:val="en-VN"/>
+          <w14:ligatures w14:val="standardContextual"/>
         </w:rPr>
       </w:pPr>
-      <w:hyperlink w:anchor="_Toc243148441" w:history="1">
+      <w:hyperlink w:anchor="_Toc243150047" w:history="1">
         <w:r>
           <w:rPr>
             <w:rStyle w:val="Hyperlink"/>
@@ -812,7 +1017,7 @@
             <w:noProof/>
             <w:webHidden/>
           </w:rPr>
-          <w:instrText xml:space="preserve"> PAGEREF _Toc243148441 \h </w:instrText>
+          <w:instrText xml:space="preserve"> PAGEREF _Toc243150047 \h </w:instrText>
         </w:r>
         <w:r>
           <w:rPr>
@@ -850,10 +1055,16 @@
           <w:tab w:val="right" w:leader="dot" w:pos="9061"/>
         </w:tabs>
         <w:rPr>
+          <w:rFonts w:asciiTheme="minorHAnsi" w:eastAsiaTheme="minorEastAsia" w:hAnsiTheme="minorHAnsi" w:cstheme="minorBidi"/>
           <w:noProof/>
+          <w:kern w:val="2"/>
+          <w:sz w:val="24"/>
+          <w:szCs w:val="24"/>
+          <w:lang w:val="en-VN"/>
+          <w14:ligatures w14:val="standardContextual"/>
         </w:rPr>
       </w:pPr>
-      <w:hyperlink w:anchor="_Toc243148442" w:history="1">
+      <w:hyperlink w:anchor="_Toc243150048" w:history="1">
         <w:r>
           <w:rPr>
             <w:rStyle w:val="Hyperlink"/>
@@ -880,7 +1091,7 @@
             <w:noProof/>
             <w:webHidden/>
           </w:rPr>
-          <w:instrText xml:space="preserve"> PAGEREF _Toc243148442 \h </w:instrText>
+          <w:instrText xml:space="preserve"> PAGEREF _Toc243150048 \h </w:instrText>
         </w:r>
         <w:r>
           <w:rPr>
@@ -918,10 +1129,16 @@
           <w:tab w:val="right" w:leader="dot" w:pos="9061"/>
         </w:tabs>
         <w:rPr>
+          <w:rFonts w:asciiTheme="minorHAnsi" w:eastAsiaTheme="minorEastAsia" w:hAnsiTheme="minorHAnsi" w:cstheme="minorBidi"/>
           <w:noProof/>
+          <w:kern w:val="2"/>
+          <w:sz w:val="24"/>
+          <w:szCs w:val="24"/>
+          <w:lang w:val="en-VN"/>
+          <w14:ligatures w14:val="standardContextual"/>
         </w:rPr>
       </w:pPr>
-      <w:hyperlink w:anchor="_Toc243148443" w:history="1">
+      <w:hyperlink w:anchor="_Toc243150049" w:history="1">
         <w:r>
           <w:rPr>
             <w:rStyle w:val="Hyperlink"/>
@@ -948,7 +1165,7 @@
             <w:noProof/>
             <w:webHidden/>
           </w:rPr>
-          <w:instrText xml:space="preserve"> PAGEREF _Toc243148443 \h </w:instrText>
+          <w:instrText xml:space="preserve"> PAGEREF _Toc243150049 \h </w:instrText>
         </w:r>
         <w:r>
           <w:rPr>
@@ -986,10 +1203,16 @@
           <w:tab w:val="right" w:leader="dot" w:pos="9061"/>
         </w:tabs>
         <w:rPr>
+          <w:rFonts w:asciiTheme="minorHAnsi" w:eastAsiaTheme="minorEastAsia" w:hAnsiTheme="minorHAnsi" w:cstheme="minorBidi"/>
           <w:noProof/>
+          <w:kern w:val="2"/>
+          <w:sz w:val="24"/>
+          <w:szCs w:val="24"/>
+          <w:lang w:val="en-VN"/>
+          <w14:ligatures w14:val="standardContextual"/>
         </w:rPr>
       </w:pPr>
-      <w:hyperlink w:anchor="_Toc243148444" w:history="1">
+      <w:hyperlink w:anchor="_Toc243150050" w:history="1">
         <w:r>
           <w:rPr>
             <w:rStyle w:val="Hyperlink"/>
@@ -1016,7 +1239,7 @@
             <w:noProof/>
             <w:webHidden/>
           </w:rPr>
-          <w:instrText xml:space="preserve"> PAGEREF _Toc243148444 \h </w:instrText>
+          <w:instrText xml:space="preserve"> PAGEREF _Toc243150050 \h </w:instrText>
         </w:r>
         <w:r>
           <w:rPr>
@@ -1054,16 +1277,22 @@
           <w:tab w:val="right" w:leader="dot" w:pos="9061"/>
         </w:tabs>
         <w:rPr>
+          <w:rFonts w:asciiTheme="minorHAnsi" w:eastAsiaTheme="minorEastAsia" w:hAnsiTheme="minorHAnsi" w:cstheme="minorBidi"/>
           <w:noProof/>
+          <w:kern w:val="2"/>
+          <w:sz w:val="24"/>
+          <w:szCs w:val="24"/>
+          <w:lang w:val="en-VN"/>
+          <w14:ligatures w14:val="standardContextual"/>
         </w:rPr>
       </w:pPr>
-      <w:hyperlink w:anchor="_Toc243148445" w:history="1">
+      <w:hyperlink w:anchor="_Toc243150051" w:history="1">
         <w:r>
           <w:rPr>
             <w:rStyle w:val="Hyperlink"/>
             <w:noProof/>
           </w:rPr>
-          <w:t>4 Hiện thực</w:t>
+          <w:t>CHƯƠNG 4. HIỆN THỰC</w:t>
         </w:r>
         <w:r>
           <w:rPr>
@@ -1084,7 +1313,7 @@
             <w:noProof/>
             <w:webHidden/>
           </w:rPr>
-          <w:instrText xml:space="preserve"> PAGEREF _Toc243148445 \h </w:instrText>
+          <w:instrText xml:space="preserve"> PAGEREF _Toc243150051 \h </w:instrText>
         </w:r>
         <w:r>
           <w:rPr>
@@ -1122,10 +1351,16 @@
           <w:tab w:val="right" w:leader="dot" w:pos="9061"/>
         </w:tabs>
         <w:rPr>
+          <w:rFonts w:asciiTheme="minorHAnsi" w:eastAsiaTheme="minorEastAsia" w:hAnsiTheme="minorHAnsi" w:cstheme="minorBidi"/>
           <w:noProof/>
+          <w:kern w:val="2"/>
+          <w:sz w:val="24"/>
+          <w:szCs w:val="24"/>
+          <w:lang w:val="en-VN"/>
+          <w14:ligatures w14:val="standardContextual"/>
         </w:rPr>
       </w:pPr>
-      <w:hyperlink w:anchor="_Toc243148446" w:history="1">
+      <w:hyperlink w:anchor="_Toc243150052" w:history="1">
         <w:r>
           <w:rPr>
             <w:rStyle w:val="Hyperlink"/>
@@ -1152,7 +1387,7 @@
             <w:noProof/>
             <w:webHidden/>
           </w:rPr>
-          <w:instrText xml:space="preserve"> PAGEREF _Toc243148446 \h </w:instrText>
+          <w:instrText xml:space="preserve"> PAGEREF _Toc243150052 \h </w:instrText>
         </w:r>
         <w:r>
           <w:rPr>
@@ -1190,16 +1425,22 @@
           <w:tab w:val="right" w:leader="dot" w:pos="9061"/>
         </w:tabs>
         <w:rPr>
+          <w:rFonts w:asciiTheme="minorHAnsi" w:eastAsiaTheme="minorEastAsia" w:hAnsiTheme="minorHAnsi" w:cstheme="minorBidi"/>
           <w:noProof/>
+          <w:kern w:val="2"/>
+          <w:sz w:val="24"/>
+          <w:szCs w:val="24"/>
+          <w:lang w:val="en-VN"/>
+          <w14:ligatures w14:val="standardContextual"/>
         </w:rPr>
       </w:pPr>
-      <w:hyperlink w:anchor="_Toc243148447" w:history="1">
+      <w:hyperlink w:anchor="_Toc243150053" w:history="1">
         <w:r>
           <w:rPr>
             <w:rStyle w:val="Hyperlink"/>
             <w:noProof/>
           </w:rPr>
-          <w:t>4.2 Hồ sơ và môi trường thực thi</w:t>
+          <w:t>4.2 Cấu hình và môi trường thực thi</w:t>
         </w:r>
         <w:r>
           <w:rPr>
@@ -1220,7 +1461,7 @@
             <w:noProof/>
             <w:webHidden/>
           </w:rPr>
-          <w:instrText xml:space="preserve"> PAGEREF _Toc243148447 \h </w:instrText>
+          <w:instrText xml:space="preserve"> PAGEREF _Toc243150053 \h </w:instrText>
         </w:r>
         <w:r>
           <w:rPr>
@@ -1240,7 +1481,7 @@
             <w:noProof/>
             <w:webHidden/>
           </w:rPr>
-          <w:t>9</w:t>
+          <w:t>10</w:t>
         </w:r>
         <w:r>
           <w:rPr>
@@ -1258,10 +1499,16 @@
           <w:tab w:val="right" w:leader="dot" w:pos="9061"/>
         </w:tabs>
         <w:rPr>
+          <w:rFonts w:asciiTheme="minorHAnsi" w:eastAsiaTheme="minorEastAsia" w:hAnsiTheme="minorHAnsi" w:cstheme="minorBidi"/>
           <w:noProof/>
+          <w:kern w:val="2"/>
+          <w:sz w:val="24"/>
+          <w:szCs w:val="24"/>
+          <w:lang w:val="en-VN"/>
+          <w14:ligatures w14:val="standardContextual"/>
         </w:rPr>
       </w:pPr>
-      <w:hyperlink w:anchor="_Toc243148448" w:history="1">
+      <w:hyperlink w:anchor="_Toc243150054" w:history="1">
         <w:r>
           <w:rPr>
             <w:rStyle w:val="Hyperlink"/>
@@ -1288,7 +1535,7 @@
             <w:noProof/>
             <w:webHidden/>
           </w:rPr>
-          <w:instrText xml:space="preserve"> PAGEREF _Toc243148448 \h </w:instrText>
+          <w:instrText xml:space="preserve"> PAGEREF _Toc243150054 \h </w:instrText>
         </w:r>
         <w:r>
           <w:rPr>
@@ -1308,7 +1555,7 @@
             <w:noProof/>
             <w:webHidden/>
           </w:rPr>
-          <w:t>9</w:t>
+          <w:t>10</w:t>
         </w:r>
         <w:r>
           <w:rPr>
@@ -1326,10 +1573,16 @@
           <w:tab w:val="right" w:leader="dot" w:pos="9061"/>
         </w:tabs>
         <w:rPr>
+          <w:rFonts w:asciiTheme="minorHAnsi" w:eastAsiaTheme="minorEastAsia" w:hAnsiTheme="minorHAnsi" w:cstheme="minorBidi"/>
           <w:noProof/>
+          <w:kern w:val="2"/>
+          <w:sz w:val="24"/>
+          <w:szCs w:val="24"/>
+          <w:lang w:val="en-VN"/>
+          <w14:ligatures w14:val="standardContextual"/>
         </w:rPr>
       </w:pPr>
-      <w:hyperlink w:anchor="_Toc243148449" w:history="1">
+      <w:hyperlink w:anchor="_Toc243150055" w:history="1">
         <w:r>
           <w:rPr>
             <w:rStyle w:val="Hyperlink"/>
@@ -1356,7 +1609,7 @@
             <w:noProof/>
             <w:webHidden/>
           </w:rPr>
-          <w:instrText xml:space="preserve"> PAGEREF _Toc243148449 \h </w:instrText>
+          <w:instrText xml:space="preserve"> PAGEREF _Toc243150055 \h </w:instrText>
         </w:r>
         <w:r>
           <w:rPr>
@@ -1394,16 +1647,22 @@
           <w:tab w:val="right" w:leader="dot" w:pos="9061"/>
         </w:tabs>
         <w:rPr>
+          <w:rFonts w:asciiTheme="minorHAnsi" w:eastAsiaTheme="minorEastAsia" w:hAnsiTheme="minorHAnsi" w:cstheme="minorBidi"/>
           <w:noProof/>
+          <w:kern w:val="2"/>
+          <w:sz w:val="24"/>
+          <w:szCs w:val="24"/>
+          <w:lang w:val="en-VN"/>
+          <w14:ligatures w14:val="standardContextual"/>
         </w:rPr>
       </w:pPr>
-      <w:hyperlink w:anchor="_Toc243148450" w:history="1">
+      <w:hyperlink w:anchor="_Toc243150056" w:history="1">
         <w:r>
           <w:rPr>
             <w:rStyle w:val="Hyperlink"/>
             <w:noProof/>
           </w:rPr>
-          <w:t>5 Đánh giá sơ bộ</w:t>
+          <w:t>CHƯƠNG 5. ĐÁNH GIÁ SƠ BỘ</w:t>
         </w:r>
         <w:r>
           <w:rPr>
@@ -1424,7 +1683,7 @@
             <w:noProof/>
             <w:webHidden/>
           </w:rPr>
-          <w:instrText xml:space="preserve"> PAGEREF _Toc243148450 \h </w:instrText>
+          <w:instrText xml:space="preserve"> PAGEREF _Toc243150056 \h </w:instrText>
         </w:r>
         <w:r>
           <w:rPr>
@@ -1444,7 +1703,7 @@
             <w:noProof/>
             <w:webHidden/>
           </w:rPr>
-          <w:t>10</w:t>
+          <w:t>11</w:t>
         </w:r>
         <w:r>
           <w:rPr>
@@ -1462,16 +1721,22 @@
           <w:tab w:val="right" w:leader="dot" w:pos="9061"/>
         </w:tabs>
         <w:rPr>
+          <w:rFonts w:asciiTheme="minorHAnsi" w:eastAsiaTheme="minorEastAsia" w:hAnsiTheme="minorHAnsi" w:cstheme="minorBidi"/>
           <w:noProof/>
+          <w:kern w:val="2"/>
+          <w:sz w:val="24"/>
+          <w:szCs w:val="24"/>
+          <w:lang w:val="en-VN"/>
+          <w14:ligatures w14:val="standardContextual"/>
         </w:rPr>
       </w:pPr>
-      <w:hyperlink w:anchor="_Toc243148451" w:history="1">
+      <w:hyperlink w:anchor="_Toc243150057" w:history="1">
         <w:r>
           <w:rPr>
             <w:rStyle w:val="Hyperlink"/>
             <w:noProof/>
           </w:rPr>
-          <w:t>5.1 Phương pháp, môi trường và quy tắc hợp lệ</w:t>
+          <w:t>5.1 Phương pháp và môi trường đo</w:t>
         </w:r>
         <w:r>
           <w:rPr>
@@ -1492,7 +1757,7 @@
             <w:noProof/>
             <w:webHidden/>
           </w:rPr>
-          <w:instrText xml:space="preserve"> PAGEREF _Toc243148451 \h </w:instrText>
+          <w:instrText xml:space="preserve"> PAGEREF _Toc243150057 \h </w:instrText>
         </w:r>
         <w:r>
           <w:rPr>
@@ -1512,7 +1777,7 @@
             <w:noProof/>
             <w:webHidden/>
           </w:rPr>
-          <w:t>10</w:t>
+          <w:t>11</w:t>
         </w:r>
         <w:r>
           <w:rPr>
@@ -1530,10 +1795,16 @@
           <w:tab w:val="right" w:leader="dot" w:pos="9061"/>
         </w:tabs>
         <w:rPr>
+          <w:rFonts w:asciiTheme="minorHAnsi" w:eastAsiaTheme="minorEastAsia" w:hAnsiTheme="minorHAnsi" w:cstheme="minorBidi"/>
           <w:noProof/>
+          <w:kern w:val="2"/>
+          <w:sz w:val="24"/>
+          <w:szCs w:val="24"/>
+          <w:lang w:val="en-VN"/>
+          <w14:ligatures w14:val="standardContextual"/>
         </w:rPr>
       </w:pPr>
-      <w:hyperlink w:anchor="_Toc243148452" w:history="1">
+      <w:hyperlink w:anchor="_Toc243150058" w:history="1">
         <w:r>
           <w:rPr>
             <w:rStyle w:val="Hyperlink"/>
@@ -1560,7 +1831,7 @@
             <w:noProof/>
             <w:webHidden/>
           </w:rPr>
-          <w:instrText xml:space="preserve"> PAGEREF _Toc243148452 \h </w:instrText>
+          <w:instrText xml:space="preserve"> PAGEREF _Toc243150058 \h </w:instrText>
         </w:r>
         <w:r>
           <w:rPr>
@@ -1580,7 +1851,7 @@
             <w:noProof/>
             <w:webHidden/>
           </w:rPr>
-          <w:t>11</w:t>
+          <w:t>12</w:t>
         </w:r>
         <w:r>
           <w:rPr>
@@ -1598,10 +1869,16 @@
           <w:tab w:val="right" w:leader="dot" w:pos="9061"/>
         </w:tabs>
         <w:rPr>
+          <w:rFonts w:asciiTheme="minorHAnsi" w:eastAsiaTheme="minorEastAsia" w:hAnsiTheme="minorHAnsi" w:cstheme="minorBidi"/>
           <w:noProof/>
+          <w:kern w:val="2"/>
+          <w:sz w:val="24"/>
+          <w:szCs w:val="24"/>
+          <w:lang w:val="en-VN"/>
+          <w14:ligatures w14:val="standardContextual"/>
         </w:rPr>
       </w:pPr>
-      <w:hyperlink w:anchor="_Toc243148453" w:history="1">
+      <w:hyperlink w:anchor="_Toc243150059" w:history="1">
         <w:r>
           <w:rPr>
             <w:rStyle w:val="Hyperlink"/>
@@ -1628,7 +1905,7 @@
             <w:noProof/>
             <w:webHidden/>
           </w:rPr>
-          <w:instrText xml:space="preserve"> PAGEREF _Toc243148453 \h </w:instrText>
+          <w:instrText xml:space="preserve"> PAGEREF _Toc243150059 \h </w:instrText>
         </w:r>
         <w:r>
           <w:rPr>
@@ -1648,7 +1925,7 @@
             <w:noProof/>
             <w:webHidden/>
           </w:rPr>
-          <w:t>12</w:t>
+          <w:t>13</w:t>
         </w:r>
         <w:r>
           <w:rPr>
@@ -1666,10 +1943,16 @@
           <w:tab w:val="right" w:leader="dot" w:pos="9061"/>
         </w:tabs>
         <w:rPr>
+          <w:rFonts w:asciiTheme="minorHAnsi" w:eastAsiaTheme="minorEastAsia" w:hAnsiTheme="minorHAnsi" w:cstheme="minorBidi"/>
           <w:noProof/>
+          <w:kern w:val="2"/>
+          <w:sz w:val="24"/>
+          <w:szCs w:val="24"/>
+          <w:lang w:val="en-VN"/>
+          <w14:ligatures w14:val="standardContextual"/>
         </w:rPr>
       </w:pPr>
-      <w:hyperlink w:anchor="_Toc243148454" w:history="1">
+      <w:hyperlink w:anchor="_Toc243150060" w:history="1">
         <w:r>
           <w:rPr>
             <w:rStyle w:val="Hyperlink"/>
@@ -1696,7 +1979,7 @@
             <w:noProof/>
             <w:webHidden/>
           </w:rPr>
-          <w:instrText xml:space="preserve"> PAGEREF _Toc243148454 \h </w:instrText>
+          <w:instrText xml:space="preserve"> PAGEREF _Toc243150060 \h </w:instrText>
         </w:r>
         <w:r>
           <w:rPr>
@@ -1734,16 +2017,22 @@
           <w:tab w:val="right" w:leader="dot" w:pos="9061"/>
         </w:tabs>
         <w:rPr>
+          <w:rFonts w:asciiTheme="minorHAnsi" w:eastAsiaTheme="minorEastAsia" w:hAnsiTheme="minorHAnsi" w:cstheme="minorBidi"/>
           <w:noProof/>
+          <w:kern w:val="2"/>
+          <w:sz w:val="24"/>
+          <w:szCs w:val="24"/>
+          <w:lang w:val="en-VN"/>
+          <w14:ligatures w14:val="standardContextual"/>
         </w:rPr>
       </w:pPr>
-      <w:hyperlink w:anchor="_Toc243148455" w:history="1">
+      <w:hyperlink w:anchor="_Toc243150061" w:history="1">
         <w:r>
           <w:rPr>
             <w:rStyle w:val="Hyperlink"/>
             <w:noProof/>
           </w:rPr>
-          <w:t>6 Thảo luận và hạn chế</w:t>
+          <w:t>CHƯƠNG 6. THẢO LUẬN VÀ HẠN CHẾ</w:t>
         </w:r>
         <w:r>
           <w:rPr>
@@ -1764,7 +2053,7 @@
             <w:noProof/>
             <w:webHidden/>
           </w:rPr>
-          <w:instrText xml:space="preserve"> PAGEREF _Toc243148455 \h </w:instrText>
+          <w:instrText xml:space="preserve"> PAGEREF _Toc243150061 \h </w:instrText>
         </w:r>
         <w:r>
           <w:rPr>
@@ -1784,7 +2073,7 @@
             <w:noProof/>
             <w:webHidden/>
           </w:rPr>
-          <w:t>15</w:t>
+          <w:t>16</w:t>
         </w:r>
         <w:r>
           <w:rPr>
@@ -1802,10 +2091,16 @@
           <w:tab w:val="right" w:leader="dot" w:pos="9061"/>
         </w:tabs>
         <w:rPr>
+          <w:rFonts w:asciiTheme="minorHAnsi" w:eastAsiaTheme="minorEastAsia" w:hAnsiTheme="minorHAnsi" w:cstheme="minorBidi"/>
           <w:noProof/>
+          <w:kern w:val="2"/>
+          <w:sz w:val="24"/>
+          <w:szCs w:val="24"/>
+          <w:lang w:val="en-VN"/>
+          <w14:ligatures w14:val="standardContextual"/>
         </w:rPr>
       </w:pPr>
-      <w:hyperlink w:anchor="_Toc243148456" w:history="1">
+      <w:hyperlink w:anchor="_Toc243150062" w:history="1">
         <w:r>
           <w:rPr>
             <w:rStyle w:val="Hyperlink"/>
@@ -1832,7 +2127,7 @@
             <w:noProof/>
             <w:webHidden/>
           </w:rPr>
-          <w:instrText xml:space="preserve"> PAGEREF _Toc243148456 \h </w:instrText>
+          <w:instrText xml:space="preserve"> PAGEREF _Toc243150062 \h </w:instrText>
         </w:r>
         <w:r>
           <w:rPr>
@@ -1852,7 +2147,7 @@
             <w:noProof/>
             <w:webHidden/>
           </w:rPr>
-          <w:t>15</w:t>
+          <w:t>16</w:t>
         </w:r>
         <w:r>
           <w:rPr>
@@ -1870,10 +2165,16 @@
           <w:tab w:val="right" w:leader="dot" w:pos="9061"/>
         </w:tabs>
         <w:rPr>
+          <w:rFonts w:asciiTheme="minorHAnsi" w:eastAsiaTheme="minorEastAsia" w:hAnsiTheme="minorHAnsi" w:cstheme="minorBidi"/>
           <w:noProof/>
+          <w:kern w:val="2"/>
+          <w:sz w:val="24"/>
+          <w:szCs w:val="24"/>
+          <w:lang w:val="en-VN"/>
+          <w14:ligatures w14:val="standardContextual"/>
         </w:rPr>
       </w:pPr>
-      <w:hyperlink w:anchor="_Toc243148457" w:history="1">
+      <w:hyperlink w:anchor="_Toc243150063" w:history="1">
         <w:r>
           <w:rPr>
             <w:rStyle w:val="Hyperlink"/>
@@ -1900,7 +2201,7 @@
             <w:noProof/>
             <w:webHidden/>
           </w:rPr>
-          <w:instrText xml:space="preserve"> PAGEREF _Toc243148457 \h </w:instrText>
+          <w:instrText xml:space="preserve"> PAGEREF _Toc243150063 \h </w:instrText>
         </w:r>
         <w:r>
           <w:rPr>
@@ -1920,7 +2221,7 @@
             <w:noProof/>
             <w:webHidden/>
           </w:rPr>
-          <w:t>15</w:t>
+          <w:t>16</w:t>
         </w:r>
         <w:r>
           <w:rPr>
@@ -1938,16 +2239,22 @@
           <w:tab w:val="right" w:leader="dot" w:pos="9061"/>
         </w:tabs>
         <w:rPr>
+          <w:rFonts w:asciiTheme="minorHAnsi" w:eastAsiaTheme="minorEastAsia" w:hAnsiTheme="minorHAnsi" w:cstheme="minorBidi"/>
           <w:noProof/>
+          <w:kern w:val="2"/>
+          <w:sz w:val="24"/>
+          <w:szCs w:val="24"/>
+          <w:lang w:val="en-VN"/>
+          <w14:ligatures w14:val="standardContextual"/>
         </w:rPr>
       </w:pPr>
-      <w:hyperlink w:anchor="_Toc243148458" w:history="1">
+      <w:hyperlink w:anchor="_Toc243150064" w:history="1">
         <w:r>
           <w:rPr>
             <w:rStyle w:val="Hyperlink"/>
             <w:noProof/>
           </w:rPr>
-          <w:t>7 Hướng phát triển</w:t>
+          <w:t>CHƯƠNG 7. HƯỚNG PHÁT TRIỂN</w:t>
         </w:r>
         <w:r>
           <w:rPr>
@@ -1968,7 +2275,7 @@
             <w:noProof/>
             <w:webHidden/>
           </w:rPr>
-          <w:instrText xml:space="preserve"> PAGEREF _Toc243148458 \h </w:instrText>
+          <w:instrText xml:space="preserve"> PAGEREF _Toc243150064 \h </w:instrText>
         </w:r>
         <w:r>
           <w:rPr>
@@ -1988,7 +2295,7 @@
             <w:noProof/>
             <w:webHidden/>
           </w:rPr>
-          <w:t>16</w:t>
+          <w:t>17</w:t>
         </w:r>
         <w:r>
           <w:rPr>
@@ -2006,16 +2313,22 @@
           <w:tab w:val="right" w:leader="dot" w:pos="9061"/>
         </w:tabs>
         <w:rPr>
+          <w:rFonts w:asciiTheme="minorHAnsi" w:eastAsiaTheme="minorEastAsia" w:hAnsiTheme="minorHAnsi" w:cstheme="minorBidi"/>
           <w:noProof/>
+          <w:kern w:val="2"/>
+          <w:sz w:val="24"/>
+          <w:szCs w:val="24"/>
+          <w:lang w:val="en-VN"/>
+          <w14:ligatures w14:val="standardContextual"/>
         </w:rPr>
       </w:pPr>
-      <w:hyperlink w:anchor="_Toc243148459" w:history="1">
+      <w:hyperlink w:anchor="_Toc243150065" w:history="1">
         <w:r>
           <w:rPr>
             <w:rStyle w:val="Hyperlink"/>
             <w:noProof/>
           </w:rPr>
-          <w:t>7.1 Lộ trình A–F và cổng nghiệm thu</w:t>
+          <w:t>7.1 Lộ trình hoàn thiện hệ thống</w:t>
         </w:r>
         <w:r>
           <w:rPr>
@@ -2036,7 +2349,7 @@
             <w:noProof/>
             <w:webHidden/>
           </w:rPr>
-          <w:instrText xml:space="preserve"> PAGEREF _Toc243148459 \h </w:instrText>
+          <w:instrText xml:space="preserve"> PAGEREF _Toc243150065 \h </w:instrText>
         </w:r>
         <w:r>
           <w:rPr>
@@ -2056,7 +2369,7 @@
             <w:noProof/>
             <w:webHidden/>
           </w:rPr>
-          <w:t>16</w:t>
+          <w:t>17</w:t>
         </w:r>
         <w:r>
           <w:rPr>
@@ -2074,16 +2387,22 @@
           <w:tab w:val="right" w:leader="dot" w:pos="9061"/>
         </w:tabs>
         <w:rPr>
+          <w:rFonts w:asciiTheme="minorHAnsi" w:eastAsiaTheme="minorEastAsia" w:hAnsiTheme="minorHAnsi" w:cstheme="minorBidi"/>
           <w:noProof/>
+          <w:kern w:val="2"/>
+          <w:sz w:val="24"/>
+          <w:szCs w:val="24"/>
+          <w:lang w:val="en-VN"/>
+          <w14:ligatures w14:val="standardContextual"/>
         </w:rPr>
       </w:pPr>
-      <w:hyperlink w:anchor="_Toc243148460" w:history="1">
+      <w:hyperlink w:anchor="_Toc243150066" w:history="1">
         <w:r>
           <w:rPr>
             <w:rStyle w:val="Hyperlink"/>
             <w:noProof/>
           </w:rPr>
-          <w:t>8 Kết luận</w:t>
+          <w:t>CHƯƠNG 8. KẾT LUẬN</w:t>
         </w:r>
         <w:r>
           <w:rPr>
@@ -2104,7 +2423,7 @@
             <w:noProof/>
             <w:webHidden/>
           </w:rPr>
-          <w:instrText xml:space="preserve"> PAGEREF _Toc243148460 \h </w:instrText>
+          <w:instrText xml:space="preserve"> PAGEREF _Toc243150066 \h </w:instrText>
         </w:r>
         <w:r>
           <w:rPr>
@@ -2124,7 +2443,7 @@
             <w:noProof/>
             <w:webHidden/>
           </w:rPr>
-          <w:t>17</w:t>
+          <w:t>18</w:t>
         </w:r>
         <w:r>
           <w:rPr>
@@ -2142,16 +2461,22 @@
           <w:tab w:val="right" w:leader="dot" w:pos="9061"/>
         </w:tabs>
         <w:rPr>
+          <w:rFonts w:asciiTheme="minorHAnsi" w:eastAsiaTheme="minorEastAsia" w:hAnsiTheme="minorHAnsi" w:cstheme="minorBidi"/>
           <w:noProof/>
+          <w:kern w:val="2"/>
+          <w:sz w:val="24"/>
+          <w:szCs w:val="24"/>
+          <w:lang w:val="en-VN"/>
+          <w14:ligatures w14:val="standardContextual"/>
         </w:rPr>
       </w:pPr>
-      <w:hyperlink w:anchor="_Toc243148461" w:history="1">
+      <w:hyperlink w:anchor="_Toc243150067" w:history="1">
         <w:r>
           <w:rPr>
             <w:rStyle w:val="Hyperlink"/>
             <w:noProof/>
           </w:rPr>
-          <w:t>Tài liệu tham khảo</w:t>
+          <w:t>TÀI LIỆU THAM KHẢO</w:t>
         </w:r>
         <w:r>
           <w:rPr>
@@ -2172,7 +2497,7 @@
             <w:noProof/>
             <w:webHidden/>
           </w:rPr>
-          <w:instrText xml:space="preserve"> PAGEREF _Toc243148461 \h </w:instrText>
+          <w:instrText xml:space="preserve"> PAGEREF _Toc243150067 \h </w:instrText>
         </w:r>
         <w:r>
           <w:rPr>
@@ -2192,7 +2517,7 @@
             <w:noProof/>
             <w:webHidden/>
           </w:rPr>
-          <w:t>17</w:t>
+          <w:t>18</w:t>
         </w:r>
         <w:r>
           <w:rPr>
@@ -2204,87 +2529,11 @@
       </w:hyperlink>
     </w:p>
     <w:p>
-      <w:pPr>
-        <w:pStyle w:val="TOC10"/>
-        <w:tabs>
-          <w:tab w:val="right" w:leader="dot" w:pos="9061"/>
-        </w:tabs>
-        <w:rPr>
-          <w:noProof/>
-        </w:rPr>
-      </w:pPr>
-      <w:hyperlink w:anchor="_Toc243148462" w:history="1">
-        <w:r>
-          <w:rPr>
-            <w:rStyle w:val="Hyperlink"/>
-            <w:noProof/>
-          </w:rPr>
-          <w:t>Phụ lục: Nguồn dữ liệu</w:t>
-        </w:r>
-        <w:r>
-          <w:rPr>
-            <w:noProof/>
-            <w:webHidden/>
-          </w:rPr>
-          <w:tab/>
-        </w:r>
-        <w:r>
-          <w:rPr>
-            <w:noProof/>
-            <w:webHidden/>
-          </w:rPr>
-          <w:fldChar w:fldCharType="begin"/>
-        </w:r>
-        <w:r>
-          <w:rPr>
-            <w:noProof/>
-            <w:webHidden/>
-          </w:rPr>
-          <w:instrText xml:space="preserve"> PAGEREF _Toc243148462 \h </w:instrText>
-        </w:r>
-        <w:r>
-          <w:rPr>
-            <w:noProof/>
-            <w:webHidden/>
-          </w:rPr>
-        </w:r>
-        <w:r>
-          <w:rPr>
-            <w:noProof/>
-            <w:webHidden/>
-          </w:rPr>
-          <w:fldChar w:fldCharType="separate"/>
-        </w:r>
-        <w:r>
-          <w:rPr>
-            <w:noProof/>
-            <w:webHidden/>
-          </w:rPr>
-          <w:t>18</w:t>
-        </w:r>
-        <w:r>
-          <w:rPr>
-            <w:noProof/>
-            <w:webHidden/>
-          </w:rPr>
-          <w:fldChar w:fldCharType="end"/>
-        </w:r>
-      </w:hyperlink>
-    </w:p>
-    <w:p>
       <w:r>
         <w:fldChar w:fldCharType="end"/>
       </w:r>
     </w:p>
     <w:p>
-      <w:pPr>
-        <w:pStyle w:val="Source"/>
-      </w:pPr>
-      <w:r>
-        <w:t>Mở bằng Microsoft Word để tự động cập nhật mục lục và số trang; nếu được hỏi, chọn cập nhật trường.</w:t>
-      </w:r>
-    </w:p>
-    <w:p>
       <w:r>
         <w:br w:type="page"/>
       </w:r>
@@ -2293,10 +2542,10 @@
       <w:pPr>
         <w:pStyle w:val="Heading1"/>
       </w:pPr>
-      <w:bookmarkStart w:id="0" w:name="_Toc243148432"/>
+      <w:bookmarkStart w:id="0" w:name="_Toc243150038"/>
       <w:r>
         <w:lastRenderedPageBreak/>
-        <w:t>1 Giới thiệu</w:t>
+        <w:t>CHƯƠNG 1. GIỚI THIỆU</w:t>
       </w:r>
       <w:bookmarkEnd w:id="0"/>
     </w:p>
@@ -2304,7 +2553,7 @@
       <w:pPr>
         <w:pStyle w:val="Heading2"/>
       </w:pPr>
-      <w:bookmarkStart w:id="1" w:name="_Toc243148433"/>
+      <w:bookmarkStart w:id="1" w:name="_Toc243150039"/>
       <w:r>
         <w:t>1.1 Động lực và bài toán</w:t>
       </w:r>
@@ -2312,23 +2561,28 @@
     </w:p>
     <w:p>
       <w:r>
-        <w:t>Hệ thống Edge-AI thường kết hợp tính toán biến thiên với phản ứng cần đúng hạn. Một kết quả suy luận chính xác vẫn có thể mất giá trị khi đến quá muộn. Linux thuận tiện cho mô hình và thư viện, nhưng một tiến trình có thể phải chờ CPU, bộ nhớ hoặc hàng đợi. Do đó, thông lượng cao không đủ để kết luận rằng đầu ra luôn phù hợp với trạng thái hiện tại. Đồ án dùng sự khác biệt này để quan sát cơ chế hệ điều hành trên nền tảng không đồng nhất.</w:t>
-      </w:r>
-    </w:p>
-    <w:p>
-      <w:r>
-        <w:t>Theo tài liệu thiết kế của nhóm, Raspberry Pi 5 chạy Ubuntu Server 24.04 ARM64 đảm nhận tác vụ tính toán; STM32F446RE chạy FreeRTOS nhận dữ liệu và quyết định đầu ra mô phỏng. Liên kết giữa hai miền là UART. AI chỉ tạo tải thực tế cho nghiên cứu lập lịch, tranh chấp tài nguyên và truyền thông. Đề tài không đề xuất mạng nơ-ron mới và không đưa suy luận xuống MCU.</w:t>
+        <w:t>Trong hệ thống Edge-AI, kết quả đúng chưa chắc còn hữu ích, bởi đầu vào có thể đã thay đổi trong lúc Raspberry Pi xử lý ảnh hoặc chờ bridge gửi kết quả tới nơi. Linux thuận tiện vì có sẵn thư viện và công cụ chạy mô hình, tuy vậy tiến trình còn phải chia sẻ CPU, bộ nhớ và các hàng đợi với công việc khác. Thông lượng chưa phải độ tươi. Đầu ra còn phải theo kịp trạng thái hiện tại.</w:t>
+      </w:r>
+    </w:p>
+    <w:p>
+      <w:r>
+        <w:t>Raspberry Pi 5 chạy Ubuntu Server 24.04 ARM64 tính toán, còn STM32F446RE chạy FreeRTOS nhận dữ liệu và quyết định đầu ra mô phỏng. Qua UART, nhóm theo dõi AI như tải tính toán phục vụ nghiên cứu lập lịch, tranh chấp tài nguyên và truyền thông. MCU không chạy suy luận. Chúng em nghiên cứu cơ chế OS thay vì đề xuất mạng nơ-ron mới.</w:t>
       </w:r>
     </w:p>
     <w:p>
       <w:pPr>
         <w:pStyle w:val="Heading2"/>
       </w:pPr>
-      <w:bookmarkStart w:id="2" w:name="_Toc243148434"/>
+      <w:bookmarkStart w:id="2" w:name="_Toc243150040"/>
       <w:r>
         <w:t>1.2 Câu hỏi nghiên cứu và đóng góp</w:t>
       </w:r>
       <w:bookmarkEnd w:id="2"/>
+    </w:p>
+    <w:p>
+      <w:r>
+        <w:t>Nhóm đặt các câu hỏi:</w:t>
+      </w:r>
     </w:p>
     <w:p>
       <w:pPr>
@@ -2376,16 +2630,16 @@
     </w:p>
     <w:p>
       <w:r>
-        <w:t>Đóng góp ở mức học phần gồm thiết kế tách quyền điều khiển, đường ống có dấu thời gian, bộ giám sát phân biệt sống còn với độ tươi, và tập bằng chứng giữ lại cả lượt đo thất bại. Kết quả sơ bộ giúp phát hiện hàng đợi sai vị trí và nhầm lẫn mốc thời gian.</w:t>
+        <w:t>Nhóm gắn dấu thời gian để lần theo dữ liệu từ Pi tới MCU và tìm chỗ chờ, trong khi bộ giám sát giữ quyền điều khiển dựa trên cả hoạt động của bridge lẫn độ mới của kết quả. Kết quả sơ bộ hướng việc phân tích về thời gian đầu vào đã chờ trước suy luận, vì thay dữ liệu ở bridge chỉ tác động tới đoạn sau. Những lượt đo thất bại cũng được giữ để tìm lỗi nguồn điện và mốc thời gian.</w:t>
       </w:r>
     </w:p>
     <w:p>
       <w:pPr>
         <w:pStyle w:val="Heading1"/>
       </w:pPr>
-      <w:bookmarkStart w:id="3" w:name="_Toc243148435"/>
-      <w:r>
-        <w:t>2 Cơ sở lý thuyết và các công trình liên quan</w:t>
+      <w:bookmarkStart w:id="3" w:name="_Toc243150041"/>
+      <w:r>
+        <w:t>CHƯƠNG 2. CƠ SỞ LÝ THUYẾT VÀ CÁC CÔNG TRÌNH LIÊN QUAN</w:t>
       </w:r>
       <w:bookmarkEnd w:id="3"/>
     </w:p>
@@ -2393,7 +2647,7 @@
       <w:pPr>
         <w:pStyle w:val="Heading2"/>
       </w:pPr>
-      <w:bookmarkStart w:id="4" w:name="_Toc243148436"/>
+      <w:bookmarkStart w:id="4" w:name="_Toc243150042"/>
       <w:r>
         <w:t>2.1 Lập lịch Linux và tranh chấp tài nguyên</w:t>
       </w:r>
@@ -2401,33 +2655,31 @@
     </w:p>
     <w:p>
       <w:r>
-        <w:t>CFS phân phối thời gian xử lý theo trọng số và lịch sử sử dụng CPU. EEVDF tiếp tục mục tiêu công bằng bằng điều kiện đủ tư cách và thời hạn ảo. Các khái niệm này mô tả lớp lập lịch thông thường; chúng không biến một tác vụ thành công việc có thời hạn cứng. Khi diễn giải phép đo, cần ghi phiên bản kernel và chính sách thực tế của luồng.</w:t>
-      </w:r>
-    </w:p>
-    <w:p>
-      <w:r>
-        <w:t xml:space="preserve">SCHED_FIFO dùng ưu tiên thời gian thực cố định: luồng sẵn sàng có ưu tiên cao có thể chiếm CPU của công việc thấp hơn. Nó hữu ích cho bridge nhỏ cần được đánh </w:t>
+        <w:t xml:space="preserve">CFS chia thời gian CPU theo trọng số và lịch sử sử dụng, còn EEVDF tiếp tục mục tiêu công bằng qua điều kiện đủ tư cách và thời hạn ảo. Tuy nhiên, công bằng không bảo đảm hoàn thành đúng hạn, nên bridge trên Pi vẫn có thể phải chờ ngay cả </w:t>
       </w:r>
       <w:r>
         <w:lastRenderedPageBreak/>
-        <w:t>thức kịp thời, nhưng luồng chạy lâu có thể làm đói công việc khác. Giới hạn băng thông tác vụ thời gian thực và cấu hình nhóm phải được xem cùng quyền đặt ưu tiên [1].</w:t>
-      </w:r>
-    </w:p>
-    <w:p>
-      <w:r>
-        <w:t>Gán CPU giảm di chuyển và tạo cấu hình thí nghiệm rõ hơn. Tuy nhiên, các lõi vẫn dùng chung những tài nguyên của hệ thống nhớ. Một luồng có CPU riêng vẫn có thể chịu độ trễ khi tải khác tạo lưu lượng bộ nhớ. MemGuard nghiên cứu cô lập băng thông bộ nhớ [2]; đồ án chỉ dùng công trình này để giải thích động lực, không cài cơ chế kernel tương ứng.</w:t>
-      </w:r>
-    </w:p>
-    <w:p>
-      <w:r>
-        <w:t>cgroups cho phép nhóm tiến trình và giới hạn tài nguyên. Hạn mức CPU có thể khống chế tải nền nhưng cũng gây throttling nếu đặt sai. mlockall giữ trang trong RAM để giảm rủi ro lỗi trang trong đường thời gian nhạy cảm; nó không xóa thời gian tính toán, cache miss hay tranh chấp nhớ. Cần kiểm tra lỗi trả về và ghi trạng thái khóa bộ nhớ, thay vì chỉ ghi ý định cấu hình.</w:t>
+        <w:t>khi gói dữ liệu cần gửi đã sẵn sàng. Cấu hình thực tế phải được xác nhận. Log vì vậy cần ghi phiên bản kernel và chính sách của luồng.</w:t>
+      </w:r>
+    </w:p>
+    <w:p>
+      <w:r>
+        <w:t>SCHED_FIFO dùng ưu tiên thời gian thực cố định, cho phép luồng sẵn sàng có ưu tiên cao chiếm CPU của công việc ưu tiên thấp hơn. Vì bridge chỉ xử lý ngắn, nhóm kỳ vọng dữ liệu được chuyển sớm sau đánh thức; tuy vậy, một luồng chạy quá lâu có thể khiến các công việc khác không được phục vụ. Ưu tiên còn phụ thuộc cấu hình. Nhóm cần xét quyền đặt ưu tiên, giới hạn băng thông thời gian thực và cấu hình nhóm [1].</w:t>
+      </w:r>
+    </w:p>
+    <w:p>
+      <w:r>
+        <w:t>Gán CPU giảm di chuyển nhưng không tách được bộ nhớ dùng chung giữa các lõi, nên luồng trên CPU riêng vẫn có thể chậm khi tải nền liên tục đọc ghi. MemGuard nghiên cứu cô lập băng thông bộ nhớ [2], giúp giải thích giới hạn ấy dù đồ án không cài cơ chế kernel của công trình. cgroups gom tiến trình và giới hạn tài nguyên tải nền, nhưng hạn mức CPU quá thấp cũng gây throttling. Với đường xử lý nhạy cảm về thời gian, mlockall giữ trang trong RAM nhằm giảm rủi ro lỗi trang. Tuy nhiên, khóa bộ nhớ không loại được</w:t>
+      </w:r>
+      <w:r>
+        <w:t xml:space="preserve"> chi phí tính toán, cache miss hoặc tranh chấp nhớ, nên nhóm vẫn kiểm tra lỗi trả về và ghi trạng thái khóa thực tế khi chạy thử.</w:t>
       </w:r>
     </w:p>
     <w:p>
       <w:pPr>
         <w:pStyle w:val="Heading2"/>
       </w:pPr>
-      <w:bookmarkStart w:id="5" w:name="_Toc243148437"/>
+      <w:bookmarkStart w:id="5" w:name="_Toc243150043"/>
       <w:r>
         <w:t>2.2 PREEMPT_RT và giới hạn suy diễn</w:t>
       </w:r>
@@ -2435,43 +2687,51 @@
     </w:p>
     <w:p>
       <w:r>
-        <w:t>PREEMPT_RT nhằm giảm những vùng không thể bị chiếm quyền và thay đổi cách xử lý một phần công việc kernel. Trong phạm vi đồ án, kernel Real-time Ubuntu đóng gói chỉ là hồ sơ P3 dự kiến; không sửa hoặc tự biên dịch kernel. Kết quả sơ bộ hiện có trên kernel stock không phải so sánh PREEMPT_RT. Mọi khẳng định về lợi ích của P3 vẫn là chưa biết cho hệ thống này.</w:t>
+        <w:t>PREEMPT_RT giảm những vùng không thể bị chiếm quyền và thay đổi cách xử lý một phần công việc trong kernel. Nhóm chỉ dự kiến thử kernel Real-time Ubuntu đóng gói ở cấu hình P3, không sửa hoặc tự biên dịch kernel. Vì các kết quả sơ bộ hiện có đều được thu trên kernel tiêu chuẩn, nhóm chưa thể dùng chúng để kết luận về PREEMPT_RT hoặc lợi ích của P3 với bridge trên Pi. Phần so sánh này cần được đo riêng.</w:t>
       </w:r>
     </w:p>
     <w:p>
       <w:pPr>
         <w:pStyle w:val="Heading2"/>
       </w:pPr>
-      <w:bookmarkStart w:id="6" w:name="_Toc243148438"/>
-      <w:r>
-        <w:t>2.3 Age of Information và dữ liệu còn giá trị</w:t>
+      <w:bookmarkStart w:id="6" w:name="_Toc243150044"/>
+      <w:r>
+        <w:t>2.3 Độ tươi dữ liệu và giá trị của kết quả</w:t>
       </w:r>
       <w:bookmarkEnd w:id="6"/>
     </w:p>
     <w:p>
       <w:r>
-        <w:t>Age of Information (AoI) tại thời điểm quan sát là thời gian đã trôi qua kể từ lúc sinh dữ liệu mới nhất có ích mà bên nhận đang giữ [3], [4]. Độ trễ một gói chỉ mô tả hành trình gói ấy; AoI còn tăng trong khoảng không có gói mới. Vì vậy, trung vị độ trễ chuyển giao không thể thay thế trung bình AoI. Nếu chỉ chọn những gói giao thành công, ta còn bỏ sót khoảng mất dữ liệu và phần đuôi sau lần cập nhật cuối.</w:t>
-      </w:r>
-    </w:p>
-    <w:p>
-      <w:r>
-        <w:t>Hình 1 minh họa sự tăng tuổi theo thời gian và việc tuổi giảm khi có cập nhật mới. Khi gói tới, tuổi thường giảm xuống tuổi đã tích lũy trên đường đi, không mặc nhiên về không. Muốn tính trung bình AoI phải tích phân trên cửa sổ quan sát đã xác định, nêu cách xử lý trước cập nhật đầu tiên và giữ lại các khoảng ngừng chuyển giao.</w:t>
-      </w:r>
-    </w:p>
-    <w:p>
-      <w:pPr>
+        <w:t xml:space="preserve">Độ tươi dữ liệu (Age of Information, AoI) tại thời điểm quan sát là thời gian từ lúc sinh dữ liệu mới nhất có ích mà bên nhận đang giữ [3], [4]. Nếu MCU chưa nhận được kết quả mới, tuổi của kết quả cũ vẫn tăng dù không có gói nào đang được giao. Chính sự tăng tuổi giữa hai lần cập nhật làm AoI khác độ trễ của riêng một gói, nên nhóm không dùng trung vị độ trễ chuyển giao để thay cho trung bình AoI. Khoảng không có cập nhật vẫn phải tính. Nếu chỉ xét gói giao thành công, nhóm sẽ bỏ qua khoảng mất dữ liệu và </w:t>
+      </w:r>
+      <w:r>
+        <w:t>phần thời gian sau cập nhật cuối.</w:t>
+      </w:r>
+    </w:p>
+    <w:p>
+      <w:r>
+        <w:t xml:space="preserve">Trong Hình 2.1, tuổi tăng theo thời gian rồi giảm khi bên nhận có cập nhật mới. Tuy nhiên, gói vừa tới đã mang theo thời gian chờ và truyền trước đó, nên tuổi không mặc nhiên trở về không. Vì đầu vào trên Pi đã có tuổi khi MCU nhận kết quả, AoI </w:t>
+      </w:r>
+      <w:r>
+        <w:lastRenderedPageBreak/>
+        <w:t>trung bình phải được tích phân trên cửa sổ xác định, với cách xử lý rõ ràng cho khoảng trước cập nhật đầu tiên và những lúc ngừng chuyển giao.</w:t>
+      </w:r>
+    </w:p>
+    <w:p>
+      <w:pPr>
+        <w:keepNext/>
+        <w:ind w:firstLine="0"/>
         <w:jc w:val="center"/>
       </w:pPr>
       <w:r>
         <w:rPr>
           <w:noProof/>
         </w:rPr>
-        <w:lastRenderedPageBreak/>
         <w:drawing>
-          <wp:inline distT="0" distB="0" distL="0" distR="0" wp14:anchorId="163E87C5" wp14:editId="77EB4C48">
+          <wp:inline distT="0" distB="0" distL="0" distR="0" wp14:anchorId="3CC93A51" wp14:editId="0ECF1C9B">
             <wp:extent cx="4320000" cy="2430000"/>
             <wp:effectExtent l="0" t="0" r="0" b="0"/>
-            <wp:docPr id="1" name="Hình 1" descr="Hình 1. Minh họa AoI và ngưỡng độ tươi; hình khái niệm, không chứa kết quả đo."/>
+            <wp:docPr id="1" name="Hình 1" descr="Hình 2.1. Minh họa AoI và ngưỡng độ tươi; hình khái niệm, không chứa kết quả đo."/>
             <wp:cNvGraphicFramePr/>
             <a:graphic xmlns:a="http://schemas.openxmlformats.org/drawingml/2006/main">
               <a:graphicData uri="http://schemas.openxmlformats.org/drawingml/2006/picture">
@@ -2507,14 +2767,14 @@
         <w:pStyle w:val="Caption"/>
       </w:pPr>
       <w:r>
-        <w:t>Hình 1. Minh họa AoI và ngưỡng độ tươi; hình khái niệm, không chứa kết quả đo.</w:t>
+        <w:t>Hình 2.1. Minh họa AoI và ngưỡng độ tươi; hình khái niệm, không chứa kết quả đo.</w:t>
       </w:r>
     </w:p>
     <w:p>
       <w:pPr>
         <w:pStyle w:val="Heading2"/>
       </w:pPr>
-      <w:bookmarkStart w:id="7" w:name="_Toc243148439"/>
+      <w:bookmarkStart w:id="7" w:name="_Toc243150045"/>
       <w:r>
         <w:t>2.4 Simplex và FreeRTOS trên MCU</w:t>
       </w:r>
@@ -2522,21 +2782,21 @@
     </w:p>
     <w:p>
       <w:r>
-        <w:t>Simplex tách khối phức tạp khỏi bộ điều khiển hoặc giám sát đáng tin cậy, với cơ chế quyết định quyền tác động [5], [6]. Đồ án vận dụng ý tưởng ranh giới quyền điều khiển: Pi đưa đề xuất; MCU quyết định đầu ra mô phỏng. Timeout và trạng thái FAILSAFE không đủ cấu thành chứng minh Simplex hình thức. Mô hình đối tượng, miền an toàn, giả thiết lỗi và bằng chứng thời gian vẫn cần phân tích riêng.</w:t>
-      </w:r>
-    </w:p>
-    <w:p>
-      <w:r>
-        <w:t>FreeRTOS cung cấp lập lịch ưu tiên có chiếm quyền và các cơ chế bàn giao hữu hạn. Trên MCU, mục tiêu là đường xử lý dễ quan sát: ngắt nhận dữ liệu, tác vụ phân tích, tác vụ giám sát và đầu ra. Tác vụ ưu tiên cao vẫn có thể trễ vì đoạn che ngắt hoặc công việc dài hơn dự kiến. Cấp phát tĩnh và một chủ sở hữu trạng thái giúp giảm biến thiên, nhưng không thay cho phép đo stack, thời gian thực thi và hành vi khi bộ đệm đầy.</w:t>
+        <w:t>Simplex tách khối phức tạp khỏi bộ điều khiển hoặc giám sát đáng tin cậy, quy định quyền tác động [5], [6]. Theo cách phân quyền đó, Pi chỉ đề xuất còn MCU quyết định đầu ra mô phỏng; tuy vậy, timeout và trạng thái FAILSAFE chưa đủ để coi hệ thống đã có chứng minh Simplex hình thức. Phạm vi bảo đảm hiện còn giới hạn. Mô hình đối tượng, miền an toàn, giả thiết lỗi và bằng chứng thời gian vẫn cần phân tích riêng.</w:t>
+      </w:r>
+    </w:p>
+    <w:p>
+      <w:r>
+        <w:t>FreeRTOS cung cấp lập lịch ưu tiên có chiếm quyền cùng các cơ chế bàn giao dữ liệu hữu hạn. Trên STM32, dữ liệu qua ngắt nhận, tác vụ phân tích, giám sát rồi tới đầu ra. Tác vụ ưu tiên cao vẫn có thể bị trễ nếu ngắt bị che hoặc công việc trước đó kéo dài hơn dự kiến. Mặc dù cấp phát tĩnh và giao trạng thái cho một chủ sở hữu giúp giảm biến thiên, chúng em vẫn phải đo stack, thời gian thực thi và kiểm tra hành vi khi bộ đệm đầy.</w:t>
       </w:r>
     </w:p>
     <w:p>
       <w:pPr>
         <w:pStyle w:val="Heading1"/>
       </w:pPr>
-      <w:bookmarkStart w:id="8" w:name="_Toc243148440"/>
-      <w:r>
-        <w:t>3 Thiết kế hệ thống</w:t>
+      <w:bookmarkStart w:id="8" w:name="_Toc243150046"/>
+      <w:r>
+        <w:t>CHƯƠNG 3. THIẾT KẾ HỆ THỐNG</w:t>
       </w:r>
       <w:bookmarkEnd w:id="8"/>
     </w:p>
@@ -2544,7 +2804,7 @@
       <w:pPr>
         <w:pStyle w:val="Heading2"/>
       </w:pPr>
-      <w:bookmarkStart w:id="9" w:name="_Toc243148441"/>
+      <w:bookmarkStart w:id="9" w:name="_Toc243150047"/>
       <w:r>
         <w:t>3.1 Kiến trúc và ranh giới quyền điều khiển</w:t>
       </w:r>
@@ -2552,23 +2812,20 @@
     </w:p>
     <w:p>
       <w:r>
-        <w:t>Đường dữ liệu gồm source → suy luận → bridge trên Pi, UART, RX → supervisor → GPIO trên STM32. Logger nhận dấu thời gian và trạng thái để tái dựng hành trình. Tải nền chạy trong miền Linux để tạo tranh chấp có kiểm soát. MCU không phụ thuộc vào tiến trình logger để tiếp tục kiểm tra hạn; ngược lại, log thiếu có thể khiến người phân tích không đủ bằng chứng kết luận về một lần chạy.</w:t>
-      </w:r>
-    </w:p>
-    <w:p>
-      <w:r>
-        <w:t xml:space="preserve">Quyền ghi đầu ra thuộc supervisor. Kết quả suy luận hợp lệ chỉ là điều kiện đầu vào, không phải lệnh ghi trực tiếp GPIO. Heartbeat trả lời câu hỏi bridge còn gửi được dữ liệu hay không; INFERENCE trả lời có kết quả đủ mới hay không. Không dùng </w:t>
-      </w:r>
+        <w:t>Dữ liệu đi qua source → suy luận → bridge trên Pi, qua UART rồi tới RX → supervisor → GPIO trên STM32. Logger thu dấu thời gian và trạng thái để tái dựng hành trình dữ liệu khi tải nền Linux cạnh tranh với tính toán và chuyển giao. MCU vẫn kiểm tra hạn khi logger không hoạt động, nên log thiếu có thể khiến nhóm chưa đủ bằng chứng kết luận dù bộ giám sát vẫn chạy.</w:t>
+      </w:r>
+    </w:p>
+    <w:p>
       <w:r>
         <w:lastRenderedPageBreak/>
-        <w:t>heartbeat để làm mới tuổi của kết quả cũ. Đầu ra trong đồ án là chỉ thị GPIO, chưa có cơ cấu chấp hành vật lý hoặc watchdog phần cứng độc lập.</w:t>
+        <w:t>Supervisor là nơi duy nhất được ghi đầu ra, còn kết quả suy luận hợp lệ chỉ cung cấp dữ liệu cho quyết định ấy. Heartbeat cho biết bridge còn gửi dữ liệu; INFERENCE mới cho biết có kết quả đủ mới để dùng hay không. Nếu MobileNetV2 ngừng tạo kết quả trong khi bridge vẫn gửi heartbeat, tuổi kết quả cũ phải tiếp tục tăng. Đầu ra hiện là chỉ thị GPIO. Hệ thống chưa có cơ cấu chấp hành vật lý hoặc watchdog phần cứng độc lập.</w:t>
       </w:r>
     </w:p>
     <w:p>
       <w:pPr>
         <w:pStyle w:val="Heading2"/>
       </w:pPr>
-      <w:bookmarkStart w:id="10" w:name="_Toc243148442"/>
+      <w:bookmarkStart w:id="10" w:name="_Toc243150048"/>
       <w:r>
         <w:t>3.2 Khung UART và loại bản tin</w:t>
       </w:r>
@@ -2576,11 +2833,13 @@
     </w:p>
     <w:p>
       <w:r>
-        <w:t>Hình 2 thể hiện khung chung. Bảng 1 nêu hợp đồng đang được tài liệu giao thức mô tả; số byte là cấu hình, không phải số đo. Parser kiểm tra độ dài và CRC trước khi giao bản tin cho logic chính sách. Số thứ tự hỗ trợ nhận diện dữ liệu cũ, trùng và khoảng mất; CRC kiểm tra toàn vẹn truyền, không chứng minh tính đúng đắn của nội dung suy luận.</w:t>
-      </w:r>
-    </w:p>
-    <w:p>
-      <w:pPr>
+        <w:t>Hình 3.1 mô tả khung chung, còn Bảng 1 liệt kê kích thước và vai trò của từng trường. SOF xác định ranh giới để parser kiểm độ dài và CRC trước khi giao cho logic chính sách; cụ thể, giới hạn payload 64 byte ở Bảng 1 giúp loại khung có độ dài sai. Trong khi số thứ tự giúp nhận ra dữ liệu cũ, trùng hoặc khoảng bị mất, CRC chỉ kiểm tra toàn vẹn truyền nên kết quả suy luận sai nhưng khung đúng vẫn có thể qua.</w:t>
+      </w:r>
+    </w:p>
+    <w:p>
+      <w:pPr>
+        <w:keepNext/>
+        <w:ind w:firstLine="0"/>
         <w:jc w:val="center"/>
       </w:pPr>
       <w:r>
@@ -2588,10 +2847,10 @@
           <w:noProof/>
         </w:rPr>
         <w:drawing>
-          <wp:inline distT="0" distB="0" distL="0" distR="0" wp14:anchorId="18DA5D72" wp14:editId="0C3F987D">
+          <wp:inline distT="0" distB="0" distL="0" distR="0" wp14:anchorId="3A891E5B" wp14:editId="395E5DCE">
             <wp:extent cx="4320000" cy="2430000"/>
             <wp:effectExtent l="0" t="0" r="0" b="0"/>
-            <wp:docPr id="2" name="Hình 2" descr="Hình 2. Khung UART; hình mô tả cấu trúc, không xác nhận pinout hoặc chất lượng liên kết."/>
+            <wp:docPr id="2" name="Hình 2" descr="Hình 3.1. Khung UART; hình mô tả cấu trúc, không xác nhận pinout hoặc chất lượng liên kết."/>
             <wp:cNvGraphicFramePr/>
             <a:graphic xmlns:a="http://schemas.openxmlformats.org/drawingml/2006/main">
               <a:graphicData uri="http://schemas.openxmlformats.org/drawingml/2006/picture">
@@ -2627,15 +2886,15 @@
         <w:pStyle w:val="Caption"/>
       </w:pPr>
       <w:r>
-        <w:t>Hình 2. Khung UART; hình mô tả cấu trúc, không xác nhận pinout hoặc chất lượng liên kết.</w:t>
-      </w:r>
-    </w:p>
-    <w:p>
-      <w:pPr>
-        <w:pStyle w:val="Caption"/>
-      </w:pPr>
-      <w:r>
-        <w:t>Bảng 1. Cấu trúc khung theo tài liệu giao thức; dự kiến/​cấu hình.</w:t>
+        <w:t>Hình 3.1. Khung UART; hình mô tả cấu trúc, không xác nhận pinout hoặc chất lượng liên kết.</w:t>
+      </w:r>
+    </w:p>
+    <w:p>
+      <w:pPr>
+        <w:pStyle w:val="TableCaption"/>
+      </w:pPr>
+      <w:r>
+        <w:t>Bảng 1. Cấu trúc khung truyền UART.</w:t>
       </w:r>
     </w:p>
     <w:tbl>
@@ -2657,7 +2916,7 @@
           <w:bottom w:w="60" w:type="dxa"/>
           <w:right w:w="10" w:type="dxa"/>
         </w:tblCellMar>
-        <w:tblLook w:val="0000" w:firstRow="0" w:lastRow="0" w:firstColumn="0" w:lastColumn="0" w:noHBand="0" w:noVBand="0"/>
+        <w:tblLook w:val="04A0" w:firstRow="1" w:lastRow="0" w:firstColumn="1" w:lastColumn="0" w:noHBand="0" w:noVBand="1"/>
       </w:tblPr>
       <w:tblGrid>
         <w:gridCol w:w="4535"/>
@@ -2840,6 +3099,7 @@
               <w:pStyle w:val="TableText"/>
             </w:pPr>
             <w:r>
+              <w:lastRenderedPageBreak/>
               <w:t>CRC</w:t>
             </w:r>
           </w:p>
@@ -2853,7 +3113,7 @@
               <w:pStyle w:val="TableText"/>
             </w:pPr>
             <w:r>
-              <w:t>2 byte CRC-16/​CCITT-FALSE; phủ version đến payload</w:t>
+              <w:t>2 byte CRC-16/CCITT-FALSE; phủ version đến payload</w:t>
             </w:r>
           </w:p>
         </w:tc>
@@ -2861,18 +3121,14 @@
     </w:tbl>
     <w:p>
       <w:r>
-        <w:t xml:space="preserve">HEARTBEAT mang thông tin sống còn và định danh phiên. INFERENCE mang kết quả, thứ tự đầu vào và tuổi tại lúc gửi. ECHO_​REQ/​ECHO_​RESP phục vụ ước lượng </w:t>
-      </w:r>
-      <w:r>
-        <w:lastRenderedPageBreak/>
-        <w:t>quan hệ đồng hồ; MCU_​STATUS báo trạng thái và bộ đếm. STATE_​EVENT ghi chuyển trạng thái, INF_​RX ghi thời điểm nhận suy luận. Đây là hợp đồng có phiên bản; không giả định hình minh họa cũ chứa đầy đủ phần mở rộng hiện tại.</w:t>
+        <w:t>HEARTBEAT mang thông tin sống còn và định danh phiên, trong khi INFERENCE mang kết quả, thứ tự đầu vào và tuổi lúc gửi để kiểm tra độ tươi. Để đối chiếu hoạt động hai bên, nhóm dùng ECHO_REQ/ECHO_RESP ước lượng quan hệ đồng hồ, đồng thời nhận MCU_STATUS chứa trạng thái và bộ đếm của bộ giám sát. Parser phân biệt theo loại bản tin. Cụ thể, STATE_EVENT ghi chuyển trạng thái còn INF_RX ghi thời điểm nhận suy luận.</w:t>
       </w:r>
     </w:p>
     <w:p>
       <w:pPr>
         <w:pStyle w:val="Heading2"/>
       </w:pPr>
-      <w:bookmarkStart w:id="11" w:name="_Toc243148443"/>
+      <w:bookmarkStart w:id="11" w:name="_Toc243150049"/>
       <w:r>
         <w:t>3.3 Máy trạng thái và phiên làm việc</w:t>
       </w:r>
@@ -2880,28 +3136,19 @@
     </w:p>
     <w:p>
       <w:r>
-        <w:t xml:space="preserve">Máy trạng thái gồm INIT, RUN, HOLD và FAILSAFE. Trong mã và log, trạng thái hoạt động RUN được đặt tên </w:t>
-      </w:r>
-      <w:r>
-        <w:rPr>
-          <w:b/>
-        </w:rPr>
-        <w:t>FRESH</w:t>
-      </w:r>
-      <w:r>
-        <w:t>; báo cáo dùng RUN/​FRESH để tránh đổi nghĩa dữ liệu. INIT giữ đầu ra an toàn mô phỏng khi chưa đủ điều kiện. RUN/​FRESH cần cả liveness và kết quả hợp lệ. HOLD khóa đầu ra cần dữ liệu mới khi tuổi vượt ngưỡng. FAILSAFE được chốt; lưu lượng tốt trở lại không tự động xóa chốt.</w:t>
-      </w:r>
-    </w:p>
-    <w:p>
-      <w:r>
-        <w:t>Phiên bridge mới không được kế thừa lịch sử của phiên cũ. Định danh session phân biệt lần khởi động; generation là dấu nội bộ gắn với dữ liệu trong hàng đợi. Khi đổi phiên hoặc tái kích hoạt, dữ liệu từ generation cũ bị loại. Kiểm tra hết hạn phải diễn ra trước xử lý dữ liệu vừa tới để một bản tin đúng sát thời hạn không che mất sự kiện timeout. Bản firmware hiện tại không cung cấp tự động rearm từ xa; không mô tả khả năng của lõi portable thành chức năng đã hoàn tất trên bo mạch.</w:t>
+        <w:t>MCU kiểm soát đầu ra qua INIT, RUN, HOLD và FAILSAFE, trong đó RUN còn được gọi là FRESH vì dữ liệu ở trạng thái này đủ mới để sử dụng. INIT giữ đầu ra an toàn mô phỏng. Chỉ khi có cả liveness và kết quả hợp lệ, MCU mới đủ điều kiện sử dụng RUN/FRESH. Khi tuổi vượt ngưỡng và cần dữ liệu mới, HOLD ngăn cập nhật đầu ra, còn FAILSAFE được chốt để lưu lượng tốt trở lại chưa tự động đưa hệ thống về hoạt động.</w:t>
+      </w:r>
+    </w:p>
+    <w:p>
+      <w:r>
+        <w:t>Bridge khởi động lại không được kế thừa lịch sử phiên cũ. Session phân biệt lần khởi động, còn generation được gắn nội bộ vào dữ liệu đang chờ trong hàng đợi để loại dữ liệu thuộc generation cũ khi đổi phiên hoặc tái kích hoạt. Supervisor phải kiểm tra hết hạn trước khi xử lý dữ liệu vừa tới, vì một bản tin sát hạn có thể che mất sự kiện timeout nếu đảo thứ tự. Firmware hiện chưa cung cấp tự động rearm từ xa, dù lõi portable đã có khả năng này; chức năng trên bo mạch vẫn chưa hoàn tất.</w:t>
       </w:r>
     </w:p>
     <w:p>
       <w:pPr>
         <w:pStyle w:val="Heading2"/>
       </w:pPr>
-      <w:bookmarkStart w:id="12" w:name="_Toc243148444"/>
+      <w:bookmarkStart w:id="12" w:name="_Toc243150050"/>
       <w:r>
         <w:t>3.4 FIFO và latest-value</w:t>
       </w:r>
@@ -2909,22 +3156,25 @@
     </w:p>
     <w:p>
       <w:r>
-        <w:t>FIFO giữ thứ tự nhưng có thể tích lũy tuổi khi tốc độ phục vụ thấp hơn nguồn. Latest-value thay dữ liệu đang chờ bằng dữ liệu mới nhất, phù hợp với nhiệm vụ quan tâm trạng thái hiện tại. Hình 3 chỉ minh họa chính sách lưu trữ. Nó không nói rằng suy luận đang chạy bị hủy; thay phần tử chờ khác với chiếm quyền công việc đang phục vụ [4].</w:t>
-      </w:r>
-    </w:p>
-    <w:p>
-      <w:pPr>
+        <w:t>FIFO giữ thứ tự dữ liệu đến, nhưng tuổi có thể tăng dần nếu nguồn sinh nhanh hơn khả năng phục vụ. Với nhiệm vụ cần biết trạng thái hiện tại, latest-value thay dữ liệu đang chờ bằng dữ liệu mới nhất để tránh tiếp tục xử lý đầu vào đã cũ. Sự khác nhau trong Hình 3.2 chỉ nằm ở phần dữ liệu chờ, bởi suy luận đang chạy vẫn được hoàn tất thay vì bị hủy khi có đầu vào mới [4].</w:t>
+      </w:r>
+    </w:p>
+    <w:p>
+      <w:pPr>
+        <w:keepNext/>
+        <w:ind w:firstLine="0"/>
         <w:jc w:val="center"/>
       </w:pPr>
       <w:r>
         <w:rPr>
           <w:noProof/>
         </w:rPr>
+        <w:lastRenderedPageBreak/>
         <w:drawing>
-          <wp:inline distT="0" distB="0" distL="0" distR="0" wp14:anchorId="7EC99E1E" wp14:editId="17C3D345">
+          <wp:inline distT="0" distB="0" distL="0" distR="0" wp14:anchorId="74416C05" wp14:editId="0CD9E0E6">
             <wp:extent cx="4320000" cy="2430000"/>
             <wp:effectExtent l="0" t="0" r="0" b="0"/>
-            <wp:docPr id="3" name="Hình 3" descr="Hình 3. FIFO và latest-value đối với dữ liệu chờ; minh họa chính sách, không phải số liệu."/>
+            <wp:docPr id="3" name="Hình 3" descr="Hình 3.2. FIFO và latest-value đối với dữ liệu chờ; minh họa chính sách, không phải số liệu."/>
             <wp:cNvGraphicFramePr/>
             <a:graphic xmlns:a="http://schemas.openxmlformats.org/drawingml/2006/main">
               <a:graphicData uri="http://schemas.openxmlformats.org/drawingml/2006/picture">
@@ -2960,160 +3210,152 @@
         <w:pStyle w:val="Caption"/>
       </w:pPr>
       <w:r>
-        <w:t>Hình 3. FIFO và latest-value đối với dữ liệu chờ; minh họa chính sách, không phải số liệu.</w:t>
-      </w:r>
-    </w:p>
-    <w:p>
-      <w:r>
-        <w:t xml:space="preserve">Đặt latest-value tại bridge chỉ tác động phần đã suy luận xong. Nếu tồn đọng ở đầu vào, một kết quả vừa hoàn tất vẫn có thể bắt nguồn từ dữ liệu cũ. Chính sách trước suy </w:t>
+        <w:t>Hình 3.2. FIFO và latest-value đối với dữ liệu chờ; minh họa chính sách, không phải số liệu.</w:t>
+      </w:r>
+    </w:p>
+    <w:p>
+      <w:r>
+        <w:t>Nếu chỉ đặt latest-value tại bridge, nhóm chỉ thay được kết quả đã suy luận xong và đang chờ gửi, trong khi đầu vào của kết quả vừa hoàn tất có thể đã chờ lâu trước MobileNetV2. Vì vậy, nhóm thử rút các datagram sẵn có trước suy luận, giữ đầu vào hợp lệ mới nhất và đếm số bỏ, đồng thời giữ cùng tải, nguồn và lập lịch để tách tác động của vị trí hàng đợi.</w:t>
+      </w:r>
+    </w:p>
+    <w:p>
+      <w:pPr>
+        <w:pStyle w:val="Heading1"/>
+      </w:pPr>
+      <w:bookmarkStart w:id="13" w:name="_Toc243150051"/>
+      <w:r>
+        <w:t>CHƯƠNG 4. HIỆN THỰC</w:t>
+      </w:r>
+      <w:bookmarkEnd w:id="13"/>
+    </w:p>
+    <w:p>
+      <w:pPr>
+        <w:pStyle w:val="Heading2"/>
+      </w:pPr>
+      <w:bookmarkStart w:id="14" w:name="_Toc243150052"/>
+      <w:r>
+        <w:t>4.1 Đường ống Linux và tải suy luận</w:t>
+      </w:r>
+      <w:bookmarkEnd w:id="14"/>
+    </w:p>
+    <w:p>
+      <w:r>
+        <w:t>Source, inference, bridge và receiver trao đổi qua IPC Unix datagram, nhờ đó mỗi tiến trình đảm nhận một đoạn trong đường đi của dữ liệu. Cụ thể, source đánh dấu đầu vào trước khi inference nhận dữ liệu, tiền xử lý rồi gọi ONNX Runtime với MobileNetV2; kết quả sau đó được đưa sang bridge để đóng khung UART. Khi kiểm tra logic trên host, chúng em có thể dùng tải tổng hợp thay cho runtime và mô hình thật. Nhờ vậy, nhóm tách được chờ đầu vào, tính toán và chờ chuyển giao khỏi nhau.</w:t>
+      </w:r>
+    </w:p>
+    <w:p>
+      <w:r>
+        <w:t>Với phiên đo nền dùng MobileNetV2-12 và ONNX Runtime 1.31.0, nhóm giữ cùng mô hình, đầu vào, số luồng và thiết lập runtime để các điều kiện có thể so sánh được. Thêm luồng có thể tận dụng CPU khi Pi nhàn rỗi, nhưng cũng làm suy luận cạnh tranh với tiến trình tạo tải. Vì thế, tăng số luồng chưa chắc rút ngắn thời gian khi hệ thống bận, và nhóm phải tách tổng thời gian phục vụ khỏi thời gian gọi suy luận khi đọc kết quả [7]. Bridge xuất nối tiếp không chặn, hỗ trợ FIFO hoặc latest-value, đồng thời phát heartb</w:t>
+      </w:r>
+      <w:r>
+        <w:t xml:space="preserve">eat và trao đổi echo. Khi UART mới ghi được một phần khung, bridge phải hoàn tất khung đang phát rồi mới thay dữ liệu chờ, bởi thay ngay giữa chừng sẽ khiến bên nhận thấy một khung bị ghép sai. Logger nối đầu vào với kết quả bằng dấu </w:t>
       </w:r>
       <w:r>
         <w:lastRenderedPageBreak/>
-        <w:t>luận rút các datagram sẵn có, giữ đầu vào hợp lệ mới nhất và ghi số bị bỏ. Đổi chính sách phải giữ cùng tải, nguồn và hồ sơ lập lịch khi đánh giá.</w:t>
+        <w:t>thời gian và bộ đếm, nên dù log ghi chậm, nhóm vẫn dùng thời điểm sự kiện để phân tích thay vì lúc ghi ra đĩa.</w:t>
+      </w:r>
+    </w:p>
+    <w:p>
+      <w:pPr>
+        <w:pStyle w:val="Heading2"/>
+      </w:pPr>
+      <w:bookmarkStart w:id="15" w:name="_Toc243150053"/>
+      <w:r>
+        <w:t>4.2 Cấu hình và môi trường thực thi</w:t>
+      </w:r>
+      <w:bookmarkEnd w:id="15"/>
+    </w:p>
+    <w:p>
+      <w:r>
+        <w:t>Trong quy trình thực hiện, host macOS phục vụ biên soạn, kiểm tra portable và biên dịch chéo, còn ứng dụng Linux cùng tải chạy trên Pi và firmware FreeRTOS chạy trên STM32. Vì test parser trên Mac chỉ kiểm tra logic khung, độ trễ UART vật lý trên Pi và thời gian đánh thức đều phải được xác nhận trên đúng nền tảng đích. Nhóm so sánh cấu hình mặc định P0 với cấu hình tối ưu thời gian thực P1. Trong thí nghiệm phần mềm, P1 đặt source ở FIFO ưu tiên 60 và bridge ở FIFO ưu tiên 70 trên CPU 1, còn suy luận giữ SC</w:t>
+      </w:r>
+      <w:r>
+        <w:t>HED_OTHER trên CPU 0. Bridge được ưu tiên cao hơn để phục vụ chuyển giao; phương án ban đầu đặt tiến trình này ở ưu tiên 50. P2 giới hạn hạn mức CPU và P3 chưa có kết quả sơ bộ so sánh được chấp nhận trong đợt này.</w:t>
+      </w:r>
+    </w:p>
+    <w:p>
+      <w:pPr>
+        <w:pStyle w:val="Heading2"/>
+      </w:pPr>
+      <w:bookmarkStart w:id="16" w:name="_Toc243150054"/>
+      <w:r>
+        <w:t>4.3 Firmware: từ nhận byte đến quyết định</w:t>
+      </w:r>
+      <w:bookmarkEnd w:id="16"/>
+    </w:p>
+    <w:p>
+      <w:r>
+        <w:t>Thiết kế ban đầu đi theo ISR → bộ đệm hữu hạn → RX task → supervisor → output. Để dễ kiểm soát thời gian, ngắt chỉ nhận byte rồi bàn giao phần phân tích khung và quyết định đầu ra cho tác vụ; firmware mặc định hiện đã chuyển sang nhận DMA vòng. Chế độ IRQ vẫn được giữ để đối chiếu với DMA, bởi cả hai cách đều phải bàn giao dữ liệu ngoại vi sang tác vụ trước khi thực hiện giám sát.</w:t>
+      </w:r>
+    </w:p>
+    <w:p>
+      <w:r>
+        <w:t>RX task lấy dữ liệu để dựng khung và kiểm CRC, rồi chuyển sự kiện kèm dấu thời gian và generation cho supervisor. Khi bộ đệm đầy, bộ đếm mất hoặc dấu gián đoạn phải phản ánh được sự thiếu hụt, vì dữ liệu bị mất không được âm thầm làm mới liveness. Supervisor giữ quyền sở hữu trạng thái, còn tác vụ trạng thái truyền các bản ghi đã chụp để UART TX không chặn quyết định. Bộ nhớ được cấp phát tĩnh. Nhờ vậy, nhóm giảm phụ thuộc heap và dễ kiểm tra giới hạn tài nguyên hơn.</w:t>
+      </w:r>
+    </w:p>
+    <w:p>
+      <w:r>
+        <w:t>Với DMA, log ghi thời điểm RX đọc byte CRC cuối, tức là sau khi byte đã tới chân UART. Vì chu kỳ đánh thức, jitter lập lịch và thời gian rút cả lô dữ liệu có thể làm khoảng cách này tăng, dấu thời gian trong log không phải thời điểm đến phần cứng. Nếu bỏ lỡ cả vòng DMA hoặc có lỗi UART, firmware phải xử lý bảo thủ thay vì tiếp tục coi dữ liệu là liên tục. Kiểm thử host mới kiểm tra con trỏ vòng. Tranh chấp bus và hoạt động ngoại vi vẫn cần xác nhận trên bo mạch.</w:t>
+      </w:r>
+    </w:p>
+    <w:p>
+      <w:pPr>
+        <w:pStyle w:val="Heading2"/>
+      </w:pPr>
+      <w:bookmarkStart w:id="17" w:name="_Toc243150055"/>
+      <w:r>
+        <w:t>4.4 Công cụ đo và miền đồng hồ</w:t>
+      </w:r>
+      <w:bookmarkEnd w:id="17"/>
+    </w:p>
+    <w:p>
+      <w:r>
+        <w:t xml:space="preserve">Nhóm dùng cyclictest để đo đánh thức timer và stress-ng để tạo tải, còn log đường ống cho biết hành trình của từng kết quả. Echo hỗ trợ ước lượng ánh xạ đồng hồ, còn logic analyzer quan sát trực tiếp UART và GPIO để đối chiếu hai miền thời </w:t>
+      </w:r>
+      <w:r>
+        <w:lastRenderedPageBreak/>
+        <w:t>gian riêng của Pi và TIM2. Hai dấu thời gian chưa thể lấy hiệu trực tiếp. Phép trừ chỉ có ý nghĩa khi cùng đồng hồ hoặc đã ánh xạ và nêu phần bất định [8].</w:t>
+      </w:r>
+    </w:p>
+    <w:p>
+      <w:r>
+        <w:t>Để ước lượng tuổi nguồn trên MCU, nhóm cộng tuổi lúc gửi, thời gian từ lúc nhận đến hiện tại và khoản dự phòng truyền; tuy nhiên, khoản dự phòng chỉ là giả thiết cấu hình, chưa phải cận trên được đo đạc chứng minh. Tài liệu cũ còn dùng khác nhau giữa MONOTONIC và MONOTONIC_RAW, nên khi tái lập phải kiểm tra clock thật của producer lẫn bộ theo dõi. Hai clock không thể trộn chỉ vì cùng mang tên monotonic; tương tự, độ dư khớp echo nhỏ cũng chưa đủ chứng minh đường truyền đối xứng hoặc thời gian ánh xạ chính x</w:t>
+      </w:r>
+      <w:r>
+        <w:t>ác tuyệt đối.</w:t>
       </w:r>
     </w:p>
     <w:p>
       <w:pPr>
         <w:pStyle w:val="Heading1"/>
       </w:pPr>
-      <w:bookmarkStart w:id="13" w:name="_Toc243148445"/>
-      <w:r>
-        <w:t>4 Hiện thực</w:t>
-      </w:r>
-      <w:bookmarkEnd w:id="13"/>
+      <w:bookmarkStart w:id="18" w:name="_Toc243150056"/>
+      <w:r>
+        <w:t>CHƯƠNG 5. ĐÁNH GIÁ SƠ BỘ</w:t>
+      </w:r>
+      <w:bookmarkEnd w:id="18"/>
     </w:p>
     <w:p>
       <w:pPr>
         <w:pStyle w:val="Heading2"/>
       </w:pPr>
-      <w:bookmarkStart w:id="14" w:name="_Toc243148446"/>
-      <w:r>
-        <w:t>4.1 Đường ống Linux và tải suy luận</w:t>
-      </w:r>
-      <w:bookmarkEnd w:id="14"/>
-    </w:p>
-    <w:p>
-      <w:r>
-        <w:t>Hiện thực tách source, inference, bridge và receiver thành tiến trình, dùng IPC Unix datagram. Source đánh dấu đầu vào; inference nhận dữ liệu, tiền xử lý và gọi ONNX Runtime với MobileNetV2. Kết quả đi sang bridge để đóng khung UART. Có tải tổng hợp thay thế nhằm kiểm tra logic trên host mà không cần runtime hoặc mô hình thật. Sự tách tiến trình làm rõ ranh giới chờ đầu vào, phục vụ tính toán và chờ chuyển giao.</w:t>
-      </w:r>
-    </w:p>
-    <w:p>
-      <w:r>
-        <w:t>Phiên đo nền dùng mobilenetv2-12.onnx và ONNX Runtime 1.31.0 theo hồ sơ đo nền.  Cần giữ cùng mô hình, đầu vào, số luồng và thiết lập runtime khi so sánh. Tăng số luồng có thể tận dụng CPU lúc nhàn nhưng cũng cạnh tranh với stressor; tổng thời gian phục vụ không được đồng nhất với thời gian bên trong lời gọi suy luận [7].</w:t>
-      </w:r>
-    </w:p>
-    <w:p>
-      <w:r>
-        <w:t>Bridge sử dụng xuất nối tiếp không chặn, chọn FIFO hoặc latest-value, phát heartbeat và trao đổi echo. Khi ghi một phần khung, cần hoàn tất ranh giới khung đang phát trước khi thay dữ liệu chờ; thay tùy tiện giữa khung sẽ phá giao thức. Logger ghi các dấu thời gian và bộ đếm để nối đầu vào với kết quả. Nếu phần ghi log bị trì hoãn, phải phân biệt thời điểm sự kiện với lúc dòng CSV được ghi ra đĩa.</w:t>
-      </w:r>
-    </w:p>
-    <w:p>
-      <w:pPr>
-        <w:pStyle w:val="Heading2"/>
-      </w:pPr>
-      <w:bookmarkStart w:id="15" w:name="_Toc243148447"/>
-      <w:r>
-        <w:t>4.2 Hồ sơ và môi trường thực thi</w:t>
-      </w:r>
-      <w:bookmarkEnd w:id="15"/>
-    </w:p>
-    <w:p>
-      <w:r>
-        <w:t>Host macOS phục vụ biên soạn, kiểm tra portable và biên dịch chéo. Pi mới là nơi thực thi ứng dụng Linux và tạo tải; STM32 chạy firmware FreeRTOS. Không dùng khả năng chạy test trên Mac làm bằng chứng cho thời gian đánh thức hoặc UART vật lý trên Pi.</w:t>
-      </w:r>
-    </w:p>
-    <w:p>
-      <w:r>
-        <w:t>Trong chiến dịch phần mềm, P1 thực tế đặt source FIFO ưu tiên 60 và bridge FIFO ưu tiên 70 trên CPU 1; suy luận vẫn SCHED_OTHER trên CPU 0. Đây là cấu hình đã ghi trong hồ sơ cấu hình áp dụng, khác kế hoạch bridge ưu tiên 50 trong hướng dẫn cũ.  P2 quota và P3 kernel thời gian thực chưa có kết quả sơ bộ so sánh được chấp nhận trong tập tài liệu này.</w:t>
-      </w:r>
-    </w:p>
-    <w:p>
-      <w:pPr>
-        <w:pStyle w:val="Heading2"/>
-      </w:pPr>
-      <w:bookmarkStart w:id="16" w:name="_Toc243148448"/>
-      <w:r>
-        <w:t>4.3 Firmware: từ nhận byte đến quyết định</w:t>
-      </w:r>
-      <w:bookmarkEnd w:id="16"/>
-    </w:p>
-    <w:p>
-      <w:r>
-        <w:t xml:space="preserve">Thiết kế ban đầu dùng ISR → bộ đệm hữu hạn → RX task → supervisor → output. Mục đích là tách tiếp nhận byte khỏi quyết định chính sách, không phân tích toàn bộ khung hoặc điều khiển đầu ra ngay trong ngắt. Hiện thực firmware mặc định đã </w:t>
-      </w:r>
-      <w:r>
-        <w:lastRenderedPageBreak/>
-        <w:t>chuyển sang nhận DMA vòng; chế độ IRQ vẫn được giữ để đối chiếu. Báo cáo giữ mô hình bàn giao ban đầu nhưng không mô tả stream buffer như mặc định hiện tại.</w:t>
-      </w:r>
-    </w:p>
-    <w:p>
-      <w:r>
-        <w:t>RX task lấy dữ liệu, dựng khung, kiểm CRC rồi chuyển sự kiện có dấu thời gian và generation cho supervisor. Bộ đệm đầy phải tạo bộ đếm mất hoặc dấu gián đoạn, không âm thầm làm mới liveness. Supervisor là chủ sở hữu duy nhất của trạng thái. Tác vụ trạng thái truyền các bản ghi đã chụp, tránh để UART TX chặn đường quyết định. Cấp phát tĩnh giảm phụ thuộc vào heap và giúp kiểm tra giới hạn tài nguyên.</w:t>
-      </w:r>
-    </w:p>
-    <w:p>
-      <w:r>
-        <w:t>Với DMA, thời điểm nhận trong log là lúc RX đọc byte CRC cuối, muộn hơn cạnh vật lý tại chân UART. Chu kỳ đánh thức, jitter lập lịch và thời gian rút cả lô đều góp vào chênh lệch. Không được đổi tên dấu thời gian này thành thời điểm đến phần cứng. Trường hợp bỏ lỡ cả vòng DMA hoặc lỗi UART phải được xử lý bảo thủ. Kiểm thử con trỏ vòng trên host không mô phỏng đầy đủ tranh chấp bus và hoạt động ngoại vi thật.</w:t>
-      </w:r>
-    </w:p>
-    <w:p>
-      <w:pPr>
-        <w:pStyle w:val="Heading2"/>
-      </w:pPr>
-      <w:bookmarkStart w:id="17" w:name="_Toc243148449"/>
-      <w:r>
-        <w:t>4.4 Công cụ đo và miền đồng hồ</w:t>
-      </w:r>
-      <w:bookmarkEnd w:id="17"/>
-    </w:p>
-    <w:p>
-      <w:r>
-        <w:t>cyclictest quan sát đánh thức timer; stress-ng tạo tải; CSV pipeline quan sát hành trình kết quả; echo hỗ trợ ước lượng ánh xạ đồng hồ; logic analyzer quan sát UART và GPIO. Mỗi công cụ có điểm quan sát khác nhau. Dấu thời gian Pi và TIM2 thuộc hai miền riêng: chỉ trừ trực tiếp khi cùng đồng hồ, hoặc sau ánh xạ đã nêu bất định [8].</w:t>
-      </w:r>
-    </w:p>
-    <w:p>
-      <w:r>
-        <w:t>Tuổi nguồn ước lượng bằng tuổi lúc gửi cộng thời gian từ nhận đến hiện tại trên MCU và khoản dự phòng truyền. Khoản dự phòng là giả thiết cấu hình, chưa phải cận trên đã chứng minh. Tài liệu cũ còn khác nhau giữa MONOTONIC và MONOTONIC_RAW; khi tái lập phải kiểm tra clock thực tế của producer và monitor, không trộn hai loại vì tên đều là monotonic. Độ dư khớp echo nhỏ cũng không tự chứng minh đường truyền đối xứng hoặc độ chính xác tuyệt đối.</w:t>
-      </w:r>
-    </w:p>
-    <w:p>
-      <w:pPr>
-        <w:pStyle w:val="Heading1"/>
-      </w:pPr>
-      <w:bookmarkStart w:id="18" w:name="_Toc243148450"/>
-      <w:r>
-        <w:t>5 Đánh giá sơ bộ</w:t>
-      </w:r>
-      <w:bookmarkEnd w:id="18"/>
-    </w:p>
-    <w:p>
-      <w:pPr>
-        <w:pStyle w:val="Heading2"/>
-      </w:pPr>
-      <w:bookmarkStart w:id="19" w:name="_Toc243148451"/>
-      <w:r>
-        <w:t>5.1 Phương pháp, môi trường và quy tắc hợp lệ</w:t>
+      <w:bookmarkStart w:id="19" w:name="_Toc243150057"/>
+      <w:r>
+        <w:t>5.1 Phương pháp và môi trường đo</w:t>
       </w:r>
       <w:bookmarkEnd w:id="19"/>
     </w:p>
     <w:p>
       <w:r>
-        <w:rPr>
-          <w:b/>
-        </w:rPr>
-        <w:t>KẾT QUẢ SƠ BỘ.</w:t>
-      </w:r>
-      <w:r>
-        <w:t xml:space="preserve"> Bảng 2 tổng hợp phạm vi bằng chứng. Thí nghiệm phải giữ đầu vào, tải, cấu hình, governor, trạng thái nhiệt và công suất; thay một nhóm cơ chế cần được công bố rõ. Số mẫu trong run không phải số lần lặp độc lập. Các phân vị trong bảng nguồn thường là trung vị của phân vị từng run, còn max là cực đại quan sát; không ghép chúng thành một phân phối chung.</w:t>
-      </w:r>
-    </w:p>
-    <w:p>
-      <w:pPr>
-        <w:pStyle w:val="Caption"/>
-      </w:pPr>
-      <w:r>
-        <w:lastRenderedPageBreak/>
-        <w:t>Bảng 2. Kết quả sơ bộ: kiểm kê lượt đo theo hồ sơ dữ liệu; số đã tính từ hồ sơ lưu trữ.</w:t>
+        <w:t>Nhóm đo riêng đánh thức định kỳ, suy luận độc lập, đường ống phần mềm và phản ứng trên bo mạch. Số lượt thu được không đồng nghĩa số lượt đủ điều kiện cho mọi cách phân tích: ở Bảng 2, E1/E2/E3 PTY đạt 45/45 theo kiểm tra phần mềm ban đầu nhưng chỉ 0/45 đủ theo dõi bổ sung. Mỗi điều kiện được ghi đầu vào, tải nền, cấu hình lập lịch và chế độ điều chỉnh tần số. Mẫu cùng lượt không phải lần lặp độc lập. Vì vậy, phân vị lấy trung vị giữa lượt, còn giá trị lớn nhất lấy cực đại quan sát.</w:t>
+      </w:r>
+    </w:p>
+    <w:p>
+      <w:pPr>
+        <w:pStyle w:val="TableCaption"/>
+      </w:pPr>
+      <w:r>
+        <w:t>Bảng 2. Tổng hợp số lượt đo và phạm vi sử dụng.</w:t>
       </w:r>
     </w:p>
     <w:tbl>
@@ -3135,7 +3377,7 @@
           <w:bottom w:w="60" w:type="dxa"/>
           <w:right w:w="10" w:type="dxa"/>
         </w:tblCellMar>
-        <w:tblLook w:val="0000" w:firstRow="0" w:lastRow="0" w:firstColumn="0" w:lastColumn="0" w:noHBand="0" w:noVBand="0"/>
+        <w:tblLook w:val="04A0" w:firstRow="1" w:lastRow="0" w:firstColumn="1" w:lastColumn="0" w:noHBand="0" w:noVBand="1"/>
       </w:tblPr>
       <w:tblGrid>
         <w:gridCol w:w="4535"/>
@@ -3159,7 +3401,7 @@
               <w:rPr>
                 <w:b/>
               </w:rPr>
-              <w:t>Tập bằng chứng</w:t>
+              <w:t>Nhóm thí nghiệm</w:t>
             </w:r>
           </w:p>
         </w:tc>
@@ -3207,7 +3449,7 @@
               <w:pStyle w:val="TableText"/>
             </w:pPr>
             <w:r>
-              <w:t>v1: 30/​30; v2: 3/​15 mỗi hồ sơ, chỉ idle</w:t>
+              <w:t>30/30 theo kiểm tra ban đầu; 3/15 mỗi cấu hình đủ theo dõi bổ sung, chỉ khi nhàn rỗi</w:t>
             </w:r>
           </w:p>
         </w:tc>
@@ -3225,7 +3467,7 @@
               <w:pStyle w:val="TableText"/>
             </w:pPr>
             <w:r>
-              <w:t>Inference baseline</w:t>
+              <w:t>Suy luận độc lập</w:t>
             </w:r>
           </w:p>
         </w:tc>
@@ -3238,7 +3480,7 @@
               <w:pStyle w:val="TableText"/>
             </w:pPr>
             <w:r>
-              <w:t>21/​24; loại 3 lượt 4 luồng vì điện áp thấp trực tiếp</w:t>
+              <w:t>21/24; loại 3 lượt 4 luồng vì điện áp thấp trực tiếp</w:t>
             </w:r>
           </w:p>
         </w:tc>
@@ -3256,7 +3498,7 @@
               <w:pStyle w:val="TableText"/>
             </w:pPr>
             <w:r>
-              <w:t>E1/​E2/​E3 PTY</w:t>
+              <w:t>E1/E2/E3 PTY</w:t>
             </w:r>
           </w:p>
         </w:tc>
@@ -3269,7 +3511,7 @@
               <w:pStyle w:val="TableText"/>
             </w:pPr>
             <w:r>
-              <w:t>v1: 45/​45 phần mềm; v2: 0/​45 đủ bằng chứng bổ sung</w:t>
+              <w:t>45/45 theo kiểm tra phần mềm ban đầu; 0/45 đủ theo dõi bổ sung</w:t>
             </w:r>
           </w:p>
         </w:tc>
@@ -3300,7 +3542,7 @@
               <w:pStyle w:val="TableText"/>
             </w:pPr>
             <w:r>
-              <w:t>3/​12; cả 6 lượt có tải đều INVALID</w:t>
+              <w:t>3/12; cả 6 lượt có tải đều bị loại</w:t>
             </w:r>
           </w:p>
         </w:tc>
@@ -3331,7 +3573,7 @@
               <w:pStyle w:val="TableText"/>
             </w:pPr>
             <w:r>
-              <w:t>0/​18; cờ nguồn, clock và thiếu sự kiện có thể chồng nhau</w:t>
+              <w:t>0/18; cờ nguồn, clock và thiếu sự kiện có thể chồng nhau</w:t>
             </w:r>
           </w:p>
         </w:tc>
@@ -3362,7 +3604,7 @@
               <w:pStyle w:val="TableText"/>
             </w:pPr>
             <w:r>
-              <w:t>17/​25 mục; gồm 5 mục F5 chưa thực hiện</w:t>
+              <w:t>17/25 mục; gồm 5 mục F5 chưa thực hiện</w:t>
             </w:r>
           </w:p>
         </w:tc>
@@ -3380,6 +3622,7 @@
               <w:pStyle w:val="TableText"/>
             </w:pPr>
             <w:r>
+              <w:lastRenderedPageBreak/>
               <w:t>F5 riêng</w:t>
             </w:r>
           </w:p>
@@ -3393,35 +3636,25 @@
               <w:pStyle w:val="TableText"/>
             </w:pPr>
             <w:r>
-              <w:t>5/​5 cho chuyển trạng thái cửa sổ ngắn</w:t>
+              <w:t>5/5 cho chuyển trạng thái cửa sổ ngắn</w:t>
             </w:r>
           </w:p>
         </w:tc>
       </w:tr>
     </w:tbl>
     <w:p>
-      <w:pPr>
-        <w:pStyle w:val="Source"/>
-      </w:pPr>
-      <w:r>
-        <w:t>Nguồn: các thư mục 2026-10-11_cyclictest, 2026-10-11_inference_baseline, 2026-10-11_e1_e2_e3_pty, 2026-10-12_e3b_input_latest, 2026-10-12_e3_real_uart, 2026-10-12_e4_faults và 2026-10-12_f5_stale.</w:t>
-      </w:r>
-    </w:p>
-    <w:p>
-      <w:r>
-        <w:t>Kernel được ghi là 6.8.0-1064-raspi, PREEMPT_​DYNAMIC. Nguồn Pi là 5 V /​ 3 A; baseline suy luận ghi điện áp dưới tải 4.66–4.92 V. Những con số này là metadata đã đo, không phải thông số thiết kế mới. Baseline dùng governor ondemand, còn chiến dịch pipeline dùng performance, nên không so trực tiếp hai tập như một thử nghiệm chỉ thay IPC.</w:t>
-      </w:r>
-    </w:p>
-    <w:p>
-      <w:r>
-        <w:t>Quy tắc v2 yêu cầu monitor có timestamp RAW phủ cửa sổ, khoảng cách mẫu không quá 1.5 s, chứng minh stressor còn sống và clock fit không cũ quá 5 s. Replay không xác nhận được một số run cũ vì thiếu bằng chứng bổ sung; điều đó không chứng minh chúng có lỗi vật lý. Giữ nhãn đã đo theo v1, công bố hạn chế v2 và áp dụng v2 cho lần chạy mới. Đồng hồ lịch Pi lệch khoảng 3 ngày giải thích tên run, không sửa lại các khoảng thời gian monotonic.</w:t>
+      <w:r>
+        <w:t xml:space="preserve">Pi dùng kernel 6.8.0-1064-raspi, PREEMPT_DYNAMIC và nguồn 5 V / 3 A. Trong baseline suy luận, điện áp dưới tải được ghi ở mức 4.66–4.92 V, nên nhóm giữ thông tin này để đối chiếu với các lượt có vấn đề nguồn. Baseline dùng chế độ điều chỉnh tần số ondemand trong khi chiến dịch pipeline dùng performance, nên chênh lệch giữa hai tập còn chịu khác biệt cấu hình và không thể quy cho riêng IPC. Sau khi kiểm tra lại cách thu thập, nhóm yêu cầu theo dõi hệ thống bằng đồng hồ đơn điệu thô với khoảng cách mẫu không </w:t>
+      </w:r>
+      <w:r>
+        <w:t>quá 1.5 s. Tiến trình tạo tải phải được xác nhận còn hoạt động và phép khớp đồng hồ không được cũ quá 5 s. Đồng hồ lịch trên Pi lệch khoảng 3 ngày, nhưng các khoảng thời gian vẫn được tính bằng đồng hồ đơn điệu.</w:t>
       </w:r>
     </w:p>
     <w:p>
       <w:pPr>
         <w:pStyle w:val="Heading2"/>
       </w:pPr>
-      <w:bookmarkStart w:id="20" w:name="_Toc243148452"/>
+      <w:bookmarkStart w:id="20" w:name="_Toc243150058"/>
       <w:r>
         <w:t>5.2 Đánh thức timer và suy luận độc lập</w:t>
       </w:r>
@@ -3429,22 +3662,15 @@
     </w:p>
     <w:p>
       <w:r>
-        <w:rPr>
-          <w:b/>
-        </w:rPr>
-        <w:t>KẾT QUẢ SƠ BỘ — đã đo theo v1.</w:t>
-      </w:r>
-      <w:r>
-        <w:t xml:space="preserve"> Bảng 3 dùng cyclictest với luồng đo trên CPU 0, khoảng timer 1 ms, khóa bộ nhớ, mỗi run 120 s và 3 lần lặp mỗi điều kiện. P0 là SCHED_OTHER; P1 là FIFO ưu tiên 50 đã kiểm tra trên luồng đo. Bảng chỉ trích idle và memrate để làm rõ đuôi trễ; các tải khác vẫn được giữ trong nguồn.</w:t>
-      </w:r>
-    </w:p>
-    <w:p>
-      <w:pPr>
-        <w:pStyle w:val="Caption"/>
-      </w:pPr>
-      <w:r>
-        <w:lastRenderedPageBreak/>
-        <w:t>Bảng 3. Kết quả sơ bộ cyclictest, đơn vị µs; P50/​P99 là trung vị giữa run, max là cực đại quan sát.</w:t>
+        <w:t>Ở Bảng 3, nhóm dùng cyclictest với luồng đo trên CPU 0, timer cách nhau 1 ms và bộ nhớ được khóa. Với mỗi lượt kéo dài 120 s và 3 lần lặp cho mỗi điều kiện, nhóm đối chiếu P0 dùng SCHED_OTHER với P1 dùng FIFO ưu tiên 50 đã được kiểm tra trên luồng đo. Hai hàng nhàn rỗi và tải bộ nhớ giúp đối chiếu mức trễ thường gặp với phần đuôi phân bố.</w:t>
+      </w:r>
+    </w:p>
+    <w:p>
+      <w:pPr>
+        <w:pStyle w:val="TableCaption"/>
+      </w:pPr>
+      <w:r>
+        <w:t>Bảng 3. Kết quả sơ bộ cyclictest, đơn vị µs; P50/P99 là trung vị giữa lượt đo, giá trị lớn nhất là cực đại quan sát.</w:t>
       </w:r>
     </w:p>
     <w:tbl>
@@ -3466,7 +3692,7 @@
           <w:bottom w:w="60" w:type="dxa"/>
           <w:right w:w="10" w:type="dxa"/>
         </w:tblCellMar>
-        <w:tblLook w:val="0000" w:firstRow="0" w:lastRow="0" w:firstColumn="0" w:lastColumn="0" w:noHBand="0" w:noVBand="0"/>
+        <w:tblLook w:val="04A0" w:firstRow="1" w:lastRow="0" w:firstColumn="1" w:lastColumn="0" w:noHBand="0" w:noVBand="1"/>
       </w:tblPr>
       <w:tblGrid>
         <w:gridCol w:w="1295"/>
@@ -3546,7 +3772,7 @@
               <w:rPr>
                 <w:b/>
               </w:rPr>
-              <w:t>P0 max</w:t>
+              <w:t>P0 lớn nhất</w:t>
             </w:r>
           </w:p>
         </w:tc>
@@ -3597,7 +3823,7 @@
               <w:rPr>
                 <w:b/>
               </w:rPr>
-              <w:t>P1 max</w:t>
+              <w:t>P1 lớn nhất</w:t>
             </w:r>
           </w:p>
         </w:tc>
@@ -3615,7 +3841,7 @@
               <w:pStyle w:val="TableText"/>
             </w:pPr>
             <w:r>
-              <w:t>idle</w:t>
+              <w:t>Nhàn rỗi</w:t>
             </w:r>
           </w:p>
         </w:tc>
@@ -3796,24 +4022,17 @@
       </w:tr>
     </w:tbl>
     <w:p>
-      <w:pPr>
-        <w:pStyle w:val="Source"/>
-      </w:pPr>
-      <w:r>
-        <w:t>Nguồn: results/​2026-10-11_​cyclictest/​SUMMARY.md; run 20261008T091937Z_​cyc_​P0/​ và 20261008T091937Z_​cyc_​P1/​. Giới hạn v2: chỉ idle còn đủ bằng chứng, tải thiếu xác nhận stressor sống.</w:t>
-      </w:r>
-    </w:p>
-    <w:p>
-      <w:r>
-        <w:t>Trung vị P0 còn chịu timer slack nên không gán toàn bộ khoảng cách P50 cho chờ bộ lập lịch. P1 cải thiện đuôi đánh thức nhưng P99 dưới memrate vẫn cao hơn idle. Đây là quan sát phù hợp với vấn đề tài nguyên chung, chưa phải phép đo trực tiếp băng thông nhớ. Timer wake-up không phải thời gian suy luận hoặc độ trễ UART.</w:t>
-      </w:r>
-    </w:p>
-    <w:p>
-      <w:pPr>
-        <w:pStyle w:val="Caption"/>
-      </w:pPr>
-      <w:r>
-        <w:t>Bảng 4. Kết quả sơ bộ thời gian gọi MobileNetV2, ms; đã đo, chỉ dùng run được baseline chấp nhận.</w:t>
+      <w:r>
+        <w:t>Khi có memrate ở Bảng 3, P99 của P0 tăng từ 57 lên 613 µs, còn P1 tăng từ 9 lên 239 µs. Mặc dù P1 giảm đuôi trễ so với P0, tải nhớ vẫn gây ảnh hưởng; hơn nữa, trung vị P0 còn chịu timer slack nên khoảng cách P50 chưa thể quy hết cho thời gian chờ bộ lập lịch. Quan sát này phù hợp với việc các lõi chia sẻ tài nguyên, tuy vậy đây chưa phải phép đo trực tiếp băng thông nhớ. Kết quả đánh thức timer cũng không đại diện cho thời gian suy luận hoặc độ trễ UART.</w:t>
+      </w:r>
+    </w:p>
+    <w:p>
+      <w:pPr>
+        <w:pStyle w:val="TableCaption"/>
+      </w:pPr>
+      <w:r>
+        <w:lastRenderedPageBreak/>
+        <w:t>Bảng 4. Thời gian gọi MobileNetV2 ở các điều kiện tải và số luồng, đơn vị ms.</w:t>
       </w:r>
     </w:p>
     <w:tbl>
@@ -3835,7 +4054,7 @@
           <w:bottom w:w="60" w:type="dxa"/>
           <w:right w:w="10" w:type="dxa"/>
         </w:tblCellMar>
-        <w:tblLook w:val="0000" w:firstRow="0" w:lastRow="0" w:firstColumn="0" w:lastColumn="0" w:noHBand="0" w:noVBand="0"/>
+        <w:tblLook w:val="04A0" w:firstRow="1" w:lastRow="0" w:firstColumn="1" w:lastColumn="0" w:noHBand="0" w:noVBand="1"/>
       </w:tblPr>
       <w:tblGrid>
         <w:gridCol w:w="1815"/>
@@ -3862,7 +4081,7 @@
               <w:rPr>
                 <w:b/>
               </w:rPr>
-              <w:t>Tải /​ luồng ORT</w:t>
+              <w:t>Tải / luồng ORT</w:t>
             </w:r>
           </w:p>
         </w:tc>
@@ -3930,7 +4149,7 @@
               <w:rPr>
                 <w:b/>
               </w:rPr>
-              <w:t>Max</w:t>
+              <w:t>Lớn nhất</w:t>
             </w:r>
           </w:p>
         </w:tc>
@@ -3948,7 +4167,7 @@
               <w:pStyle w:val="TableText"/>
             </w:pPr>
             <w:r>
-              <w:t>idle /​ 1</w:t>
+              <w:t>Nhàn rỗi / 1</w:t>
             </w:r>
           </w:p>
         </w:tc>
@@ -4018,7 +4237,7 @@
               <w:pStyle w:val="TableText"/>
             </w:pPr>
             <w:r>
-              <w:t>idle /​ 3</w:t>
+              <w:t>Nhàn rỗi / 3</w:t>
             </w:r>
           </w:p>
         </w:tc>
@@ -4088,7 +4307,7 @@
               <w:pStyle w:val="TableText"/>
             </w:pPr>
             <w:r>
-              <w:t>idle /​ 4</w:t>
+              <w:t>Nhàn rỗi / 4</w:t>
             </w:r>
           </w:p>
         </w:tc>
@@ -4158,7 +4377,7 @@
               <w:pStyle w:val="TableText"/>
             </w:pPr>
             <w:r>
-              <w:t>cpu /​ 1</w:t>
+              <w:t>Tải CPU / 1</w:t>
             </w:r>
           </w:p>
         </w:tc>
@@ -4228,7 +4447,7 @@
               <w:pStyle w:val="TableText"/>
             </w:pPr>
             <w:r>
-              <w:t>cpu /​ 4</w:t>
+              <w:t>Tải CPU / 4</w:t>
             </w:r>
           </w:p>
         </w:tc>
@@ -4287,32 +4506,15 @@
       </w:tr>
     </w:tbl>
     <w:p>
-      <w:pPr>
-        <w:pStyle w:val="Source"/>
-      </w:pPr>
-      <w:r>
-        <w:t>Nguồn: results/​2026-10-11_​inference_​baseline/​SUMMARY.md; idle_​r</w:t>
-      </w:r>
-      <w:r>
-        <w:rPr>
-          <w:i/>
-        </w:rPr>
-        <w:t>/​threads-N/​ và cpu23_​r</w:t>
-      </w:r>
-      <w:r>
-        <w:t>/​threads-N/​. Mỗi run có 1000 lần gọi được tính giờ sau 50 lần warm-up.</w:t>
-      </w:r>
-    </w:p>
-    <w:p>
-      <w:r>
-        <w:t>Bảng 4 cho thấy thêm luồng không bảo đảm tốt hơn khi có tải. Các ô có số lặp khác nhau vì loại nguồn điện, nên không được chọn cực trị thuận lợi rồi kết luận cấu hình tối ưu. Tiền xử lý được ghi riêng trong nguồn; số ở đây không đại diện toàn bộ thời gian từ sinh đầu vào đến đầu ra MCU.</w:t>
+      <w:r>
+        <w:t>Mỗi lượt ở Bảng 4 tính giờ 1000 lần gọi sau 50 lần chạy làm nóng. Khi nhàn rỗi, P50 giảm từ 44.0 ms với 1 luồng xuống 29.4 ms với 3 luồng, cho thấy thêm luồng có thể giúp lời gọi mô hình hoàn tất sớm hơn. Dưới tải CPU, hàng 4 luồng lại có P50 là 60.3 ms, cao hơn 45.1 ms của hàng 1 luồng. Vì lợi ích phụ thuộc tranh chấp và số lượt hợp lệ cũng khác nhau, nhóm tách tiền xử lý khỏi lời gọi mô hình để tránh gộp các phần công việc vào cùng kết luận.</w:t>
       </w:r>
     </w:p>
     <w:p>
       <w:pPr>
         <w:pStyle w:val="Heading2"/>
       </w:pPr>
-      <w:bookmarkStart w:id="21" w:name="_Toc243148453"/>
+      <w:bookmarkStart w:id="21" w:name="_Toc243150059"/>
       <w:r>
         <w:t>5.3 Tranh chấp, điều chỉnh và chính sách hàng đợi</w:t>
       </w:r>
@@ -4320,25 +4522,15 @@
     </w:p>
     <w:p>
       <w:r>
-        <w:rPr>
-          <w:b/>
-        </w:rPr>
-        <w:t>KẾT QUẢ SƠ BỘ — đã đo phần mềm/​PTY theo v1.</w:t>
-      </w:r>
-      <w:r>
-        <w:t xml:space="preserve"> Bảng 5 trả lời một phần RQ1–RQ3. Delivery tính từ đầu vào đến receiver trên Pi, không đến chân STM32. Mỗi ô có </w:t>
-      </w:r>
-      <w:r>
-        <w:lastRenderedPageBreak/>
-        <w:t>3 lần lặp. V2 không xác nhận được độ phủ monitor của cả chiến dịch; các số vẫn là quan sát lưu trữ có giới hạn đó.</w:t>
-      </w:r>
-    </w:p>
-    <w:p>
-      <w:pPr>
-        <w:pStyle w:val="Caption"/>
-      </w:pPr>
-      <w:r>
-        <w:t>Bảng 5. Kết quả sơ bộ E1/​E2/​E3: độ trễ và AoI, đơn vị ms; không phải phép đo UART vật lý.</w:t>
+        <w:t>Để so sánh tải, cấu hình và chính sách dữ liệu chờ ở Bảng 5, nhóm tính độ trễ từ lúc sinh đầu vào tới lúc tiến trình nhận trên Pi tiếp nhận kết quả qua thiết bị đầu cuối giả PTY. Mỗi ô có 3 lần lặp để khảo sát hàng đợi và tính toán trước UART vật lý. Vì thế, những thay đổi trong bảng phản ánh đường ống phần mềm, chưa phải hiệu năng liên kết thật giữa Pi và STM32.</w:t>
+      </w:r>
+    </w:p>
+    <w:p>
+      <w:pPr>
+        <w:pStyle w:val="TableCaption"/>
+      </w:pPr>
+      <w:r>
+        <w:t>Bảng 5. Kết quả sơ bộ E1/E2/E3: độ trễ và AoI, đơn vị ms; không phải phép đo UART vật lý.</w:t>
       </w:r>
     </w:p>
     <w:tbl>
@@ -4360,7 +4552,7 @@
           <w:bottom w:w="60" w:type="dxa"/>
           <w:right w:w="10" w:type="dxa"/>
         </w:tblCellMar>
-        <w:tblLook w:val="0000" w:firstRow="0" w:lastRow="0" w:firstColumn="0" w:lastColumn="0" w:noHBand="0" w:noVBand="0"/>
+        <w:tblLook w:val="04A0" w:firstRow="1" w:lastRow="0" w:firstColumn="1" w:lastColumn="0" w:noHBand="0" w:noVBand="1"/>
       </w:tblPr>
       <w:tblGrid>
         <w:gridCol w:w="3023"/>
@@ -4385,7 +4577,7 @@
               <w:rPr>
                 <w:b/>
               </w:rPr>
-              <w:t>Phép đo /​ điều kiện</w:t>
+              <w:t>Phép đo / điều kiện</w:t>
             </w:r>
           </w:p>
         </w:tc>
@@ -4402,7 +4594,7 @@
               <w:rPr>
                 <w:b/>
               </w:rPr>
-              <w:t>P50 delivery hoặc mean AoI</w:t>
+              <w:t>P50 chuyển giao / AoI trung bình (ms)</w:t>
             </w:r>
           </w:p>
         </w:tc>
@@ -4419,7 +4611,7 @@
               <w:rPr>
                 <w:b/>
               </w:rPr>
-              <w:t>P99 delivery hoặc peak AoI</w:t>
+              <w:t>P99 chuyển giao / AoI đỉnh (ms)</w:t>
             </w:r>
           </w:p>
         </w:tc>
@@ -4437,7 +4629,7 @@
               <w:pStyle w:val="TableText"/>
             </w:pPr>
             <w:r>
-              <w:t>E1 P0 idle: delivery</w:t>
+              <w:t>E1 P0 idle: chuyển giao</w:t>
             </w:r>
           </w:p>
         </w:tc>
@@ -4481,7 +4673,7 @@
               <w:pStyle w:val="TableText"/>
             </w:pPr>
             <w:r>
-              <w:t>E1 P0 memrate: delivery</w:t>
+              <w:t>E1 P0 memrate: chuyển giao</w:t>
             </w:r>
           </w:p>
         </w:tc>
@@ -4525,7 +4717,7 @@
               <w:pStyle w:val="TableText"/>
             </w:pPr>
             <w:r>
-              <w:t>E2 P0 cache: delivery</w:t>
+              <w:t>E2 P0 cache: chuyển giao</w:t>
             </w:r>
           </w:p>
         </w:tc>
@@ -4569,7 +4761,7 @@
               <w:pStyle w:val="TableText"/>
             </w:pPr>
             <w:r>
-              <w:t>E2 P1 cache: delivery</w:t>
+              <w:t>E2 P1 cache: chuyển giao</w:t>
             </w:r>
           </w:p>
         </w:tc>
@@ -4613,7 +4805,8 @@
               <w:pStyle w:val="TableText"/>
             </w:pPr>
             <w:r>
-              <w:t>E3 idle FIFO: mean /​ peak AoI</w:t>
+              <w:lastRenderedPageBreak/>
+              <w:t>E3 idle FIFO: AoI trung bình / đỉnh</w:t>
             </w:r>
           </w:p>
         </w:tc>
@@ -4657,7 +4850,7 @@
               <w:pStyle w:val="TableText"/>
             </w:pPr>
             <w:r>
-              <w:t>E3 idle latest: mean /​ peak AoI</w:t>
+              <w:t>E3 idle latest: AoI trung bình / đỉnh</w:t>
             </w:r>
           </w:p>
         </w:tc>
@@ -4701,7 +4894,7 @@
               <w:pStyle w:val="TableText"/>
             </w:pPr>
             <w:r>
-              <w:t>E3 memrate FIFO: mean /​ peak AoI</w:t>
+              <w:t>E3 memrate FIFO: AoI trung bình / đỉnh</w:t>
             </w:r>
           </w:p>
         </w:tc>
@@ -4745,7 +4938,7 @@
               <w:pStyle w:val="TableText"/>
             </w:pPr>
             <w:r>
-              <w:t>E3 memrate latest: mean /​ peak AoI</w:t>
+              <w:t>E3 memrate latest: AoI trung bình / đỉnh</w:t>
             </w:r>
           </w:p>
         </w:tc>
@@ -4778,79 +4971,53 @@
       </w:tr>
     </w:tbl>
     <w:p>
-      <w:pPr>
-        <w:pStyle w:val="Source"/>
-      </w:pPr>
-      <w:r>
-        <w:t>Nguồn: results/​2026-10-11_​e1_​e2_​e3_​pty/​20261008T103412Z_​e_​onnx/​summary/​E1_​table.csv, E2_​table.csv, E3_​table.csv và README.md; run E1_​P0_​</w:t>
-      </w:r>
-      <w:r>
-        <w:rPr>
-          <w:i/>
-        </w:rPr>
-        <w:t>, E2_P0_</w:t>
-      </w:r>
-      <w:r>
-        <w:t>, E2_P1_</w:t>
-      </w:r>
-      <w:r>
-        <w:rPr>
-          <w:i/>
-        </w:rPr>
-        <w:t>, E3_P1_</w:t>
-      </w:r>
-      <w:r>
-        <w:t>.</w:t>
-      </w:r>
-    </w:p>
-    <w:p>
-      <w:r>
-        <w:t>Thời gian phục vụ tăng nhiều dưới memrate, trong khi thay kết quả ở bridge không giảm được tuổi. Bộ đếm thay thế tại bridge trong các hàng E3 trên đều bằng 0 trong bảng tổng hợp E3. Diễn giải hợp lý là công việc chờ trước suy luận; cần kiểm tra dấu thời gian từng giai đoạn trước khi gọi đó là suy luận chậm. So sánh cache E2 còn không cho thấy cải thiện chung của P1, nên không chọn lọc chỉ điều kiện thuận lợi.</w:t>
-      </w:r>
-    </w:p>
-    <w:p>
-      <w:r>
-        <w:t>Mean AoI trong nguồn dùng thời gian đã khởi tạo, có khoảng ngừng và đuôi cuối; trước cập nhật có ích đầu tiên, tuổi chưa xác định. Tỷ lệ vi phạm thời gian cần mẫu số là thời lượng, còn số gói lỡ hạn cần mẫu số là số lần nhận. Không hoán đổi hai loại để làm kết quả có vẻ tốt hơn. Latest-value hy sinh một phần dữ liệu chờ; cần báo cả số sinh, giao, mất và bị thay.</w:t>
-      </w:r>
-    </w:p>
-    <w:p>
+      <w:r>
+        <w:t>Trong Bảng 5, P50 chuyển giao E1 P0 tăng từ 44.37 ms khi idle lên 6626 ms dưới memrate. Ở E3 memrate, AoI trung bình của latest là 6958 ms, trong khi FIFO là 6660 ms; thay kết quả tại bridge chưa làm tuổi giảm. Bộ đếm thay thế tại bridge của các hàng E3 đều bằng 0 trong bảng tổng hợp, gợi ý dữ liệu đang chờ trước suy luận. Nhóm vì vậy đối chiếu từng giai đoạn trước khi quy nguyên nhân cho suy luận chậm, đồng thời giữ kết quả cache E2 vì P1 cũng chưa cải thiện chung.</w:t>
+      </w:r>
+    </w:p>
+    <w:p>
+      <w:r>
+        <w:t>Vì tuổi chưa xác định trước cập nhật có ích đầu tiên, nhóm tính AoI trung bình trên phần thời gian đã khởi tạo, giữ cả khoảng ngừng cập nhật và đuôi cuối cửa sổ. Nếu xét tỷ lệ thời gian vi phạm, mẫu số phải là thời lượng; nếu đếm gói lỡ hạn, mẫu số lại là số lần nhận. Hai mẫu số mang ý nghĩa khác nhau. Cách chọn phụ thuộc việc đánh giá thời gian dùng dữ liệu cũ hay số gói tới MCU quá hạn. Với latest-value, nhóm còn phải báo số sinh, giao, mất và bị thay, vì tuổi tốt hơn có thể đi cùng việc bỏ bớt dữ liệu ch</w:t>
+      </w:r>
+      <w:r>
+        <w:t>ờ.</w:t>
+      </w:r>
+    </w:p>
+    <w:p>
+      <w:r>
+        <w:t>Từ kết quả trên, nhóm chuyển điểm loại dữ liệu chờ lên trước suy luận trong thí nghiệm đầu vào mới nhất E3b. Lý do là tuổi đã tích lũy trước khi MobileNetV2 bắt đầu chạy, nên bridge không thể lấy lại khoảng thời gian ấy dù kết quả được gửi ngay sau khi tính xong. Tuy vậy, thay vị trí hàng đợi mới chỉ là hướng kiểm tra tiếp, chưa đủ để chốt mức cải thiện. Các lượt được chấp nhận và các lượt bị loại của E3b vẫn được tách theo Bảng 2.</w:t>
+      </w:r>
+    </w:p>
+    <w:p>
+      <w:pPr>
+        <w:pStyle w:val="Heading2"/>
+      </w:pPr>
+      <w:bookmarkStart w:id="22" w:name="_Toc243150060"/>
+      <w:r>
+        <w:t>5.4 Liên kết thật, lỗi và đối chiếu đầu ra</w:t>
+      </w:r>
+      <w:bookmarkEnd w:id="22"/>
+    </w:p>
+    <w:p>
+      <w:r>
+        <w:t xml:space="preserve">Đợt E3 đầu trên UART vật lý có 0/18 lượt đủ điều kiện so sánh; 16/18 lượt xuất hiện cảnh báo nguồn và mọi lượt tải bộ nhớ đều có sai lệch khớp đồng hồ vượt </w:t>
+      </w:r>
       <w:r>
         <w:lastRenderedPageBreak/>
-        <w:t>Tập E3b cho quan sát chẩn đoán ủng hộ thay đầu vào trước suy luận. Tuy nhiên, toàn bộ lượt có tải bị INVALID vì điện áp thấp trực tiếp; chúng không tạo thành bằng chứng nhân quả sạch. Cần lặp lại sau khi khắc phục nguồn, thay vì dùng độ cải thiện quan sát được làm bảo đảm thiết kế.</w:t>
-      </w:r>
-    </w:p>
-    <w:p>
-      <w:pPr>
-        <w:pStyle w:val="Heading2"/>
-      </w:pPr>
-      <w:bookmarkStart w:id="22" w:name="_Toc243148454"/>
-      <w:r>
-        <w:t>5.4 Liên kết thật, lỗi và đối chiếu đầu ra</w:t>
-      </w:r>
-      <w:bookmarkEnd w:id="22"/>
-    </w:p>
-    <w:p>
-      <w:r>
-        <w:rPr>
-          <w:b/>
-        </w:rPr>
-        <w:t>KẾT QUẢ SƠ BỘ.</w:t>
-      </w:r>
-      <w:r>
-        <w:t xml:space="preserve"> Phải tách E3 UART ban đầu khỏi lần rerun của deck cuối. Tập ban đầu có 0/​18 lượt hợp lệ; 16/​18 có cờ nguồn và mọi lượt memrate có clock fit quá ngưỡng. Deck cuối ghi lần rerun cũng 18 lượt, tất cả có điện áp thấp trực tiếp. Với latest/​latest có tải, r1 ở FAILSAFE toàn cửa sổ; r2/​r3 ở HOLD lần lượt 92.15% và 91.44%. Đây là quan sát FLAGGED, không được bỏ r1 hoặc coi là so sánh sạch.</w:t>
-      </w:r>
-    </w:p>
-    <w:p>
-      <w:r>
-        <w:t>Bảng 6 tách mốc heartbeat khỏi mốc inference để tránh so các khoảng khác nghĩa.</w:t>
-      </w:r>
-    </w:p>
-    <w:p>
-      <w:pPr>
-        <w:pStyle w:val="Caption"/>
-      </w:pPr>
-      <w:r>
-        <w:t>Bảng 6. Kết quả sơ bộ E4/​F5, đã đo: P50 và max thời gian MCU đến FAILSAFE, ms; mốc theo nguyên nhân.</w:t>
+        <w:t>ngưỡng. Trong 18 lượt đo lại, sụt áp vẫn xuất hiện ở tất cả các lượt; khi giữ dữ liệu mới nhất ở cả đầu vào lẫn bridge dưới tải, lượt đầu còn ở FAILSAFE suốt cửa sổ. Các lượt tiếp theo ở HOLD lần lượt 92.15% và 91.44%, cho thấy cần xem diễn biến trạng thái thay vì chỉ đếm kết quả nhận được. Nhóm giữ các lượt để chẩn đoán, chưa so sánh hiệu năng.</w:t>
+      </w:r>
+    </w:p>
+    <w:p>
+      <w:r>
+        <w:t>Vì FAILSAFE có nhiều nguyên nhân, Bảng 6 tách mốc heartbeat và inference; cụ thể, F1 và F2 đo từ heartbeat cuối để phản ánh việc bridge dừng gửi. F3 và F5 đo từ inference cuối để theo dõi kết quả không được cập nhật. Khi so thời gian giữa các hàng, nhóm phải đọc cột mốc tham chiếu trước, bởi bỏ qua cột này sẽ dễ nhầm mất liveness với kết quả vẫn được nhận nhưng đã cũ.</w:t>
+      </w:r>
+    </w:p>
+    <w:p>
+      <w:pPr>
+        <w:pStyle w:val="TableCaption"/>
+      </w:pPr>
+      <w:r>
+        <w:t>Bảng 6. Thời gian MCU chuyển sang FAILSAFE theo nguyên nhân lỗi, đơn vị ms.</w:t>
       </w:r>
     </w:p>
     <w:tbl>
@@ -4872,7 +5039,7 @@
           <w:bottom w:w="60" w:type="dxa"/>
           <w:right w:w="10" w:type="dxa"/>
         </w:tblCellMar>
-        <w:tblLook w:val="0000" w:firstRow="0" w:lastRow="0" w:firstColumn="0" w:lastColumn="0" w:noHBand="0" w:noVBand="0"/>
+        <w:tblLook w:val="04A0" w:firstRow="1" w:lastRow="0" w:firstColumn="1" w:lastColumn="0" w:noHBand="0" w:noVBand="1"/>
       </w:tblPr>
       <w:tblGrid>
         <w:gridCol w:w="1815"/>
@@ -4916,7 +5083,7 @@
               <w:rPr>
                 <w:b/>
               </w:rPr>
-              <w:t>Run chấp nhận</w:t>
+              <w:t>Lượt chấp nhận</w:t>
             </w:r>
           </w:p>
         </w:tc>
@@ -4967,7 +5134,7 @@
               <w:rPr>
                 <w:b/>
               </w:rPr>
-              <w:t>Max</w:t>
+              <w:t>Lớn nhất</w:t>
             </w:r>
           </w:p>
         </w:tc>
@@ -4985,7 +5152,7 @@
               <w:pStyle w:val="TableText"/>
             </w:pPr>
             <w:r>
-              <w:t>F1 kill bridge</w:t>
+              <w:t>F1 kết thúc bridge</w:t>
             </w:r>
           </w:p>
         </w:tc>
@@ -4998,7 +5165,7 @@
               <w:pStyle w:val="TableText"/>
             </w:pPr>
             <w:r>
-              <w:t>5/​5</w:t>
+              <w:t>5/5</w:t>
             </w:r>
           </w:p>
         </w:tc>
@@ -5068,7 +5235,7 @@
               <w:pStyle w:val="TableText"/>
             </w:pPr>
             <w:r>
-              <w:t>5/​5</w:t>
+              <w:t>5/5</w:t>
             </w:r>
           </w:p>
         </w:tc>
@@ -5138,7 +5305,7 @@
               <w:pStyle w:val="TableText"/>
             </w:pPr>
             <w:r>
-              <w:t>5/​5</w:t>
+              <w:t>5/5</w:t>
             </w:r>
           </w:p>
         </w:tc>
@@ -5208,7 +5375,7 @@
               <w:pStyle w:val="TableText"/>
             </w:pPr>
             <w:r>
-              <w:t>5/​5</w:t>
+              <w:t>5/5</w:t>
             </w:r>
           </w:p>
         </w:tc>
@@ -5254,43 +5421,29 @@
       </w:tr>
     </w:tbl>
     <w:p>
-      <w:pPr>
-        <w:pStyle w:val="Source"/>
-      </w:pPr>
-      <w:r>
-        <w:t>Nguồn: hồ sơ đánh giá theo nguyên nhân; results/​2026-10-12_​e4_​faults/​20261012T093526Z_​e4/​F</w:t>
-      </w:r>
-      <w:r>
-        <w:rPr>
-          <w:i/>
-        </w:rPr>
-        <w:t>/​pipeline/​state_​events.csv; results/​2026-10-12_​f5_​stale/​20261012T101949Z_​f5/​r</w:t>
-      </w:r>
-      <w:r>
-        <w:t>/​F5-r01/​pipeline/​state_​events.csv.</w:t>
-      </w:r>
-    </w:p>
-    <w:p>
-      <w:r>
-        <w:t>Ngưỡng cấu hình heartbeat 100 ms, HOLD tuổi nguồn 200 ms và FAILSAFE tuổi nguồn 500 ms là dự kiến/​chưa hiệu chuẩn theo hồ sơ đánh giá. Khoảng sau receipt ngắn hơn ngưỡng tuổi nguồn vì còn tuổi lúc gửi và khoản transit giả định 5 ms. HOLD theo lý do tuổi nguồn không phải heartbeat timeout sớm.</w:t>
-      </w:r>
-    </w:p>
-    <w:p>
-      <w:r>
-        <w:t xml:space="preserve">Bản trình bày cuối, trang 97, và tập capture logic analyzer ghi kết quả sơ bộ marker→GPIO an toàn: F1 86.938–95.541 ms, F2 86.947–98.676 ms, F4 82.852–91.302 ms; F2 gồm check capture. Có 10/​15 capture khớp mốc heartbeat trong 0.07 ms; 5 capture còn lại có khung khác đến sau heartbeat. Bảng CSV cũ còn nhãn </w:t>
+      <w:r>
+        <w:t>Nhóm đặt ngưỡng heartbeat 100 ms, HOLD tuổi nguồn 200 ms và FAILSAFE tuổi nguồn 500 ms để thử phản ứng giám sát. Ở Bảng 6, P50 của F5 là 475.596 ms dù ngưỡng FAILSAFE tuổi nguồn lớn hơn khoảng sau lần nhận cuối. Vì kết quả đã có tuổi lúc gửi và phép ước lượng còn cộng khoản truyền giả định 5 ms, khoảng sau lần nhận cuối không dùng chung mốc bắt đầu với tuổi nguồn. HOLD chưa phải heartbeat timeout. Tuổi nguồn có thể vượt ngưỡng trong khi bản tin heartbeat vẫn đến, nên cần đọc đúng nguyên nhân chuyển trạng th</w:t>
+      </w:r>
+      <w:r>
+        <w:t>ái.</w:t>
+      </w:r>
+    </w:p>
+    <w:p>
+      <w:r>
+        <w:t xml:space="preserve">Nhóm dùng bộ phân tích logic đo từ dấu lỗi tới cạnh GPIO an toàn để đối chiếu log. Khoảng quan sát là 86.938–95.541 ms ở F1, 86.947–98.676 ms ở F2 và 82.852–91.302 ms ở F4; F2 có cả lượt bắt tín hiệu kiểm tra. Trong các lần bắt, 10/15 lần khớp mốc heartbeat trong 0.07 ms, còn 5 lần khác có một khung tới sau heartbeat nên byte </w:t>
       </w:r>
       <w:r>
         <w:lastRenderedPageBreak/>
-        <w:t>UNVERIFIED ON HARDWARE; bộ dữ liệu không được nâng thành hợp lệ toàn cục. Đây là chỉ thị GPIO và cực trị quan sát, chưa phải thời gian cơ cấu chấp hành hay WCET.</w:t>
+        <w:t>cuối trên dây không phải heartbeat cuối được MCU chấp nhận. Hai mốc giải thích chênh lệch thời gian của cùng lần lỗi.</w:t>
       </w:r>
     </w:p>
     <w:p>
       <w:pPr>
         <w:pStyle w:val="Heading1"/>
       </w:pPr>
-      <w:bookmarkStart w:id="23" w:name="_Toc243148455"/>
-      <w:r>
-        <w:t>6 Thảo luận và hạn chế</w:t>
+      <w:bookmarkStart w:id="23" w:name="_Toc243150061"/>
+      <w:r>
+        <w:t>CHƯƠNG 6. THẢO LUẬN VÀ HẠN CHẾ</w:t>
       </w:r>
       <w:bookmarkEnd w:id="23"/>
     </w:p>
@@ -5298,7 +5451,7 @@
       <w:pPr>
         <w:pStyle w:val="Heading2"/>
       </w:pPr>
-      <w:bookmarkStart w:id="24" w:name="_Toc243148456"/>
+      <w:bookmarkStart w:id="24" w:name="_Toc243150062"/>
       <w:r>
         <w:t>6.1 Câu trả lời trong phạm vi bằng chứng</w:t>
       </w:r>
@@ -5306,19 +5459,17 @@
     </w:p>
     <w:p>
       <w:r>
-        <w:t>RQ1 nhận được kết quả sơ bộ về đuôi trễ và thời gian phục vụ tăng dưới tải, đặc biệt tải nhớ. RQ2 cho thấy ưu tiên giúp một phần đường đánh thức nhưng không cô lập toàn bộ tài nguyên; P1 không cải thiện mọi ô pipeline. Không thể tách hiệu quả riêng của khóa bộ nhớ, affinity và ưu tiên từ một hồ sơ đổi đồng thời các cơ chế. Cần thí nghiệm loại trừ từng yếu tố để lập luận nhân quả.</w:t>
-      </w:r>
-    </w:p>
-    <w:p>
-      <w:r>
-        <w:t>RQ3 gợi ý vị trí hàng đợi quan trọng hơn tên chính sách tại bridge. Thay dữ liệu chờ trước công việc đắt đỏ có ý nghĩa khác thay kết quả đã tính xong. Các lượt rerun có nguồn điện lỗi chỉ hỗ trợ chẩn đoán, chưa chốt mức cải thiện. RQ4 có bằng chứng chuyển trạng thái MCU và capture GPIO độc lập, nhưng không biến timeout danh định thành cận trên phản ứng trong mọi tình huống.</w:t>
+        <w:t>Kết quả sơ bộ cho RQ1 ghi nhận đuôi trễ và thời gian phục vụ tăng dưới tải nhớ, trong khi RQ2 cho thấy ưu tiên giúp đánh thức nhưng chưa cô lập mọi tài nguyên của pipeline. P1 không cải thiện mọi ô đo. Vì khóa bộ nhớ, affinity và ưu tiên đổi cùng lúc, chúng em cần thử loại trừ từng yếu tố để tách hiệu quả riêng trước khi xác định nguyên nhân. Với RQ3, vị trí chờ quan trọng hơn tên FIFO hay latest-value tại bridge, bởi bỏ đầu vào cũ trước công việc tính toán tốn thời gian khác với bỏ kết quả đã tính xong. Mặ</w:t>
+      </w:r>
+      <w:r>
+        <w:t>c dù các lượt đo lại có lỗi nguồn chưa xác nhận được mức cải thiện, ở RQ4 nhóm đã có log chuyển trạng thái MCU và tín hiệu GPIO để đối chiếu độc lập. Dù vậy, timeout danh định chưa thể được coi là cận trên phản ứng trong mọi tình huống.</w:t>
       </w:r>
     </w:p>
     <w:p>
       <w:pPr>
         <w:pStyle w:val="Heading2"/>
       </w:pPr>
-      <w:bookmarkStart w:id="25" w:name="_Toc243148457"/>
+      <w:bookmarkStart w:id="25" w:name="_Toc243150063"/>
       <w:r>
         <w:t>6.2 Độ tin cậy và khả năng khái quát</w:t>
       </w:r>
@@ -5326,27 +5477,30 @@
     </w:p>
     <w:p>
       <w:r>
-        <w:t>Điện áp thấp là yếu tố nhiễu chính, cùng nhiệt, governor và số luồng. Kiểm tra nguồn theo chu kỳ có thể bỏ lỡ nhiễu ngắn giữa mẫu. Sticky bit có sẵn và live bit phát sinh trong run có nghĩa khác nhau; không được đổi quy tắc loại trừ hồi tố mà không công bố. Tập ít lần lặp chưa mô tả chắc chắn đuôi hiếm; hàng nghìn mẫu liên tiếp cũng có thể tương quan.</w:t>
-      </w:r>
-    </w:p>
-    <w:p>
-      <w:r>
-        <w:t>Thời gian ánh xạ giữa đồng hồ phụ thuộc echo và độ mới của fit. FIFO hog có thể làm đói chính bridge đang phục vụ phép đo, gây khó quan sát trong lúc fault. Khi thiếu STATE_EVENT, không mặc định trạng thái luôn FRESH và không tái dựng tỷ lệ chiếm trạng thái tùy ý. Cần phân biệt run không mở được cửa sổ đo với cửa sổ hợp lệ có thời lượng không ở FRESH.</w:t>
-      </w:r>
-    </w:p>
-    <w:p>
-      <w:r>
-        <w:t>Các hình tái sử dụng là minh họa khái niệm có giới hạn đã ghi trong hồ sơ minh họa; chúng không phải ảnh rig, sơ đồ dây đã xác nhận hay đồ thị dữ liệu. Bằng chứng hiện tại không xác nhận an toàn robot, biên độ stack dài hạn, độ tin cậy DMA không giới hạn hay watchdog độc lập. Một GPIO thấp chỉ là quy ước của demo. Nếu bộ điều khiển thực cần duy trì cân bằng, tắt toàn bộ động cơ có thể không phải hành vi an toàn.</w:t>
+        <w:t>Sụt áp là nhiễu chính dưới tải, nên một số lượt chỉ để tham khảo cùng nhiệt độ, chế độ tần số và số luồng. Với cyclictest, phần có tải còn thiếu xác nhận tiến trình tạo tải hoạt động liên tục; các lượt pipeline lại thiếu độ phủ theo dõi toàn cửa sổ. Qua kiểm tra ban đầu chưa đủ khẳng định nhân quả; số lần lặp suy luận khác nhau do loại lượt lỗi nguồn. Theo dõi điện áp định kỳ vẫn có thể bỏ lỡ nhiễu ngắn giữa các mẫu, trong khi cờ nguồn lưu từ trước phải được tách khỏi cảnh báo xảy ra ngay trong lượt. Đuôi h</w:t>
+      </w:r>
+      <w:r>
+        <w:t>iếm cần nhiều lần lặp hơn. Hàng nghìn mẫu liên tiếp vẫn có thể tương quan, nên số mẫu lớn chưa thay được số lần chạy độc lập.</w:t>
+      </w:r>
+    </w:p>
+    <w:p>
+      <w:r>
+        <w:t>Vì ánh xạ đồng hồ phụ thuộc trao đổi echo và độ mới của phép khớp, một tác vụ chiếm CPU theo FIFO lúc tiêm lỗi có thể khiến bridge bị đói CPU và chính đường quan sát cũng gián đoạn. Thiếu STATE_EVENT không có nghĩa MCU luôn FRESH; nhóm không tự điền tỷ lệ thời gian.</w:t>
+      </w:r>
+    </w:p>
+    <w:p>
+      <w:r>
+        <w:t>Các hình minh họa độ tươi, khung truyền và hàng đợi, chưa thay sơ đồ đấu dây hay đồ thị thực nghiệm. Bằng chứng hiện có cũng chưa xác nhận an toàn robot, biên độ stack dài hạn, độ tin cậy DMA không giới hạn hay watchdog độc lập. GPIO thấp chỉ là quy ước đầu ra của demo, bởi với robot cần giữ cân bằng, tắt toàn bộ động cơ có thể khiến hệ thống mất ổn định thay vì an toàn hơn. Vì vậy, nhóm chỉ diễn giải phản ứng đã quan sát trong phạm vi đầu ra mô phỏng.</w:t>
       </w:r>
     </w:p>
     <w:p>
       <w:pPr>
         <w:pStyle w:val="Heading1"/>
       </w:pPr>
-      <w:bookmarkStart w:id="26" w:name="_Toc243148458"/>
+      <w:bookmarkStart w:id="26" w:name="_Toc243150064"/>
       <w:r>
         <w:lastRenderedPageBreak/>
-        <w:t>7 Hướng phát triển</w:t>
+        <w:t>CHƯƠNG 7. HƯỚNG PHÁT TRIỂN</w:t>
       </w:r>
       <w:bookmarkEnd w:id="26"/>
     </w:p>
@@ -5354,23 +5508,23 @@
       <w:pPr>
         <w:pStyle w:val="Heading2"/>
       </w:pPr>
-      <w:bookmarkStart w:id="27" w:name="_Toc243148459"/>
-      <w:r>
-        <w:t>7.1 Lộ trình A–F và cổng nghiệm thu</w:t>
+      <w:bookmarkStart w:id="27" w:name="_Toc243150065"/>
+      <w:r>
+        <w:t>7.1 Lộ trình hoàn thiện hệ thống</w:t>
       </w:r>
       <w:bookmarkEnd w:id="27"/>
     </w:p>
     <w:p>
       <w:r>
-        <w:t>Bảng 7 chuyển lộ trình trong tài liệu thành thứ tự công việc có sản phẩm kiểm chứng. Một số thành phần đã có hiện thực hoặc kết quả sơ bộ, nhưng từng giai đoạn chỉ kết thúc khi đủ bằng chứng theo phạm vi.</w:t>
-      </w:r>
-    </w:p>
-    <w:p>
-      <w:pPr>
-        <w:pStyle w:val="Caption"/>
-      </w:pPr>
-      <w:r>
-        <w:t>Bảng 7. Lộ trình dự kiến A–F theo lộ trình của nhóm.</w:t>
+        <w:t>Theo Bảng 7, công việc được sắp xếp theo bằng chứng cần hoàn thành: giai đoạn A tập trung khả năng tái lập phần mềm, còn B đòi hỏi xác nhận vật lý trên bo mạch. C chỉ có thể chốt phân tích OS khi phép đo và bất định đã được kiểm tra. D/E chuyển sang robot nên cần thêm điều kiện về giao tiếp và quyền tác động.</w:t>
+      </w:r>
+    </w:p>
+    <w:p>
+      <w:pPr>
+        <w:pStyle w:val="TableCaption"/>
+      </w:pPr>
+      <w:r>
+        <w:t>Bảng 7. Các giai đoạn hoàn thiện và hướng mở rộng.</w:t>
       </w:r>
     </w:p>
     <w:tbl>
@@ -5392,7 +5546,7 @@
           <w:bottom w:w="60" w:type="dxa"/>
           <w:right w:w="10" w:type="dxa"/>
         </w:tblCellMar>
-        <w:tblLook w:val="0000" w:firstRow="0" w:lastRow="0" w:firstColumn="0" w:lastColumn="0" w:noHBand="0" w:noVBand="0"/>
+        <w:tblLook w:val="04A0" w:firstRow="1" w:lastRow="0" w:firstColumn="1" w:lastColumn="0" w:noHBand="0" w:noVBand="1"/>
       </w:tblPr>
       <w:tblGrid>
         <w:gridCol w:w="4535"/>
@@ -5433,7 +5587,7 @@
               <w:rPr>
                 <w:b/>
               </w:rPr>
-              <w:t>Sản phẩm và cổng bằng chứng</w:t>
+              <w:t>Sản phẩm và điều kiện hoàn thành</w:t>
             </w:r>
           </w:p>
         </w:tc>
@@ -5464,7 +5618,7 @@
               <w:pStyle w:val="TableText"/>
             </w:pPr>
             <w:r>
-              <w:t>Pipeline, MCU ảo, hồ sơ và log; lặp hợp lệ, tái lập từ cấu hình</w:t>
+              <w:t>Pipeline, MCU ảo, cấu hình và log; lặp hợp lệ, tái lập từ cấu hình</w:t>
             </w:r>
           </w:p>
         </w:tc>
@@ -5526,7 +5680,7 @@
               <w:pStyle w:val="TableText"/>
             </w:pPr>
             <w:r>
-              <w:t>E1–E4 trên rig, phân tích bất định, báo cáo và demo</w:t>
+              <w:t>E1–E4 trên hệ thống thử nghiệm, phân tích bất định, báo cáo và demo</w:t>
             </w:r>
           </w:p>
         </w:tc>
@@ -5544,7 +5698,7 @@
               <w:pStyle w:val="TableText"/>
             </w:pPr>
             <w:r>
-              <w:t>D — shadow WBR</w:t>
+              <w:t>D — quan sát robot WBR</w:t>
             </w:r>
           </w:p>
         </w:tc>
@@ -5557,7 +5711,7 @@
               <w:pStyle w:val="TableText"/>
             </w:pPr>
             <w:r>
-              <w:t>Hợp đồng thật, port và log; chưa cấp quyền tác động</w:t>
+              <w:t>Hợp đồng thật, chuyển nền tảng và nhật ký; chưa cấp quyền tác động</w:t>
             </w:r>
           </w:p>
         </w:tc>
@@ -5588,7 +5742,7 @@
               <w:pStyle w:val="TableText"/>
             </w:pPr>
             <w:r>
-              <w:t>Fallback địa phương và thử lỗi có người giám sát</w:t>
+              <w:t>Xử lý dự phòng tại chỗ và thử lỗi có người giám sát</w:t>
             </w:r>
           </w:p>
         </w:tc>
@@ -5619,7 +5773,7 @@
               <w:pStyle w:val="TableText"/>
             </w:pPr>
             <w:r>
-              <w:t>Rà soát tính mới, nguồn sơ cấp và artifact tái lập</w:t>
+              <w:t>Rà soát tính mới, nguồn sơ cấp và tài liệu và dữ liệu tái lập</w:t>
             </w:r>
           </w:p>
         </w:tc>
@@ -5627,66 +5781,59 @@
     </w:tbl>
     <w:p>
       <w:r>
-        <w:t>Ưu tiên gần là khắc phục nguồn, lặp điều kiện bằng quy tắc hợp lệ mới và lưu monitor đầy đủ. Cần khóa ngưỡng trước khi so sánh cuối, giữ thứ tự điều kiện cân bằng, định nghĩa rõ warm-up và cửa sổ. Số lần lặp hợp lệ mục tiêu trong roadmap là ít nhất 5 mỗi điều kiện; các ô có 3 lần lặp hiện tại vẫn là kết quả sơ bộ, không đổi mục tiêu để khớp dữ liệu sẵn có.</w:t>
-      </w:r>
-    </w:p>
-    <w:p>
-      <w:r>
-        <w:t>Ở B/​C, cần kiểm tra các kênh thời gian trên cùng thiết bị quan sát, tách fault onset, quyết định và GPIO. Lặp E3 với nguồn sạch giúp xác định latest-value còn giới hạn ở đâu. Bộ log phải lưu đủ trạng thái ban đầu, sự kiện mất và kết thúc cửa sổ để tái dựng occupancy. Các ca khởi động thất bại và không cải thiện phải ở trong manifest, không chỉ giữ run thuận lợi.</w:t>
-      </w:r>
-    </w:p>
-    <w:p>
-      <w:r>
-        <w:t xml:space="preserve">D/​E là hướng tương lai, đòi hỏi hợp đồng giao tiếp và điều khiển của robot thực. Phương pháp tách liveness/​freshness có thể tái dùng, nhưng thời hạn, ngưỡng và trạng </w:t>
+        <w:t>Trước mắt, nhóm cần khắc phục nguồn cấp rồi đo lại theo quy tắc hợp lệ mới, đồng thời lưu đầy đủ dữ liệu theo dõi. Để tránh điều chỉnh theo kết quả đã thấy, nhóm phải khóa ngưỡng trước khi so sánh cuối, đồng thời cân bằng thứ tự điều kiện và định nghĩa rõ phần làm nóng cùng cửa sổ đo. Vì mục tiêu vẫn là ít nhất 5 lần lặp hợp lệ mỗi điều kiện, các ô hiện có 3 lần lặp tiếp tục được gọi là kết quả sơ bộ thay vì hạ mục tiêu để khớp dữ liệu sẵn có.</w:t>
+      </w:r>
+    </w:p>
+    <w:p>
+      <w:r>
+        <w:t xml:space="preserve">Ở B/C, nhóm sẽ đối chiếu các kênh thời gian trên cùng thiết bị quan sát để tách lúc lỗi bắt đầu, lúc supervisor quyết định và lúc GPIO đổi mức. Để kiểm tra giới hạn còn lại của latest-value, E3 cần được đo lại với nguồn ổn định và log có đủ trạng thái </w:t>
       </w:r>
       <w:r>
         <w:lastRenderedPageBreak/>
-        <w:t>thái an toàn phải đo lại. F có thể phát triển từ kết quả OS của C sau rà soát tính mới; không cần chờ robot để hoàn thành học phần. Sự chấp nhận bài báo hoặc tính tương thích WBR hiện vẫn chưa biết.</w:t>
+        <w:t>đầu, sự kiện mất cùng phần cuối cửa sổ. Các ca thất bại vẫn được ghi lại. Ca khởi động lỗi và không cải thiện giúp nhóm nhận ra giới hạn hệ thống.</w:t>
+      </w:r>
+    </w:p>
+    <w:p>
+      <w:r>
+        <w:t>D/E cần hợp đồng giao tiếp và điều khiển robot trước khi cấp quyền tác động. Cách tách liveness khỏi freshness có thể tái dùng, nhưng thời hạn, ngưỡng và trạng thái an toàn phải đo lại theo đối tượng thật. Việc hoàn thành học phần không phụ thuộc tích hợp robot; giai đoạn F có thể phát triển từ kết quả OS ở C sau rà soát tính mới, nhưng khả năng tương thích WBR và việc bài báo được chấp nhận vẫn chưa biết.</w:t>
       </w:r>
     </w:p>
     <w:p>
       <w:pPr>
         <w:pStyle w:val="Heading1"/>
       </w:pPr>
-      <w:bookmarkStart w:id="28" w:name="_Toc243148460"/>
-      <w:r>
-        <w:t>8 Kết luận</w:t>
+      <w:bookmarkStart w:id="28" w:name="_Toc243150066"/>
+      <w:r>
+        <w:t>CHƯƠNG 8. KẾT LUẬN</w:t>
       </w:r>
       <w:bookmarkEnd w:id="28"/>
     </w:p>
     <w:p>
       <w:r>
-        <w:t>Nền tảng thực thi Edge-AI không đồng nhất đang trong quá trình triển khai đã tạo được một trường hợp học tập về tương tác giữa Linux và FreeRTOS. Pi đảm nhận tính toán biến thiên, trong khi MCU kiểm tra điều kiện còn sống và độ tươi để quyết định đầu ra mô phỏng. Giá trị của cấu trúc này là làm rõ quyền điều khiển, điểm tích lũy tuổi và các miền đồng hồ thay vì chỉ trình diễn mô hình suy luận.</w:t>
-      </w:r>
-    </w:p>
-    <w:p>
-      <w:r>
-        <w:t>Kết quả sơ bộ cho thấy điều chỉnh ưu tiên không giải quyết mọi nguồn trễ. Đánh thức timer, thời gian tính toán, chờ đầu vào và chuyển giao cần được đo riêng. Tải bộ nhớ có thể làm hiệu quả của ưu tiên bị giới hạn; thêm luồng không luôn làm suy luận nhanh hơn. Chọn latest-value ở cuối đường ống cũng không khôi phục được tuổi đã mất trước suy luận. Những quan sát ấy giúp chuyển câu hỏi từ “chạy nhanh hơn bao nhiêu” sang “đường nào đang chờ và dữ liệu còn hữu ích hay không”.</w:t>
-      </w:r>
-    </w:p>
-    <w:p>
-      <w:r>
-        <w:t>Kết quả sơ bộ về lỗi hỗ trợ vai trò giám sát độc lập: heartbeat còn hoạt động không đủ để giữ kết quả cũ ở trạng thái hợp lệ. Cần chọn mốc đo theo lý do chuyển trạng thái, không theo tên lỗi được tiêm. Capture GPIO bổ sung góc nhìn độc lập cho log MCU, đồng thời làm lộ sự khác nhau giữa byte cuối trên dây và heartbeat cuối được chấp nhận. Chỉ so các khoảng có cùng mốc mới có ý nghĩa.</w:t>
-      </w:r>
-    </w:p>
-    <w:p>
-      <w:r>
-        <w:t>Giới hạn của báo cáo là chất lượng nguồn điện, số lần lặp, độ phủ log và sự không đồng nhất giữa quy tắc hợp lệ cũ với mới. Những lượt FLAGGED/​INVALID được giữ lại để hỗ trợ chẩn đoán, không dùng chứng minh so sánh sạch. Các quan sát đã đo không xác nhận WCET, an toàn cơ cấu chấp hành, khả năng phục hồi dài hạn hoặc triển khai hoàn chỉnh.</w:t>
+        <w:t>Nền tảng Edge-AI không đồng nhất đang trong quá trình triển khai giúp nhóm quan sát Linux và FreeRTOS khi dữ liệu đến muộn. Pi đảm nhận tính toán biến thiên, còn MCU kiểm tra liveness và độ tươi trước khi quyết định đầu ra mô phỏng. Các hàng đợi và miền đồng hồ cũng phải được chỉ rõ mới giải thích được thời gian đo. Kết quả sơ bộ ghi nhận điều chỉnh ưu tiên chỉ giải quyết một phần nguồn trễ, vì đánh thức timer, tính toán, chờ đầu vào và chuyển giao là các đoạn khác nhau. Vì tải bộ nhớ vẫn có thể hạn chế lợi</w:t>
+      </w:r>
+      <w:r>
+        <w:t xml:space="preserve"> ích của ưu tiên, thêm luồng cũng không luôn làm MobileNetV2 chạy nhanh hơn trong lúc Pi đang bận. Tương tự, latest-value cuối đường ống chưa khôi phục được tuổi đã tích lũy trước suy luận. Nhóm vì thế tìm đoạn đang chờ và kiểm tra dữ liệu tới MCU còn hữu ích không.</w:t>
+      </w:r>
+    </w:p>
+    <w:p>
+      <w:r>
+        <w:t>Kết quả sơ bộ về lỗi hỗ trợ cách giám sát độc lập: bridge còn gửi heartbeat chưa đủ để kết quả cũ tiếp tục hợp lệ. Mốc đo vì vậy phải theo lý do chuyển trạng thái, còn GPIO cung cấp cách kiểm tra độc lập với log MCU để nhận ra khác biệt giữa byte cuối trên dây và heartbeat cuối được chấp nhận. Công việc tiếp theo của chúng em là ổn định nguồn cấp rồi lặp phép đo trong cùng điều kiện, đồng thời tiếp tục tách lượt thiếu bằng chứng khỏi phần so sánh.</w:t>
       </w:r>
     </w:p>
     <w:p>
       <w:pPr>
         <w:pStyle w:val="Heading1"/>
       </w:pPr>
-      <w:bookmarkStart w:id="29" w:name="_Toc243148461"/>
-      <w:r>
-        <w:t>Tài liệu tham khảo</w:t>
+      <w:bookmarkStart w:id="29" w:name="_Toc243150067"/>
+      <w:r>
+        <w:t>TÀI LIỆU THAM KHẢO</w:t>
       </w:r>
       <w:bookmarkEnd w:id="29"/>
     </w:p>
     <w:p>
       <w:r>
-        <w:t>[1] Linux kernel documentation, “Real-Time group scheduling.” https:/​/​docs.kernel.org/​scheduler/​sched-rt-group.html. Truy cập theo bản trình bày: 10/​10/​2026.</w:t>
+        <w:t>[1] Linux kernel documentation, “Real-Time group scheduling.” Truy cập ngày 10/10/2026.</w:t>
       </w:r>
     </w:p>
     <w:p>
@@ -5762,37 +5909,12 @@
     </w:p>
     <w:p>
       <w:r>
-        <w:t>[7] ONNX Runtime documentation, “Thread management.” https:/​/​onnxruntime.ai/​docs/​performance/​tune-performance/​threading.html.</w:t>
+        <w:t>[7] ONNX Runtime documentation, “Thread management.”</w:t>
       </w:r>
     </w:p>
     <w:p>
       <w:r>
         <w:t>[8] D. Mills, “Simple Network Time Protocol (SNTP) Version 4,” RFC 4330, Jan. 2006, sec. 5.</w:t>
-      </w:r>
-    </w:p>
-    <w:p>
-      <w:pPr>
-        <w:pStyle w:val="Heading1"/>
-      </w:pPr>
-      <w:bookmarkStart w:id="30" w:name="_Toc243148462"/>
-      <w:r>
-        <w:t>Phụ lục: Nguồn dữ liệu</w:t>
-      </w:r>
-      <w:bookmarkEnd w:id="30"/>
-    </w:p>
-    <w:p>
-      <w:r>
-        <w:t>Nguồn thiết kế: PROJECT.md; README.md; docs/​SYSTEM_​GUIDE.md; docs/​SYSTEM_​OVERVIEW.md; docs/​ROADMAP.md; docs/​ROADMAP_​TO_​WBROBOT_​AND_​ARTICLE.md; protocol/​PROTOCOL.md. Nguồn hiện thực: linux/​README.md; stm32/​README.md; stm32/​firmware/​README.md.</w:t>
-      </w:r>
-    </w:p>
-    <w:p>
-      <w:r>
-        <w:t>Nguồn đánh giá: docs/​STAGE_​REPORT.md và results/​README.md; các run định lượng được ghi dưới Bảng 2–6. Tập E3b: results/​2026-10-12_​e3b_​input_​latest. E3 UART gốc: results/​2026-10-12_​e3_​real_​uart. Rerun: release/​results/​2026-10-12_​e3_​real_​uart_​rerun, provenance từ bản trình bày cuối, trang 44–45; không thuộc tập results hiện có. Capture GPIO: results/​2026-10-12_​logic_​analyzer và bản trình bày cuối, trang 97.</w:t>
-      </w:r>
-    </w:p>
-    <w:p>
-      <w:r>
-        <w:t>Nguồn tổng hợp và thư mục tham khảo: slides_​course/​main.tex (bản cuối, gồm ghi chú; trang 97–98, 103, 109–110) và slides/​main.tex (bản tiếng Việt). Nguồn hình: slides/​images/​V20.jpg, V15.jpg, V14.jpg và slides/​images/​MAPPING.md. Đường dẫn tính từ gốc kho mã; slides_​course thuộc checkout chính. Đây là tổng hợp hồ sơ lưu trữ, không phải phép đo mới.</w:t>
       </w:r>
     </w:p>
     <w:sectPr>
@@ -5835,6 +5957,7 @@
 <w:ftr xmlns:wpc="http://schemas.microsoft.com/office/word/2010/wordprocessingCanvas" xmlns:cx="http://schemas.microsoft.com/office/drawing/2014/chartex" xmlns:cx1="http://schemas.microsoft.com/office/drawing/2015/9/8/chartex" xmlns:cx2="http://schemas.microsoft.com/office/drawing/2015/10/21/chartex" xmlns:cx3="http://schemas.microsoft.com/office/drawing/2016/5/9/chartex" xmlns:cx4="http://schemas.microsoft.com/office/drawing/2016/5/10/chartex" xmlns:cx5="http://schemas.microsoft.com/office/drawing/2016/5/11/chartex" xmlns:cx6="http://schemas.microsoft.com/office/drawing/2016/5/12/chartex" xmlns:cx7="http://schemas.microsoft.com/office/drawing/2016/5/13/chartex" xmlns:cx8="http://schemas.microsoft.com/office/drawing/2016/5/14/chartex" xmlns:mc="http://schemas.openxmlformats.org/markup-compatibility/2006" xmlns:aink="http://schemas.microsoft.com/office/drawing/2016/ink" xmlns:am3d="http://schemas.microsoft.com/office/drawing/2017/model3d" xmlns:o="urn:schemas-microsoft-com:office:office" xmlns:oel="http://schemas.microsoft.com/office/2019/extlst" xmlns:r="http://schemas.openxmlformats.org/officeDocument/2006/relationships" xmlns:m="http://schemas.openxmlformats.org/officeDocument/2006/math" xmlns:v="urn:schemas-microsoft-com:vml" xmlns:wp14="http://schemas.microsoft.com/office/word/2010/wordprocessingDrawing" xmlns:wp="http://schemas.openxmlformats.org/drawingml/2006/wordprocessingDrawing" xmlns:w10="urn:schemas-microsoft-com:office:word" xmlns:w="http://schemas.openxmlformats.org/wordprocessingml/2006/main" xmlns:w14="http://schemas.microsoft.com/office/word/2010/wordml" xmlns:w15="http://schemas.microsoft.com/office/word/2012/wordml" xmlns:w16cex="http://schemas.microsoft.com/office/word/2018/wordml/cex" xmlns:w16cid="http://schemas.microsoft.com/office/word/2016/wordml/cid" xmlns:w16="http://schemas.microsoft.com/office/word/2018/wordml" xmlns:w16du="http://schemas.microsoft.com/office/word/2023/wordml/word16du" xmlns:w16sdtdh="http://schemas.microsoft.com/office/word/2020/wordml/sdtdatahash" xmlns:w16sdtfl="http://schemas.microsoft.com/office/word/2024/wordml/sdtformatlock" xmlns:w16se="http://schemas.microsoft.com/office/word/2015/wordml/symex" xmlns:wpg="http://schemas.microsoft.com/office/word/2010/wordprocessingGroup" xmlns:wpi="http://schemas.microsoft.com/office/word/2010/wordprocessingInk" xmlns:wne="http://schemas.microsoft.com/office/word/2006/wordml" xmlns:wps="http://schemas.microsoft.com/office/word/2010/wordprocessingShape" mc:Ignorable="w14 w15 w16se w16cid w16 w16cex w16sdtdh w16sdtfl w16du wp14">
   <w:p>
     <w:pPr>
+      <w:ind w:firstLine="0"/>
       <w:jc w:val="center"/>
     </w:pPr>
     <w:r>
@@ -5884,9 +6007,9 @@
 <file path=word/numbering.xml><?xml version="1.0" encoding="utf-8"?>
 <w:numbering xmlns:wpc="http://schemas.microsoft.com/office/word/2010/wordprocessingCanvas" xmlns:cx="http://schemas.microsoft.com/office/drawing/2014/chartex" xmlns:cx1="http://schemas.microsoft.com/office/drawing/2015/9/8/chartex" xmlns:cx2="http://schemas.microsoft.com/office/drawing/2015/10/21/chartex" xmlns:cx3="http://schemas.microsoft.com/office/drawing/2016/5/9/chartex" xmlns:cx4="http://schemas.microsoft.com/office/drawing/2016/5/10/chartex" xmlns:cx5="http://schemas.microsoft.com/office/drawing/2016/5/11/chartex" xmlns:cx6="http://schemas.microsoft.com/office/drawing/2016/5/12/chartex" xmlns:cx7="http://schemas.microsoft.com/office/drawing/2016/5/13/chartex" xmlns:cx8="http://schemas.microsoft.com/office/drawing/2016/5/14/chartex" xmlns:mc="http://schemas.openxmlformats.org/markup-compatibility/2006" xmlns:aink="http://schemas.microsoft.com/office/drawing/2016/ink" xmlns:am3d="http://schemas.microsoft.com/office/drawing/2017/model3d" xmlns:o="urn:schemas-microsoft-com:office:office" xmlns:oel="http://schemas.microsoft.com/office/2019/extlst" xmlns:r="http://schemas.openxmlformats.org/officeDocument/2006/relationships" xmlns:m="http://schemas.openxmlformats.org/officeDocument/2006/math" xmlns:v="urn:schemas-microsoft-com:vml" xmlns:wp14="http://schemas.microsoft.com/office/word/2010/wordprocessingDrawing" xmlns:wp="http://schemas.openxmlformats.org/drawingml/2006/wordprocessingDrawing" xmlns:w10="urn:schemas-microsoft-com:office:word" xmlns:w="http://schemas.openxmlformats.org/wordprocessingml/2006/main" xmlns:w14="http://schemas.microsoft.com/office/word/2010/wordml" xmlns:w15="http://schemas.microsoft.com/office/word/2012/wordml" xmlns:w16cex="http://schemas.microsoft.com/office/word/2018/wordml/cex" xmlns:w16cid="http://schemas.microsoft.com/office/word/2016/wordml/cid" xmlns:w16="http://schemas.microsoft.com/office/word/2018/wordml" xmlns:w16du="http://schemas.microsoft.com/office/word/2023/wordml/word16du" xmlns:w16sdtdh="http://schemas.microsoft.com/office/word/2020/wordml/sdtdatahash" xmlns:w16sdtfl="http://schemas.microsoft.com/office/word/2024/wordml/sdtformatlock" xmlns:w16se="http://schemas.microsoft.com/office/word/2015/wordml/symex" xmlns:wpg="http://schemas.microsoft.com/office/word/2010/wordprocessingGroup" xmlns:wpi="http://schemas.microsoft.com/office/word/2010/wordprocessingInk" xmlns:wne="http://schemas.microsoft.com/office/word/2006/wordml" xmlns:wps="http://schemas.microsoft.com/office/word/2010/wordprocessingShape" mc:Ignorable="w14 w15 w16se w16cid w16 w16cex w16sdtdh w16sdtfl w16du wp14">
   <w:abstractNum w:abstractNumId="0" w15:restartNumberingAfterBreak="0">
-    <w:nsid w:val="5BC97DAB"/>
+    <w:nsid w:val="12C54E18"/>
     <w:multiLevelType w:val="singleLevel"/>
-    <w:tmpl w:val="CB701E98"/>
+    <w:tmpl w:val="682E2396"/>
     <w:lvl w:ilvl="0">
       <w:start w:val="1"/>
       <w:numFmt w:val="bullet"/>
@@ -5900,7 +6023,7 @@
       </w:pPr>
     </w:lvl>
   </w:abstractNum>
-  <w:num w:numId="1" w16cid:durableId="1723360536">
+  <w:num w:numId="1" w16cid:durableId="1983385477">
     <w:abstractNumId w:val="0"/>
   </w:num>
 </w:numbering>
@@ -5919,7 +6042,8 @@
     </w:rPrDefault>
     <w:pPrDefault>
       <w:pPr>
-        <w:spacing w:after="80" w:line="312" w:lineRule="auto"/>
+        <w:spacing w:after="120" w:line="312" w:lineRule="auto"/>
+        <w:ind w:firstLine="567"/>
         <w:jc w:val="both"/>
       </w:pPr>
     </w:pPrDefault>
@@ -6316,12 +6440,13 @@
       <w:keepNext/>
       <w:keepLines/>
       <w:spacing w:before="160" w:after="100"/>
+      <w:ind w:firstLine="0"/>
       <w:jc w:val="left"/>
       <w:outlineLvl w:val="0"/>
     </w:pPr>
     <w:rPr>
       <w:b/>
-      <w:sz w:val="30"/>
+      <w:sz w:val="28"/>
     </w:rPr>
   </w:style>
   <w:style w:type="paragraph" w:styleId="Heading2">
@@ -6335,6 +6460,7 @@
       <w:keepNext/>
       <w:keepLines/>
       <w:spacing w:before="160" w:after="100"/>
+      <w:ind w:firstLine="0"/>
       <w:jc w:val="left"/>
       <w:outlineLvl w:val="1"/>
     </w:pPr>
@@ -6354,11 +6480,13 @@
       <w:keepNext/>
       <w:keepLines/>
       <w:spacing w:before="160" w:after="100"/>
+      <w:ind w:firstLine="0"/>
       <w:jc w:val="left"/>
       <w:outlineLvl w:val="2"/>
     </w:pPr>
     <w:rPr>
       <w:b/>
+      <w:i/>
     </w:rPr>
   </w:style>
   <w:style w:type="character" w:default="1" w:styleId="DefaultParagraphFont">
@@ -6392,42 +6520,77 @@
     <w:name w:val="caption"/>
     <w:basedOn w:val="Normal"/>
     <w:pPr>
-      <w:keepNext/>
-      <w:spacing w:after="60"/>
+      <w:ind w:firstLine="0"/>
       <w:jc w:val="center"/>
     </w:pPr>
     <w:rPr>
-      <w:b/>
+      <w:i/>
+      <w:sz w:val="24"/>
     </w:rPr>
   </w:style>
-  <w:style w:type="paragraph" w:customStyle="1" w:styleId="Source">
-    <w:name w:val="Source"/>
+  <w:style w:type="paragraph" w:customStyle="1" w:styleId="TableCaption">
+    <w:name w:val="TableCaption"/>
     <w:basedOn w:val="Normal"/>
     <w:pPr>
-      <w:spacing w:after="60"/>
-      <w:jc w:val="left"/>
+      <w:keepNext/>
+      <w:ind w:firstLine="0"/>
+      <w:jc w:val="center"/>
     </w:pPr>
     <w:rPr>
-      <w:sz w:val="22"/>
+      <w:i/>
+      <w:sz w:val="24"/>
     </w:rPr>
   </w:style>
   <w:style w:type="paragraph" w:customStyle="1" w:styleId="TableText">
     <w:name w:val="TableText"/>
     <w:basedOn w:val="Normal"/>
     <w:pPr>
-      <w:spacing w:after="60"/>
+      <w:ind w:firstLine="0"/>
       <w:jc w:val="left"/>
+    </w:pPr>
+  </w:style>
+  <w:style w:type="paragraph" w:customStyle="1" w:styleId="CoverTable">
+    <w:name w:val="CoverTable"/>
+    <w:basedOn w:val="Normal"/>
+    <w:pPr>
+      <w:ind w:firstLine="0"/>
+      <w:jc w:val="center"/>
     </w:pPr>
   </w:style>
   <w:style w:type="paragraph" w:customStyle="1" w:styleId="Cover">
     <w:name w:val="Cover"/>
     <w:basedOn w:val="Normal"/>
     <w:pPr>
-      <w:spacing w:after="60"/>
+      <w:spacing w:before="180"/>
+      <w:ind w:firstLine="0"/>
       <w:jc w:val="center"/>
     </w:pPr>
     <w:rPr>
-      <w:sz w:val="30"/>
+      <w:sz w:val="28"/>
+    </w:rPr>
+  </w:style>
+  <w:style w:type="paragraph" w:customStyle="1" w:styleId="CoverTitle">
+    <w:name w:val="CoverTitle"/>
+    <w:basedOn w:val="Normal"/>
+    <w:pPr>
+      <w:spacing w:before="180"/>
+      <w:ind w:firstLine="0"/>
+      <w:jc w:val="center"/>
+    </w:pPr>
+    <w:rPr>
+      <w:sz w:val="36"/>
+    </w:rPr>
+  </w:style>
+  <w:style w:type="paragraph" w:customStyle="1" w:styleId="CoverDate">
+    <w:name w:val="CoverDate"/>
+    <w:basedOn w:val="Normal"/>
+    <w:pPr>
+      <w:spacing w:before="900"/>
+      <w:ind w:firstLine="0"/>
+      <w:jc w:val="center"/>
+    </w:pPr>
+    <w:rPr>
+      <w:sz w:val="28"/>
     </w:rPr>
   </w:style>
   <w:style w:type="paragraph" w:customStyle="1" w:styleId="FrontHeading">
@@ -6435,19 +6598,19 @@
     <w:basedOn w:val="Normal"/>
     <w:pPr>
       <w:keepNext/>
-      <w:spacing w:after="60"/>
+      <w:ind w:firstLine="0"/>
       <w:jc w:val="center"/>
     </w:pPr>
     <w:rPr>
       <w:b/>
-      <w:sz w:val="30"/>
+      <w:sz w:val="28"/>
     </w:rPr>
   </w:style>
   <w:style w:type="paragraph" w:customStyle="1" w:styleId="TOC1">
     <w:name w:val="TOC1"/>
     <w:basedOn w:val="Normal"/>
     <w:pPr>
-      <w:spacing w:after="60"/>
+      <w:ind w:firstLine="0"/>
       <w:jc w:val="left"/>
     </w:pPr>
   </w:style>
@@ -6458,7 +6621,7 @@
     <w:autoRedefine/>
     <w:uiPriority w:val="39"/>
     <w:unhideWhenUsed/>
-    <w:rsid w:val="00614E2D"/>
+    <w:rsid w:val="001F5622"/>
     <w:pPr>
       <w:spacing w:after="100"/>
     </w:pPr>
@@ -6470,7 +6633,7 @@
     <w:autoRedefine/>
     <w:uiPriority w:val="39"/>
     <w:unhideWhenUsed/>
-    <w:rsid w:val="00614E2D"/>
+    <w:rsid w:val="001F5622"/>
     <w:pPr>
       <w:spacing w:after="100"/>
       <w:ind w:left="260"/>
@@ -6481,7 +6644,7 @@
     <w:basedOn w:val="DefaultParagraphFont"/>
     <w:uiPriority w:val="99"/>
     <w:unhideWhenUsed/>
-    <w:rsid w:val="00614E2D"/>
+    <w:rsid w:val="001F5622"/>
     <w:rPr>
       <w:color w:val="467886" w:themeColor="hyperlink"/>
       <w:u w:val="single"/>

</xml_diff>

<commit_message>
Report: use the student's redrawn figures 3.1-3.3
Co-Authored-By: Claude Opus 5.5 (1M context) <noreply@anthropic.com>
</commit_message>
<xml_diff>
--- a/report_vi/BaoCao_HDH_Nhom3Stars.docx
+++ b/report_vi/BaoCao_HDH_Nhom3Stars.docx
@@ -2111,7 +2111,7 @@
       <w:pPr/>
       <w:r>
         <w:rPr/>
-        <w:t xml:space="preserve">Hình 3.1 mô tả source → inference → bridge trên Pi, qua UART tới RX → supervisor → GPIO trên STM32. Logger ghi timestamp để tái dựng hành trình dưới tải, nhưng thiếu log có thể khiến nhóm chưa đủ bằng chứng dù MCU vẫn giám sát. Supervisor độc quyền ghi output; heartbeat xác nhận bridge hoạt động, còn INFERENCE cung cấp kết quả để kiểm tra freshness. Đầu ra mới là GPIO. Hệ thống chưa có cơ cấu chấp hành hoặc watchdog phần cứng độc lập.</w:t>
+        <w:t xml:space="preserve">Hình 3.1 mô tả Linux workload (ONNX Runtime, MobileNetV2) → bridge trên Pi, qua UART tới UART ISR → bounded buffer → RX task → supervisor → output/LED trên STM32. Logger ghi timestamp để tái dựng hành trình dưới tải, nhưng thiếu log có thể khiến nhóm chưa đủ bằng chứng dù MCU vẫn giám sát. Supervisor độc quyền ghi output; heartbeat xác nhận bridge hoạt động, còn INFERENCE cung cấp kết quả để kiểm tra freshness. Đầu ra mới là GPIO. Hệ thống chưa có cơ cấu chấp hành hoặc watchdog phần cứng độc lập.</w:t>
       </w:r>
     </w:p>
     <w:p>
@@ -2123,7 +2123,7 @@
       <w:r>
         <w:drawing>
           <wp:inline xmlns:wp="http://schemas.openxmlformats.org/drawingml/2006/wordprocessingDrawing" distT="0" distB="0" distL="0" distR="0">
-            <wp:extent cx="4095000" cy="2340000"/>
+            <wp:extent cx="4320000" cy="1637629"/>
             <wp:docPr id="2" name="Hình 2" descr="Hình 3.1. Kiến trúc hệ thống và ranh giới quyền điều khiển."/>
             <a:graphic xmlns:a="http://schemas.openxmlformats.org/drawingml/2006/main">
               <a:graphicData uri="http://schemas.openxmlformats.org/drawingml/2006/picture">
@@ -2141,7 +2141,7 @@
                   <pic:spPr>
                     <a:xfrm>
                       <a:off x="0" y="0"/>
-                      <a:ext cx="4095000" cy="2340000"/>
+                      <a:ext cx="4320000" cy="1637629"/>
                     </a:xfrm>
                     <a:prstGeom prst="rect">
                       <a:avLst/>
@@ -2189,7 +2189,7 @@
       <w:r>
         <w:drawing>
           <wp:inline xmlns:wp="http://schemas.openxmlformats.org/drawingml/2006/wordprocessingDrawing" distT="0" distB="0" distL="0" distR="0">
-            <wp:extent cx="4320000" cy="1604571"/>
+            <wp:extent cx="4320000" cy="1063920"/>
             <wp:docPr id="3" name="Hình 3" descr="Hình 3.2. Cấu trúc frame UART và phạm vi kiểm tra CRC."/>
             <a:graphic xmlns:a="http://schemas.openxmlformats.org/drawingml/2006/main">
               <a:graphicData uri="http://schemas.openxmlformats.org/drawingml/2006/picture">
@@ -2207,7 +2207,7 @@
                   <pic:spPr>
                     <a:xfrm>
                       <a:off x="0" y="0"/>
-                      <a:ext cx="4320000" cy="1604571"/>
+                      <a:ext cx="4320000" cy="1063920"/>
                     </a:xfrm>
                     <a:prstGeom prst="rect">
                       <a:avLst/>
@@ -2521,7 +2521,7 @@
       <w:r>
         <w:drawing>
           <wp:inline xmlns:wp="http://schemas.openxmlformats.org/drawingml/2006/wordprocessingDrawing" distT="0" distB="0" distL="0" distR="0">
-            <wp:extent cx="4320000" cy="1851428"/>
+            <wp:extent cx="4320000" cy="1632000"/>
             <wp:docPr id="4" name="Hình 4" descr="Hình 3.3. FIFO giữ backlog; latest-value thay kết quả chưa gửi."/>
             <a:graphic xmlns:a="http://schemas.openxmlformats.org/drawingml/2006/main">
               <a:graphicData uri="http://schemas.openxmlformats.org/drawingml/2006/picture">
@@ -2539,7 +2539,7 @@
                   <pic:spPr>
                     <a:xfrm>
                       <a:off x="0" y="0"/>
-                      <a:ext cx="4320000" cy="1851428"/>
+                      <a:ext cx="4320000" cy="1632000"/>
                     </a:xfrm>
                     <a:prstGeom prst="rect">
                       <a:avLst/>

</xml_diff>

<commit_message>
Add 2026-10-20 re-run slides to defense deck and section 5.5 to Vietnamese report
</commit_message>
<xml_diff>
--- a/report_vi/BaoCao_HDH_Nhom3Stars.docx
+++ b/report_vi/BaoCao_HDH_Nhom3Stars.docx
@@ -585,6 +585,15 @@
       </w:pPr>
       <w:r>
         <w:rPr/>
+        <w:t xml:space="preserve">5.5 Đo lại ngày 20/10/2026</w:t>
+      </w:r>
+    </w:p>
+    <w:p>
+      <w:pPr>
+        <w:pStyle w:val="TOC1"/>
+      </w:pPr>
+      <w:r>
+        <w:rPr/>
         <w:t xml:space="preserve">PHẦN 6. THẢO LUẬN VÀ HẠN CHẾ</w:t>
       </w:r>
     </w:p>
@@ -4923,6 +4932,4137 @@
       <w:r>
         <w:rPr/>
         <w:t xml:space="preserve">Logic analyzer đối chiếu log qua GPIO. Khoảng quan sát là 86.938–95.541 ms ở F1, 86.947–98.676 ms ở F2 và 82.852–91.302 ms ở F4; F2 có cả lượt bắt tín hiệu kiểm tra. Trong các lần bắt, 10/15 lần khớp mốc heartbeat trong 0.07 ms, còn 5 lần khác có một frame tới sau heartbeat nên byte cuối trên dây không phải heartbeat cuối được MCU chấp nhận.</w:t>
+      </w:r>
+    </w:p>
+    <w:p>
+      <w:pPr>
+        <w:pStyle w:val="Heading2"/>
+      </w:pPr>
+      <w:r>
+        <w:rPr/>
+        <w:t xml:space="preserve">5.5 Đo lại ngày 20/10/2026</w:t>
+      </w:r>
+    </w:p>
+    <w:p>
+      <w:pPr/>
+      <w:r>
+        <w:rPr/>
+        <w:t xml:space="preserve">Đợt đo bổ sung dùng Raspberry Pi 5 RAM 4 GB, Ubuntu 24.04 với kernel 6.8.0-1065-raspi và Nucleo-F446RE. Firmware được nạp từ Pi bằng st-flash; log S1 xác nhận ghi và kiểm tra lại thành công. Mã SHA-256 của tệp nhị phân là bf9a7d956560439704f030237d4b800edf5b131973d2706700be62c3576ff28b. Các bảng dưới trình bày kết quả đo với số lượt hợp lệ theo kiểm tra gốc và kiểm tra bổ sung tương ứng. Dữ liệu gốc được giữ riêng. Các quan sát ngày 11/10 và 12/10 tiếp tục được diễn giải theo phạm vi thu thập ban đầu, kể cả những hạn chế về nguồn và theo dõi đã nêu ở các mục trước, thay vì gộp mẫu với đợt mới.</w:t>
+      </w:r>
+    </w:p>
+    <w:p>
+      <w:pPr/>
+      <w:r>
+        <w:rPr/>
+        <w:t xml:space="preserve">Bảng đo lại A. P99 cyclictest, đơn vị µs; trung vị phân vị giữa các lượt, gốc ngày 11/10/2026.</w:t>
+      </w:r>
+    </w:p>
+    <w:tbl>
+      <w:tblPr>
+        <w:tblW w:w="9071" w:type="dxa"/>
+        <w:tblBorders>
+          <w:top w:val="single" w:sz="4" w:color="808080"/>
+          <w:left w:val="single" w:sz="4" w:color="808080"/>
+          <w:bottom w:val="single" w:sz="4" w:color="808080"/>
+          <w:right w:val="single" w:sz="4" w:color="808080"/>
+          <w:insideH w:val="single" w:sz="4" w:color="808080"/>
+          <w:insideV w:val="single" w:sz="4" w:color="808080"/>
+        </w:tblBorders>
+        <w:tblLayout w:type="fixed"/>
+        <w:tblCellMar>
+          <w:top w:w="60" w:type="dxa"/>
+          <w:left w:w="115" w:type="dxa"/>
+          <w:bottom w:w="60" w:type="dxa"/>
+          <w:right w:w="115" w:type="dxa"/>
+        </w:tblCellMar>
+      </w:tblPr>
+      <w:tblGrid>
+        <w:gridCol w:w="1814"/>
+        <w:gridCol w:w="1814"/>
+        <w:gridCol w:w="1814"/>
+        <w:gridCol w:w="1814"/>
+        <w:gridCol w:w="1814"/>
+      </w:tblGrid>
+      <w:tr>
+        <w:trPr>
+          <w:cantSplit/>
+          <w:tblHeader/>
+        </w:trPr>
+        <w:tc>
+          <w:tcPr>
+            <w:tcW w:w="1814" w:type="dxa"/>
+            <w:shd w:fill="E8EEF4"/>
+            <w:vAlign w:val="center"/>
+          </w:tcPr>
+          <w:p>
+            <w:pPr>
+              <w:pStyle w:val="TableText"/>
+            </w:pPr>
+            <w:r>
+              <w:rPr>
+                <w:b/>
+              </w:rPr>
+              <w:t xml:space="preserve">Phép đo / điều kiện</w:t>
+            </w:r>
+          </w:p>
+        </w:tc>
+        <w:tc>
+          <w:tcPr>
+            <w:tcW w:w="1814" w:type="dxa"/>
+            <w:shd w:fill="E8EEF4"/>
+            <w:vAlign w:val="center"/>
+          </w:tcPr>
+          <w:p>
+            <w:pPr>
+              <w:pStyle w:val="TableText"/>
+            </w:pPr>
+            <w:r>
+              <w:rPr>
+                <w:b/>
+              </w:rPr>
+              <w:t xml:space="preserve">Gốc</w:t>
+            </w:r>
+          </w:p>
+        </w:tc>
+        <w:tc>
+          <w:tcPr>
+            <w:tcW w:w="1814" w:type="dxa"/>
+            <w:shd w:fill="E8EEF4"/>
+            <w:vAlign w:val="center"/>
+          </w:tcPr>
+          <w:p>
+            <w:pPr>
+              <w:pStyle w:val="TableText"/>
+            </w:pPr>
+            <w:r>
+              <w:rPr>
+                <w:b/>
+              </w:rPr>
+              <w:t xml:space="preserve">Đo lại</w:t>
+            </w:r>
+          </w:p>
+        </w:tc>
+        <w:tc>
+          <w:tcPr>
+            <w:tcW w:w="1814" w:type="dxa"/>
+            <w:shd w:fill="E8EEF4"/>
+            <w:vAlign w:val="center"/>
+          </w:tcPr>
+          <w:p>
+            <w:pPr>
+              <w:pStyle w:val="TableText"/>
+            </w:pPr>
+            <w:r>
+              <w:rPr>
+                <w:b/>
+              </w:rPr>
+              <w:t xml:space="preserve">Hợp lệ gốc</w:t>
+            </w:r>
+          </w:p>
+        </w:tc>
+        <w:tc>
+          <w:tcPr>
+            <w:tcW w:w="1814" w:type="dxa"/>
+            <w:shd w:fill="E8EEF4"/>
+            <w:vAlign w:val="center"/>
+          </w:tcPr>
+          <w:p>
+            <w:pPr>
+              <w:pStyle w:val="TableText"/>
+            </w:pPr>
+            <w:r>
+              <w:rPr>
+                <w:b/>
+              </w:rPr>
+              <w:t xml:space="preserve">Hợp lệ đo lại</w:t>
+            </w:r>
+          </w:p>
+        </w:tc>
+      </w:tr>
+      <w:tr>
+        <w:trPr>
+          <w:cantSplit/>
+        </w:trPr>
+        <w:tc>
+          <w:tcPr>
+            <w:tcW w:w="1814" w:type="dxa"/>
+          </w:tcPr>
+          <w:p>
+            <w:pPr>
+              <w:pStyle w:val="TableText"/>
+            </w:pPr>
+            <w:r>
+              <w:rPr/>
+              <w:t xml:space="preserve">P0 idle</w:t>
+            </w:r>
+          </w:p>
+        </w:tc>
+        <w:tc>
+          <w:tcPr>
+            <w:tcW w:w="1814" w:type="dxa"/>
+          </w:tcPr>
+          <w:p>
+            <w:pPr>
+              <w:pStyle w:val="TableText"/>
+            </w:pPr>
+            <w:r>
+              <w:rPr/>
+              <w:t xml:space="preserve">57</w:t>
+            </w:r>
+          </w:p>
+        </w:tc>
+        <w:tc>
+          <w:tcPr>
+            <w:tcW w:w="1814" w:type="dxa"/>
+          </w:tcPr>
+          <w:p>
+            <w:pPr>
+              <w:pStyle w:val="TableText"/>
+            </w:pPr>
+            <w:r>
+              <w:rPr/>
+              <w:t xml:space="preserve">95</w:t>
+            </w:r>
+          </w:p>
+        </w:tc>
+        <w:tc>
+          <w:tcPr>
+            <w:tcW w:w="1814" w:type="dxa"/>
+          </w:tcPr>
+          <w:p>
+            <w:pPr>
+              <w:pStyle w:val="TableText"/>
+            </w:pPr>
+            <w:r>
+              <w:rPr/>
+              <w:t xml:space="preserve">3/3</w:t>
+            </w:r>
+          </w:p>
+        </w:tc>
+        <w:tc>
+          <w:tcPr>
+            <w:tcW w:w="1814" w:type="dxa"/>
+          </w:tcPr>
+          <w:p>
+            <w:pPr>
+              <w:pStyle w:val="TableText"/>
+            </w:pPr>
+            <w:r>
+              <w:rPr/>
+              <w:t xml:space="preserve">3/3</w:t>
+            </w:r>
+          </w:p>
+        </w:tc>
+      </w:tr>
+      <w:tr>
+        <w:trPr>
+          <w:cantSplit/>
+        </w:trPr>
+        <w:tc>
+          <w:tcPr>
+            <w:tcW w:w="1814" w:type="dxa"/>
+          </w:tcPr>
+          <w:p>
+            <w:pPr>
+              <w:pStyle w:val="TableText"/>
+            </w:pPr>
+            <w:r>
+              <w:rPr/>
+              <w:t xml:space="preserve">P0 CPU</w:t>
+            </w:r>
+          </w:p>
+        </w:tc>
+        <w:tc>
+          <w:tcPr>
+            <w:tcW w:w="1814" w:type="dxa"/>
+          </w:tcPr>
+          <w:p>
+            <w:pPr>
+              <w:pStyle w:val="TableText"/>
+            </w:pPr>
+            <w:r>
+              <w:rPr/>
+              <w:t xml:space="preserve">68</w:t>
+            </w:r>
+          </w:p>
+        </w:tc>
+        <w:tc>
+          <w:tcPr>
+            <w:tcW w:w="1814" w:type="dxa"/>
+          </w:tcPr>
+          <w:p>
+            <w:pPr>
+              <w:pStyle w:val="TableText"/>
+            </w:pPr>
+            <w:r>
+              <w:rPr/>
+              <w:t xml:space="preserve">183</w:t>
+            </w:r>
+          </w:p>
+        </w:tc>
+        <w:tc>
+          <w:tcPr>
+            <w:tcW w:w="1814" w:type="dxa"/>
+          </w:tcPr>
+          <w:p>
+            <w:pPr>
+              <w:pStyle w:val="TableText"/>
+            </w:pPr>
+            <w:r>
+              <w:rPr/>
+              <w:t xml:space="preserve">3/3</w:t>
+            </w:r>
+          </w:p>
+        </w:tc>
+        <w:tc>
+          <w:tcPr>
+            <w:tcW w:w="1814" w:type="dxa"/>
+          </w:tcPr>
+          <w:p>
+            <w:pPr>
+              <w:pStyle w:val="TableText"/>
+            </w:pPr>
+            <w:r>
+              <w:rPr/>
+              <w:t xml:space="preserve">3/3</w:t>
+            </w:r>
+          </w:p>
+        </w:tc>
+      </w:tr>
+      <w:tr>
+        <w:trPr>
+          <w:cantSplit/>
+        </w:trPr>
+        <w:tc>
+          <w:tcPr>
+            <w:tcW w:w="1814" w:type="dxa"/>
+          </w:tcPr>
+          <w:p>
+            <w:pPr>
+              <w:pStyle w:val="TableText"/>
+            </w:pPr>
+            <w:r>
+              <w:rPr/>
+              <w:t xml:space="preserve">P0 stream</w:t>
+            </w:r>
+          </w:p>
+        </w:tc>
+        <w:tc>
+          <w:tcPr>
+            <w:tcW w:w="1814" w:type="dxa"/>
+          </w:tcPr>
+          <w:p>
+            <w:pPr>
+              <w:pStyle w:val="TableText"/>
+            </w:pPr>
+            <w:r>
+              <w:rPr/>
+              <w:t xml:space="preserve">300</w:t>
+            </w:r>
+          </w:p>
+        </w:tc>
+        <w:tc>
+          <w:tcPr>
+            <w:tcW w:w="1814" w:type="dxa"/>
+          </w:tcPr>
+          <w:p>
+            <w:pPr>
+              <w:pStyle w:val="TableText"/>
+            </w:pPr>
+            <w:r>
+              <w:rPr/>
+              <w:t xml:space="preserve">675</w:t>
+            </w:r>
+          </w:p>
+        </w:tc>
+        <w:tc>
+          <w:tcPr>
+            <w:tcW w:w="1814" w:type="dxa"/>
+          </w:tcPr>
+          <w:p>
+            <w:pPr>
+              <w:pStyle w:val="TableText"/>
+            </w:pPr>
+            <w:r>
+              <w:rPr/>
+              <w:t xml:space="preserve">3/3</w:t>
+            </w:r>
+          </w:p>
+        </w:tc>
+        <w:tc>
+          <w:tcPr>
+            <w:tcW w:w="1814" w:type="dxa"/>
+          </w:tcPr>
+          <w:p>
+            <w:pPr>
+              <w:pStyle w:val="TableText"/>
+            </w:pPr>
+            <w:r>
+              <w:rPr/>
+              <w:t xml:space="preserve">3/3</w:t>
+            </w:r>
+          </w:p>
+        </w:tc>
+      </w:tr>
+      <w:tr>
+        <w:trPr>
+          <w:cantSplit/>
+        </w:trPr>
+        <w:tc>
+          <w:tcPr>
+            <w:tcW w:w="1814" w:type="dxa"/>
+          </w:tcPr>
+          <w:p>
+            <w:pPr>
+              <w:pStyle w:val="TableText"/>
+            </w:pPr>
+            <w:r>
+              <w:rPr/>
+              <w:t xml:space="preserve">P0 cache</w:t>
+            </w:r>
+          </w:p>
+        </w:tc>
+        <w:tc>
+          <w:tcPr>
+            <w:tcW w:w="1814" w:type="dxa"/>
+          </w:tcPr>
+          <w:p>
+            <w:pPr>
+              <w:pStyle w:val="TableText"/>
+            </w:pPr>
+            <w:r>
+              <w:rPr/>
+              <w:t xml:space="preserve">203</w:t>
+            </w:r>
+          </w:p>
+        </w:tc>
+        <w:tc>
+          <w:tcPr>
+            <w:tcW w:w="1814" w:type="dxa"/>
+          </w:tcPr>
+          <w:p>
+            <w:pPr>
+              <w:pStyle w:val="TableText"/>
+            </w:pPr>
+            <w:r>
+              <w:rPr/>
+              <w:t xml:space="preserve">403</w:t>
+            </w:r>
+          </w:p>
+        </w:tc>
+        <w:tc>
+          <w:tcPr>
+            <w:tcW w:w="1814" w:type="dxa"/>
+          </w:tcPr>
+          <w:p>
+            <w:pPr>
+              <w:pStyle w:val="TableText"/>
+            </w:pPr>
+            <w:r>
+              <w:rPr/>
+              <w:t xml:space="preserve">3/3</w:t>
+            </w:r>
+          </w:p>
+        </w:tc>
+        <w:tc>
+          <w:tcPr>
+            <w:tcW w:w="1814" w:type="dxa"/>
+          </w:tcPr>
+          <w:p>
+            <w:pPr>
+              <w:pStyle w:val="TableText"/>
+            </w:pPr>
+            <w:r>
+              <w:rPr/>
+              <w:t xml:space="preserve">3/3</w:t>
+            </w:r>
+          </w:p>
+        </w:tc>
+      </w:tr>
+      <w:tr>
+        <w:trPr>
+          <w:cantSplit/>
+        </w:trPr>
+        <w:tc>
+          <w:tcPr>
+            <w:tcW w:w="1814" w:type="dxa"/>
+          </w:tcPr>
+          <w:p>
+            <w:pPr>
+              <w:pStyle w:val="TableText"/>
+            </w:pPr>
+            <w:r>
+              <w:rPr/>
+              <w:t xml:space="preserve">P0 memrate</w:t>
+            </w:r>
+          </w:p>
+        </w:tc>
+        <w:tc>
+          <w:tcPr>
+            <w:tcW w:w="1814" w:type="dxa"/>
+          </w:tcPr>
+          <w:p>
+            <w:pPr>
+              <w:pStyle w:val="TableText"/>
+            </w:pPr>
+            <w:r>
+              <w:rPr/>
+              <w:t xml:space="preserve">613</w:t>
+            </w:r>
+          </w:p>
+        </w:tc>
+        <w:tc>
+          <w:tcPr>
+            <w:tcW w:w="1814" w:type="dxa"/>
+          </w:tcPr>
+          <w:p>
+            <w:pPr>
+              <w:pStyle w:val="TableText"/>
+            </w:pPr>
+            <w:r>
+              <w:rPr/>
+              <w:t xml:space="preserve">1020</w:t>
+            </w:r>
+          </w:p>
+        </w:tc>
+        <w:tc>
+          <w:tcPr>
+            <w:tcW w:w="1814" w:type="dxa"/>
+          </w:tcPr>
+          <w:p>
+            <w:pPr>
+              <w:pStyle w:val="TableText"/>
+            </w:pPr>
+            <w:r>
+              <w:rPr/>
+              <w:t xml:space="preserve">3/3</w:t>
+            </w:r>
+          </w:p>
+        </w:tc>
+        <w:tc>
+          <w:tcPr>
+            <w:tcW w:w="1814" w:type="dxa"/>
+          </w:tcPr>
+          <w:p>
+            <w:pPr>
+              <w:pStyle w:val="TableText"/>
+            </w:pPr>
+            <w:r>
+              <w:rPr/>
+              <w:t xml:space="preserve">3/3</w:t>
+            </w:r>
+          </w:p>
+        </w:tc>
+      </w:tr>
+      <w:tr>
+        <w:trPr>
+          <w:cantSplit/>
+        </w:trPr>
+        <w:tc>
+          <w:tcPr>
+            <w:tcW w:w="1814" w:type="dxa"/>
+          </w:tcPr>
+          <w:p>
+            <w:pPr>
+              <w:pStyle w:val="TableText"/>
+            </w:pPr>
+            <w:r>
+              <w:rPr/>
+              <w:t xml:space="preserve">P1 idle</w:t>
+            </w:r>
+          </w:p>
+        </w:tc>
+        <w:tc>
+          <w:tcPr>
+            <w:tcW w:w="1814" w:type="dxa"/>
+          </w:tcPr>
+          <w:p>
+            <w:pPr>
+              <w:pStyle w:val="TableText"/>
+            </w:pPr>
+            <w:r>
+              <w:rPr/>
+              <w:t xml:space="preserve">9</w:t>
+            </w:r>
+          </w:p>
+        </w:tc>
+        <w:tc>
+          <w:tcPr>
+            <w:tcW w:w="1814" w:type="dxa"/>
+          </w:tcPr>
+          <w:p>
+            <w:pPr>
+              <w:pStyle w:val="TableText"/>
+            </w:pPr>
+            <w:r>
+              <w:rPr/>
+              <w:t xml:space="preserve">14</w:t>
+            </w:r>
+          </w:p>
+        </w:tc>
+        <w:tc>
+          <w:tcPr>
+            <w:tcW w:w="1814" w:type="dxa"/>
+          </w:tcPr>
+          <w:p>
+            <w:pPr>
+              <w:pStyle w:val="TableText"/>
+            </w:pPr>
+            <w:r>
+              <w:rPr/>
+              <w:t xml:space="preserve">3/3</w:t>
+            </w:r>
+          </w:p>
+        </w:tc>
+        <w:tc>
+          <w:tcPr>
+            <w:tcW w:w="1814" w:type="dxa"/>
+          </w:tcPr>
+          <w:p>
+            <w:pPr>
+              <w:pStyle w:val="TableText"/>
+            </w:pPr>
+            <w:r>
+              <w:rPr/>
+              <w:t xml:space="preserve">3/3</w:t>
+            </w:r>
+          </w:p>
+        </w:tc>
+      </w:tr>
+      <w:tr>
+        <w:trPr>
+          <w:cantSplit/>
+        </w:trPr>
+        <w:tc>
+          <w:tcPr>
+            <w:tcW w:w="1814" w:type="dxa"/>
+          </w:tcPr>
+          <w:p>
+            <w:pPr>
+              <w:pStyle w:val="TableText"/>
+            </w:pPr>
+            <w:r>
+              <w:rPr/>
+              <w:t xml:space="preserve">P1 CPU</w:t>
+            </w:r>
+          </w:p>
+        </w:tc>
+        <w:tc>
+          <w:tcPr>
+            <w:tcW w:w="1814" w:type="dxa"/>
+          </w:tcPr>
+          <w:p>
+            <w:pPr>
+              <w:pStyle w:val="TableText"/>
+            </w:pPr>
+            <w:r>
+              <w:rPr/>
+              <w:t xml:space="preserve">11</w:t>
+            </w:r>
+          </w:p>
+        </w:tc>
+        <w:tc>
+          <w:tcPr>
+            <w:tcW w:w="1814" w:type="dxa"/>
+          </w:tcPr>
+          <w:p>
+            <w:pPr>
+              <w:pStyle w:val="TableText"/>
+            </w:pPr>
+            <w:r>
+              <w:rPr/>
+              <w:t xml:space="preserve">13</w:t>
+            </w:r>
+          </w:p>
+        </w:tc>
+        <w:tc>
+          <w:tcPr>
+            <w:tcW w:w="1814" w:type="dxa"/>
+          </w:tcPr>
+          <w:p>
+            <w:pPr>
+              <w:pStyle w:val="TableText"/>
+            </w:pPr>
+            <w:r>
+              <w:rPr/>
+              <w:t xml:space="preserve">3/3</w:t>
+            </w:r>
+          </w:p>
+        </w:tc>
+        <w:tc>
+          <w:tcPr>
+            <w:tcW w:w="1814" w:type="dxa"/>
+          </w:tcPr>
+          <w:p>
+            <w:pPr>
+              <w:pStyle w:val="TableText"/>
+            </w:pPr>
+            <w:r>
+              <w:rPr/>
+              <w:t xml:space="preserve">3/3</w:t>
+            </w:r>
+          </w:p>
+        </w:tc>
+      </w:tr>
+      <w:tr>
+        <w:trPr>
+          <w:cantSplit/>
+        </w:trPr>
+        <w:tc>
+          <w:tcPr>
+            <w:tcW w:w="1814" w:type="dxa"/>
+          </w:tcPr>
+          <w:p>
+            <w:pPr>
+              <w:pStyle w:val="TableText"/>
+            </w:pPr>
+            <w:r>
+              <w:rPr/>
+              <w:t xml:space="preserve">P1 stream</w:t>
+            </w:r>
+          </w:p>
+        </w:tc>
+        <w:tc>
+          <w:tcPr>
+            <w:tcW w:w="1814" w:type="dxa"/>
+          </w:tcPr>
+          <w:p>
+            <w:pPr>
+              <w:pStyle w:val="TableText"/>
+            </w:pPr>
+            <w:r>
+              <w:rPr/>
+              <w:t xml:space="preserve">39</w:t>
+            </w:r>
+          </w:p>
+        </w:tc>
+        <w:tc>
+          <w:tcPr>
+            <w:tcW w:w="1814" w:type="dxa"/>
+          </w:tcPr>
+          <w:p>
+            <w:pPr>
+              <w:pStyle w:val="TableText"/>
+            </w:pPr>
+            <w:r>
+              <w:rPr/>
+              <w:t xml:space="preserve">42</w:t>
+            </w:r>
+          </w:p>
+        </w:tc>
+        <w:tc>
+          <w:tcPr>
+            <w:tcW w:w="1814" w:type="dxa"/>
+          </w:tcPr>
+          <w:p>
+            <w:pPr>
+              <w:pStyle w:val="TableText"/>
+            </w:pPr>
+            <w:r>
+              <w:rPr/>
+              <w:t xml:space="preserve">3/3</w:t>
+            </w:r>
+          </w:p>
+        </w:tc>
+        <w:tc>
+          <w:tcPr>
+            <w:tcW w:w="1814" w:type="dxa"/>
+          </w:tcPr>
+          <w:p>
+            <w:pPr>
+              <w:pStyle w:val="TableText"/>
+            </w:pPr>
+            <w:r>
+              <w:rPr/>
+              <w:t xml:space="preserve">3/3</w:t>
+            </w:r>
+          </w:p>
+        </w:tc>
+      </w:tr>
+      <w:tr>
+        <w:trPr>
+          <w:cantSplit/>
+        </w:trPr>
+        <w:tc>
+          <w:tcPr>
+            <w:tcW w:w="1814" w:type="dxa"/>
+          </w:tcPr>
+          <w:p>
+            <w:pPr>
+              <w:pStyle w:val="TableText"/>
+            </w:pPr>
+            <w:r>
+              <w:rPr/>
+              <w:t xml:space="preserve">P1 cache</w:t>
+            </w:r>
+          </w:p>
+        </w:tc>
+        <w:tc>
+          <w:tcPr>
+            <w:tcW w:w="1814" w:type="dxa"/>
+          </w:tcPr>
+          <w:p>
+            <w:pPr>
+              <w:pStyle w:val="TableText"/>
+            </w:pPr>
+            <w:r>
+              <w:rPr/>
+              <w:t xml:space="preserve">35</w:t>
+            </w:r>
+          </w:p>
+        </w:tc>
+        <w:tc>
+          <w:tcPr>
+            <w:tcW w:w="1814" w:type="dxa"/>
+          </w:tcPr>
+          <w:p>
+            <w:pPr>
+              <w:pStyle w:val="TableText"/>
+            </w:pPr>
+            <w:r>
+              <w:rPr/>
+              <w:t xml:space="preserve">37</w:t>
+            </w:r>
+          </w:p>
+        </w:tc>
+        <w:tc>
+          <w:tcPr>
+            <w:tcW w:w="1814" w:type="dxa"/>
+          </w:tcPr>
+          <w:p>
+            <w:pPr>
+              <w:pStyle w:val="TableText"/>
+            </w:pPr>
+            <w:r>
+              <w:rPr/>
+              <w:t xml:space="preserve">3/3</w:t>
+            </w:r>
+          </w:p>
+        </w:tc>
+        <w:tc>
+          <w:tcPr>
+            <w:tcW w:w="1814" w:type="dxa"/>
+          </w:tcPr>
+          <w:p>
+            <w:pPr>
+              <w:pStyle w:val="TableText"/>
+            </w:pPr>
+            <w:r>
+              <w:rPr/>
+              <w:t xml:space="preserve">3/3</w:t>
+            </w:r>
+          </w:p>
+        </w:tc>
+      </w:tr>
+      <w:tr>
+        <w:trPr>
+          <w:cantSplit/>
+        </w:trPr>
+        <w:tc>
+          <w:tcPr>
+            <w:tcW w:w="1814" w:type="dxa"/>
+          </w:tcPr>
+          <w:p>
+            <w:pPr>
+              <w:pStyle w:val="TableText"/>
+            </w:pPr>
+            <w:r>
+              <w:rPr/>
+              <w:t xml:space="preserve">P1 memrate</w:t>
+            </w:r>
+          </w:p>
+        </w:tc>
+        <w:tc>
+          <w:tcPr>
+            <w:tcW w:w="1814" w:type="dxa"/>
+          </w:tcPr>
+          <w:p>
+            <w:pPr>
+              <w:pStyle w:val="TableText"/>
+            </w:pPr>
+            <w:r>
+              <w:rPr/>
+              <w:t xml:space="preserve">239</w:t>
+            </w:r>
+          </w:p>
+        </w:tc>
+        <w:tc>
+          <w:tcPr>
+            <w:tcW w:w="1814" w:type="dxa"/>
+          </w:tcPr>
+          <w:p>
+            <w:pPr>
+              <w:pStyle w:val="TableText"/>
+            </w:pPr>
+            <w:r>
+              <w:rPr/>
+              <w:t xml:space="preserve">196</w:t>
+            </w:r>
+          </w:p>
+        </w:tc>
+        <w:tc>
+          <w:tcPr>
+            <w:tcW w:w="1814" w:type="dxa"/>
+          </w:tcPr>
+          <w:p>
+            <w:pPr>
+              <w:pStyle w:val="TableText"/>
+            </w:pPr>
+            <w:r>
+              <w:rPr/>
+              <w:t xml:space="preserve">3/3</w:t>
+            </w:r>
+          </w:p>
+        </w:tc>
+        <w:tc>
+          <w:tcPr>
+            <w:tcW w:w="1814" w:type="dxa"/>
+          </w:tcPr>
+          <w:p>
+            <w:pPr>
+              <w:pStyle w:val="TableText"/>
+            </w:pPr>
+            <w:r>
+              <w:rPr/>
+              <w:t xml:space="preserve">3/3</w:t>
+            </w:r>
+          </w:p>
+        </w:tc>
+      </w:tr>
+    </w:tbl>
+    <w:p>
+      <w:pPr/>
+      <w:r>
+        <w:rPr/>
+        <w:t xml:space="preserve">Cyclictest P0 dùng SCHED_OTHER, còn P1 dùng FIFO priority 50 với ba lần lặp cho mỗi điều kiện tải. Mỗi lượt mới kéo dài 60 s, bằng một nửa cửa sổ 120 s của đợt gốc trong mục 5.2. P1 vẫn chịu ảnh hưởng tải nhớ; khác biệt kernel và thời lượng chưa cho phép quy chênh lệch cho riêng scheduler. Kiểm tra gốc dùng quy tắc ban đầu, còn đợt mới yêu cầu độ phủ theo dõi và xác nhận tải. Giá trị quan sát không phải cận trên thời gian đáp ứng.</w:t>
+      </w:r>
+    </w:p>
+    <w:p>
+      <w:pPr/>
+      <w:r>
+        <w:rPr/>
+        <w:t xml:space="preserve">Bảng đo lại B. FAILSAFE MCU-local, đơn vị ms; gốc ngày 12/10/2026, P50 và cực đại quan sát.</w:t>
+      </w:r>
+    </w:p>
+    <w:tbl>
+      <w:tblPr>
+        <w:tblW w:w="9071" w:type="dxa"/>
+        <w:tblBorders>
+          <w:top w:val="single" w:sz="4" w:color="808080"/>
+          <w:left w:val="single" w:sz="4" w:color="808080"/>
+          <w:bottom w:val="single" w:sz="4" w:color="808080"/>
+          <w:right w:val="single" w:sz="4" w:color="808080"/>
+          <w:insideH w:val="single" w:sz="4" w:color="808080"/>
+          <w:insideV w:val="single" w:sz="4" w:color="808080"/>
+        </w:tblBorders>
+        <w:tblLayout w:type="fixed"/>
+        <w:tblCellMar>
+          <w:top w:w="60" w:type="dxa"/>
+          <w:left w:w="115" w:type="dxa"/>
+          <w:bottom w:w="60" w:type="dxa"/>
+          <w:right w:w="115" w:type="dxa"/>
+        </w:tblCellMar>
+      </w:tblPr>
+      <w:tblGrid>
+        <w:gridCol w:w="1814"/>
+        <w:gridCol w:w="1814"/>
+        <w:gridCol w:w="1814"/>
+        <w:gridCol w:w="1814"/>
+        <w:gridCol w:w="1814"/>
+      </w:tblGrid>
+      <w:tr>
+        <w:trPr>
+          <w:cantSplit/>
+          <w:tblHeader/>
+        </w:trPr>
+        <w:tc>
+          <w:tcPr>
+            <w:tcW w:w="1814" w:type="dxa"/>
+            <w:shd w:fill="E8EEF4"/>
+            <w:vAlign w:val="center"/>
+          </w:tcPr>
+          <w:p>
+            <w:pPr>
+              <w:pStyle w:val="TableText"/>
+            </w:pPr>
+            <w:r>
+              <w:rPr>
+                <w:b/>
+              </w:rPr>
+              <w:t xml:space="preserve">Phép đo / điều kiện</w:t>
+            </w:r>
+          </w:p>
+        </w:tc>
+        <w:tc>
+          <w:tcPr>
+            <w:tcW w:w="1814" w:type="dxa"/>
+            <w:shd w:fill="E8EEF4"/>
+            <w:vAlign w:val="center"/>
+          </w:tcPr>
+          <w:p>
+            <w:pPr>
+              <w:pStyle w:val="TableText"/>
+            </w:pPr>
+            <w:r>
+              <w:rPr>
+                <w:b/>
+              </w:rPr>
+              <w:t xml:space="preserve">Gốc</w:t>
+            </w:r>
+          </w:p>
+        </w:tc>
+        <w:tc>
+          <w:tcPr>
+            <w:tcW w:w="1814" w:type="dxa"/>
+            <w:shd w:fill="E8EEF4"/>
+            <w:vAlign w:val="center"/>
+          </w:tcPr>
+          <w:p>
+            <w:pPr>
+              <w:pStyle w:val="TableText"/>
+            </w:pPr>
+            <w:r>
+              <w:rPr>
+                <w:b/>
+              </w:rPr>
+              <w:t xml:space="preserve">Đo lại</w:t>
+            </w:r>
+          </w:p>
+        </w:tc>
+        <w:tc>
+          <w:tcPr>
+            <w:tcW w:w="1814" w:type="dxa"/>
+            <w:shd w:fill="E8EEF4"/>
+            <w:vAlign w:val="center"/>
+          </w:tcPr>
+          <w:p>
+            <w:pPr>
+              <w:pStyle w:val="TableText"/>
+            </w:pPr>
+            <w:r>
+              <w:rPr>
+                <w:b/>
+              </w:rPr>
+              <w:t xml:space="preserve">Hợp lệ gốc</w:t>
+            </w:r>
+          </w:p>
+        </w:tc>
+        <w:tc>
+          <w:tcPr>
+            <w:tcW w:w="1814" w:type="dxa"/>
+            <w:shd w:fill="E8EEF4"/>
+            <w:vAlign w:val="center"/>
+          </w:tcPr>
+          <w:p>
+            <w:pPr>
+              <w:pStyle w:val="TableText"/>
+            </w:pPr>
+            <w:r>
+              <w:rPr>
+                <w:b/>
+              </w:rPr>
+              <w:t xml:space="preserve">Hợp lệ đo lại</w:t>
+            </w:r>
+          </w:p>
+        </w:tc>
+      </w:tr>
+      <w:tr>
+        <w:trPr>
+          <w:cantSplit/>
+        </w:trPr>
+        <w:tc>
+          <w:tcPr>
+            <w:tcW w:w="1814" w:type="dxa"/>
+          </w:tcPr>
+          <w:p>
+            <w:pPr>
+              <w:pStyle w:val="TableText"/>
+            </w:pPr>
+            <w:r>
+              <w:rPr/>
+              <w:t xml:space="preserve">F1 P50</w:t>
+            </w:r>
+          </w:p>
+        </w:tc>
+        <w:tc>
+          <w:tcPr>
+            <w:tcW w:w="1814" w:type="dxa"/>
+          </w:tcPr>
+          <w:p>
+            <w:pPr>
+              <w:pStyle w:val="TableText"/>
+            </w:pPr>
+            <w:r>
+              <w:rPr/>
+              <w:t xml:space="preserve">100.456</w:t>
+            </w:r>
+          </w:p>
+        </w:tc>
+        <w:tc>
+          <w:tcPr>
+            <w:tcW w:w="1814" w:type="dxa"/>
+          </w:tcPr>
+          <w:p>
+            <w:pPr>
+              <w:pStyle w:val="TableText"/>
+            </w:pPr>
+            <w:r>
+              <w:rPr/>
+              <w:t xml:space="preserve">100.427</w:t>
+            </w:r>
+          </w:p>
+        </w:tc>
+        <w:tc>
+          <w:tcPr>
+            <w:tcW w:w="1814" w:type="dxa"/>
+          </w:tcPr>
+          <w:p>
+            <w:pPr>
+              <w:pStyle w:val="TableText"/>
+            </w:pPr>
+            <w:r>
+              <w:rPr/>
+              <w:t xml:space="preserve">5/5</w:t>
+            </w:r>
+          </w:p>
+        </w:tc>
+        <w:tc>
+          <w:tcPr>
+            <w:tcW w:w="1814" w:type="dxa"/>
+          </w:tcPr>
+          <w:p>
+            <w:pPr>
+              <w:pStyle w:val="TableText"/>
+            </w:pPr>
+            <w:r>
+              <w:rPr/>
+              <w:t xml:space="preserve">5/5</w:t>
+            </w:r>
+          </w:p>
+        </w:tc>
+      </w:tr>
+      <w:tr>
+        <w:trPr>
+          <w:cantSplit/>
+        </w:trPr>
+        <w:tc>
+          <w:tcPr>
+            <w:tcW w:w="1814" w:type="dxa"/>
+          </w:tcPr>
+          <w:p>
+            <w:pPr>
+              <w:pStyle w:val="TableText"/>
+            </w:pPr>
+            <w:r>
+              <w:rPr/>
+              <w:t xml:space="preserve">F2 P50</w:t>
+            </w:r>
+          </w:p>
+        </w:tc>
+        <w:tc>
+          <w:tcPr>
+            <w:tcW w:w="1814" w:type="dxa"/>
+          </w:tcPr>
+          <w:p>
+            <w:pPr>
+              <w:pStyle w:val="TableText"/>
+            </w:pPr>
+            <w:r>
+              <w:rPr/>
+              <w:t xml:space="preserve">100.577</w:t>
+            </w:r>
+          </w:p>
+        </w:tc>
+        <w:tc>
+          <w:tcPr>
+            <w:tcW w:w="1814" w:type="dxa"/>
+          </w:tcPr>
+          <w:p>
+            <w:pPr>
+              <w:pStyle w:val="TableText"/>
+            </w:pPr>
+            <w:r>
+              <w:rPr/>
+              <w:t xml:space="preserve">100.293</w:t>
+            </w:r>
+          </w:p>
+        </w:tc>
+        <w:tc>
+          <w:tcPr>
+            <w:tcW w:w="1814" w:type="dxa"/>
+          </w:tcPr>
+          <w:p>
+            <w:pPr>
+              <w:pStyle w:val="TableText"/>
+            </w:pPr>
+            <w:r>
+              <w:rPr/>
+              <w:t xml:space="preserve">5/5</w:t>
+            </w:r>
+          </w:p>
+        </w:tc>
+        <w:tc>
+          <w:tcPr>
+            <w:tcW w:w="1814" w:type="dxa"/>
+          </w:tcPr>
+          <w:p>
+            <w:pPr>
+              <w:pStyle w:val="TableText"/>
+            </w:pPr>
+            <w:r>
+              <w:rPr/>
+              <w:t xml:space="preserve">5/5</w:t>
+            </w:r>
+          </w:p>
+        </w:tc>
+      </w:tr>
+      <w:tr>
+        <w:trPr>
+          <w:cantSplit/>
+        </w:trPr>
+        <w:tc>
+          <w:tcPr>
+            <w:tcW w:w="1814" w:type="dxa"/>
+          </w:tcPr>
+          <w:p>
+            <w:pPr>
+              <w:pStyle w:val="TableText"/>
+            </w:pPr>
+            <w:r>
+              <w:rPr/>
+              <w:t xml:space="preserve">F3 P50</w:t>
+            </w:r>
+          </w:p>
+        </w:tc>
+        <w:tc>
+          <w:tcPr>
+            <w:tcW w:w="1814" w:type="dxa"/>
+          </w:tcPr>
+          <w:p>
+            <w:pPr>
+              <w:pStyle w:val="TableText"/>
+            </w:pPr>
+            <w:r>
+              <w:rPr/>
+              <w:t xml:space="preserve">475.754</w:t>
+            </w:r>
+          </w:p>
+        </w:tc>
+        <w:tc>
+          <w:tcPr>
+            <w:tcW w:w="1814" w:type="dxa"/>
+          </w:tcPr>
+          <w:p>
+            <w:pPr>
+              <w:pStyle w:val="TableText"/>
+            </w:pPr>
+            <w:r>
+              <w:rPr/>
+              <w:t xml:space="preserve">474.937</w:t>
+            </w:r>
+          </w:p>
+        </w:tc>
+        <w:tc>
+          <w:tcPr>
+            <w:tcW w:w="1814" w:type="dxa"/>
+          </w:tcPr>
+          <w:p>
+            <w:pPr>
+              <w:pStyle w:val="TableText"/>
+            </w:pPr>
+            <w:r>
+              <w:rPr/>
+              <w:t xml:space="preserve">5/5</w:t>
+            </w:r>
+          </w:p>
+        </w:tc>
+        <w:tc>
+          <w:tcPr>
+            <w:tcW w:w="1814" w:type="dxa"/>
+          </w:tcPr>
+          <w:p>
+            <w:pPr>
+              <w:pStyle w:val="TableText"/>
+            </w:pPr>
+            <w:r>
+              <w:rPr/>
+              <w:t xml:space="preserve">5/5</w:t>
+            </w:r>
+          </w:p>
+        </w:tc>
+      </w:tr>
+      <w:tr>
+        <w:trPr>
+          <w:cantSplit/>
+        </w:trPr>
+        <w:tc>
+          <w:tcPr>
+            <w:tcW w:w="1814" w:type="dxa"/>
+          </w:tcPr>
+          <w:p>
+            <w:pPr>
+              <w:pStyle w:val="TableText"/>
+            </w:pPr>
+            <w:r>
+              <w:rPr/>
+              <w:t xml:space="preserve">F4 P50</w:t>
+            </w:r>
+          </w:p>
+        </w:tc>
+        <w:tc>
+          <w:tcPr>
+            <w:tcW w:w="1814" w:type="dxa"/>
+          </w:tcPr>
+          <w:p>
+            <w:pPr>
+              <w:pStyle w:val="TableText"/>
+            </w:pPr>
+            <w:r>
+              <w:rPr/>
+              <w:t xml:space="preserve">100.556</w:t>
+            </w:r>
+          </w:p>
+        </w:tc>
+        <w:tc>
+          <w:tcPr>
+            <w:tcW w:w="1814" w:type="dxa"/>
+          </w:tcPr>
+          <w:p>
+            <w:pPr>
+              <w:pStyle w:val="TableText"/>
+            </w:pPr>
+            <w:r>
+              <w:rPr/>
+              <w:t xml:space="preserve">100.426</w:t>
+            </w:r>
+          </w:p>
+        </w:tc>
+        <w:tc>
+          <w:tcPr>
+            <w:tcW w:w="1814" w:type="dxa"/>
+          </w:tcPr>
+          <w:p>
+            <w:pPr>
+              <w:pStyle w:val="TableText"/>
+            </w:pPr>
+            <w:r>
+              <w:rPr/>
+              <w:t xml:space="preserve">7/14</w:t>
+            </w:r>
+          </w:p>
+        </w:tc>
+        <w:tc>
+          <w:tcPr>
+            <w:tcW w:w="1814" w:type="dxa"/>
+          </w:tcPr>
+          <w:p>
+            <w:pPr>
+              <w:pStyle w:val="TableText"/>
+            </w:pPr>
+            <w:r>
+              <w:rPr/>
+              <w:t xml:space="preserve">5/5</w:t>
+            </w:r>
+          </w:p>
+        </w:tc>
+      </w:tr>
+      <w:tr>
+        <w:trPr>
+          <w:cantSplit/>
+        </w:trPr>
+        <w:tc>
+          <w:tcPr>
+            <w:tcW w:w="1814" w:type="dxa"/>
+          </w:tcPr>
+          <w:p>
+            <w:pPr>
+              <w:pStyle w:val="TableText"/>
+            </w:pPr>
+            <w:r>
+              <w:rPr/>
+              <w:t xml:space="preserve">F5 P50</w:t>
+            </w:r>
+          </w:p>
+        </w:tc>
+        <w:tc>
+          <w:tcPr>
+            <w:tcW w:w="1814" w:type="dxa"/>
+          </w:tcPr>
+          <w:p>
+            <w:pPr>
+              <w:pStyle w:val="TableText"/>
+            </w:pPr>
+            <w:r>
+              <w:rPr/>
+              <w:t xml:space="preserve">475.596</w:t>
+            </w:r>
+          </w:p>
+        </w:tc>
+        <w:tc>
+          <w:tcPr>
+            <w:tcW w:w="1814" w:type="dxa"/>
+          </w:tcPr>
+          <w:p>
+            <w:pPr>
+              <w:pStyle w:val="TableText"/>
+            </w:pPr>
+            <w:r>
+              <w:rPr/>
+              <w:t xml:space="preserve">474.459</w:t>
+            </w:r>
+          </w:p>
+        </w:tc>
+        <w:tc>
+          <w:tcPr>
+            <w:tcW w:w="1814" w:type="dxa"/>
+          </w:tcPr>
+          <w:p>
+            <w:pPr>
+              <w:pStyle w:val="TableText"/>
+            </w:pPr>
+            <w:r>
+              <w:rPr/>
+              <w:t xml:space="preserve">5/5</w:t>
+            </w:r>
+          </w:p>
+        </w:tc>
+        <w:tc>
+          <w:tcPr>
+            <w:tcW w:w="1814" w:type="dxa"/>
+          </w:tcPr>
+          <w:p>
+            <w:pPr>
+              <w:pStyle w:val="TableText"/>
+            </w:pPr>
+            <w:r>
+              <w:rPr/>
+              <w:t xml:space="preserve">5/5</w:t>
+            </w:r>
+          </w:p>
+        </w:tc>
+      </w:tr>
+      <w:tr>
+        <w:trPr>
+          <w:cantSplit/>
+        </w:trPr>
+        <w:tc>
+          <w:tcPr>
+            <w:tcW w:w="1814" w:type="dxa"/>
+          </w:tcPr>
+          <w:p>
+            <w:pPr>
+              <w:pStyle w:val="TableText"/>
+            </w:pPr>
+            <w:r>
+              <w:rPr/>
+              <w:t xml:space="preserve">F1 max</w:t>
+            </w:r>
+          </w:p>
+        </w:tc>
+        <w:tc>
+          <w:tcPr>
+            <w:tcW w:w="1814" w:type="dxa"/>
+          </w:tcPr>
+          <w:p>
+            <w:pPr>
+              <w:pStyle w:val="TableText"/>
+            </w:pPr>
+            <w:r>
+              <w:rPr/>
+              <w:t xml:space="preserve">100.641</w:t>
+            </w:r>
+          </w:p>
+        </w:tc>
+        <w:tc>
+          <w:tcPr>
+            <w:tcW w:w="1814" w:type="dxa"/>
+          </w:tcPr>
+          <w:p>
+            <w:pPr>
+              <w:pStyle w:val="TableText"/>
+            </w:pPr>
+            <w:r>
+              <w:rPr/>
+              <w:t xml:space="preserve">100.433</w:t>
+            </w:r>
+          </w:p>
+        </w:tc>
+        <w:tc>
+          <w:tcPr>
+            <w:tcW w:w="1814" w:type="dxa"/>
+          </w:tcPr>
+          <w:p>
+            <w:pPr>
+              <w:pStyle w:val="TableText"/>
+            </w:pPr>
+            <w:r>
+              <w:rPr/>
+              <w:t xml:space="preserve">5/5</w:t>
+            </w:r>
+          </w:p>
+        </w:tc>
+        <w:tc>
+          <w:tcPr>
+            <w:tcW w:w="1814" w:type="dxa"/>
+          </w:tcPr>
+          <w:p>
+            <w:pPr>
+              <w:pStyle w:val="TableText"/>
+            </w:pPr>
+            <w:r>
+              <w:rPr/>
+              <w:t xml:space="preserve">5/5</w:t>
+            </w:r>
+          </w:p>
+        </w:tc>
+      </w:tr>
+      <w:tr>
+        <w:trPr>
+          <w:cantSplit/>
+        </w:trPr>
+        <w:tc>
+          <w:tcPr>
+            <w:tcW w:w="1814" w:type="dxa"/>
+          </w:tcPr>
+          <w:p>
+            <w:pPr>
+              <w:pStyle w:val="TableText"/>
+            </w:pPr>
+            <w:r>
+              <w:rPr/>
+              <w:t xml:space="preserve">F2 max</w:t>
+            </w:r>
+          </w:p>
+        </w:tc>
+        <w:tc>
+          <w:tcPr>
+            <w:tcW w:w="1814" w:type="dxa"/>
+          </w:tcPr>
+          <w:p>
+            <w:pPr>
+              <w:pStyle w:val="TableText"/>
+            </w:pPr>
+            <w:r>
+              <w:rPr/>
+              <w:t xml:space="preserve">100.596</w:t>
+            </w:r>
+          </w:p>
+        </w:tc>
+        <w:tc>
+          <w:tcPr>
+            <w:tcW w:w="1814" w:type="dxa"/>
+          </w:tcPr>
+          <w:p>
+            <w:pPr>
+              <w:pStyle w:val="TableText"/>
+            </w:pPr>
+            <w:r>
+              <w:rPr/>
+              <w:t xml:space="preserve">100.419</w:t>
+            </w:r>
+          </w:p>
+        </w:tc>
+        <w:tc>
+          <w:tcPr>
+            <w:tcW w:w="1814" w:type="dxa"/>
+          </w:tcPr>
+          <w:p>
+            <w:pPr>
+              <w:pStyle w:val="TableText"/>
+            </w:pPr>
+            <w:r>
+              <w:rPr/>
+              <w:t xml:space="preserve">5/5</w:t>
+            </w:r>
+          </w:p>
+        </w:tc>
+        <w:tc>
+          <w:tcPr>
+            <w:tcW w:w="1814" w:type="dxa"/>
+          </w:tcPr>
+          <w:p>
+            <w:pPr>
+              <w:pStyle w:val="TableText"/>
+            </w:pPr>
+            <w:r>
+              <w:rPr/>
+              <w:t xml:space="preserve">5/5</w:t>
+            </w:r>
+          </w:p>
+        </w:tc>
+      </w:tr>
+      <w:tr>
+        <w:trPr>
+          <w:cantSplit/>
+        </w:trPr>
+        <w:tc>
+          <w:tcPr>
+            <w:tcW w:w="1814" w:type="dxa"/>
+          </w:tcPr>
+          <w:p>
+            <w:pPr>
+              <w:pStyle w:val="TableText"/>
+            </w:pPr>
+            <w:r>
+              <w:rPr/>
+              <w:t xml:space="preserve">F3 max</w:t>
+            </w:r>
+          </w:p>
+        </w:tc>
+        <w:tc>
+          <w:tcPr>
+            <w:tcW w:w="1814" w:type="dxa"/>
+          </w:tcPr>
+          <w:p>
+            <w:pPr>
+              <w:pStyle w:val="TableText"/>
+            </w:pPr>
+            <w:r>
+              <w:rPr/>
+              <w:t xml:space="preserve">475.815</w:t>
+            </w:r>
+          </w:p>
+        </w:tc>
+        <w:tc>
+          <w:tcPr>
+            <w:tcW w:w="1814" w:type="dxa"/>
+          </w:tcPr>
+          <w:p>
+            <w:pPr>
+              <w:pStyle w:val="TableText"/>
+            </w:pPr>
+            <w:r>
+              <w:rPr/>
+              <w:t xml:space="preserve">475.078</w:t>
+            </w:r>
+          </w:p>
+        </w:tc>
+        <w:tc>
+          <w:tcPr>
+            <w:tcW w:w="1814" w:type="dxa"/>
+          </w:tcPr>
+          <w:p>
+            <w:pPr>
+              <w:pStyle w:val="TableText"/>
+            </w:pPr>
+            <w:r>
+              <w:rPr/>
+              <w:t xml:space="preserve">5/5</w:t>
+            </w:r>
+          </w:p>
+        </w:tc>
+        <w:tc>
+          <w:tcPr>
+            <w:tcW w:w="1814" w:type="dxa"/>
+          </w:tcPr>
+          <w:p>
+            <w:pPr>
+              <w:pStyle w:val="TableText"/>
+            </w:pPr>
+            <w:r>
+              <w:rPr/>
+              <w:t xml:space="preserve">5/5</w:t>
+            </w:r>
+          </w:p>
+        </w:tc>
+      </w:tr>
+      <w:tr>
+        <w:trPr>
+          <w:cantSplit/>
+        </w:trPr>
+        <w:tc>
+          <w:tcPr>
+            <w:tcW w:w="1814" w:type="dxa"/>
+          </w:tcPr>
+          <w:p>
+            <w:pPr>
+              <w:pStyle w:val="TableText"/>
+            </w:pPr>
+            <w:r>
+              <w:rPr/>
+              <w:t xml:space="preserve">F4 max</w:t>
+            </w:r>
+          </w:p>
+        </w:tc>
+        <w:tc>
+          <w:tcPr>
+            <w:tcW w:w="1814" w:type="dxa"/>
+          </w:tcPr>
+          <w:p>
+            <w:pPr>
+              <w:pStyle w:val="TableText"/>
+            </w:pPr>
+            <w:r>
+              <w:rPr/>
+              <w:t xml:space="preserve">100.931</w:t>
+            </w:r>
+          </w:p>
+        </w:tc>
+        <w:tc>
+          <w:tcPr>
+            <w:tcW w:w="1814" w:type="dxa"/>
+          </w:tcPr>
+          <w:p>
+            <w:pPr>
+              <w:pStyle w:val="TableText"/>
+            </w:pPr>
+            <w:r>
+              <w:rPr/>
+              <w:t xml:space="preserve">100.556</w:t>
+            </w:r>
+          </w:p>
+        </w:tc>
+        <w:tc>
+          <w:tcPr>
+            <w:tcW w:w="1814" w:type="dxa"/>
+          </w:tcPr>
+          <w:p>
+            <w:pPr>
+              <w:pStyle w:val="TableText"/>
+            </w:pPr>
+            <w:r>
+              <w:rPr/>
+              <w:t xml:space="preserve">7/14</w:t>
+            </w:r>
+          </w:p>
+        </w:tc>
+        <w:tc>
+          <w:tcPr>
+            <w:tcW w:w="1814" w:type="dxa"/>
+          </w:tcPr>
+          <w:p>
+            <w:pPr>
+              <w:pStyle w:val="TableText"/>
+            </w:pPr>
+            <w:r>
+              <w:rPr/>
+              <w:t xml:space="preserve">5/5</w:t>
+            </w:r>
+          </w:p>
+        </w:tc>
+      </w:tr>
+      <w:tr>
+        <w:trPr>
+          <w:cantSplit/>
+        </w:trPr>
+        <w:tc>
+          <w:tcPr>
+            <w:tcW w:w="1814" w:type="dxa"/>
+          </w:tcPr>
+          <w:p>
+            <w:pPr>
+              <w:pStyle w:val="TableText"/>
+            </w:pPr>
+            <w:r>
+              <w:rPr/>
+              <w:t xml:space="preserve">F5 max</w:t>
+            </w:r>
+          </w:p>
+        </w:tc>
+        <w:tc>
+          <w:tcPr>
+            <w:tcW w:w="1814" w:type="dxa"/>
+          </w:tcPr>
+          <w:p>
+            <w:pPr>
+              <w:pStyle w:val="TableText"/>
+            </w:pPr>
+            <w:r>
+              <w:rPr/>
+              <w:t xml:space="preserve">475.917</w:t>
+            </w:r>
+          </w:p>
+        </w:tc>
+        <w:tc>
+          <w:tcPr>
+            <w:tcW w:w="1814" w:type="dxa"/>
+          </w:tcPr>
+          <w:p>
+            <w:pPr>
+              <w:pStyle w:val="TableText"/>
+            </w:pPr>
+            <w:r>
+              <w:rPr/>
+              <w:t xml:space="preserve">474.908</w:t>
+            </w:r>
+          </w:p>
+        </w:tc>
+        <w:tc>
+          <w:tcPr>
+            <w:tcW w:w="1814" w:type="dxa"/>
+          </w:tcPr>
+          <w:p>
+            <w:pPr>
+              <w:pStyle w:val="TableText"/>
+            </w:pPr>
+            <w:r>
+              <w:rPr/>
+              <w:t xml:space="preserve">5/5</w:t>
+            </w:r>
+          </w:p>
+        </w:tc>
+        <w:tc>
+          <w:tcPr>
+            <w:tcW w:w="1814" w:type="dxa"/>
+          </w:tcPr>
+          <w:p>
+            <w:pPr>
+              <w:pStyle w:val="TableText"/>
+            </w:pPr>
+            <w:r>
+              <w:rPr/>
+              <w:t xml:space="preserve">5/5</w:t>
+            </w:r>
+          </w:p>
+        </w:tc>
+      </w:tr>
+    </w:tbl>
+    <w:p>
+      <w:pPr/>
+      <w:r>
+        <w:rPr/>
+        <w:t xml:space="preserve">Bảng đo lại C. P50 từ lúc tiêm lỗi tới FAILSAFE qua ánh xạ đồng hồ, đơn vị ms; gốc ngày 12/10/2026.</w:t>
+      </w:r>
+    </w:p>
+    <w:tbl>
+      <w:tblPr>
+        <w:tblW w:w="9071" w:type="dxa"/>
+        <w:tblBorders>
+          <w:top w:val="single" w:sz="4" w:color="808080"/>
+          <w:left w:val="single" w:sz="4" w:color="808080"/>
+          <w:bottom w:val="single" w:sz="4" w:color="808080"/>
+          <w:right w:val="single" w:sz="4" w:color="808080"/>
+          <w:insideH w:val="single" w:sz="4" w:color="808080"/>
+          <w:insideV w:val="single" w:sz="4" w:color="808080"/>
+        </w:tblBorders>
+        <w:tblLayout w:type="fixed"/>
+        <w:tblCellMar>
+          <w:top w:w="60" w:type="dxa"/>
+          <w:left w:w="115" w:type="dxa"/>
+          <w:bottom w:w="60" w:type="dxa"/>
+          <w:right w:w="115" w:type="dxa"/>
+        </w:tblCellMar>
+      </w:tblPr>
+      <w:tblGrid>
+        <w:gridCol w:w="1814"/>
+        <w:gridCol w:w="1814"/>
+        <w:gridCol w:w="1814"/>
+        <w:gridCol w:w="1814"/>
+        <w:gridCol w:w="1814"/>
+      </w:tblGrid>
+      <w:tr>
+        <w:trPr>
+          <w:cantSplit/>
+          <w:tblHeader/>
+        </w:trPr>
+        <w:tc>
+          <w:tcPr>
+            <w:tcW w:w="1814" w:type="dxa"/>
+            <w:shd w:fill="E8EEF4"/>
+            <w:vAlign w:val="center"/>
+          </w:tcPr>
+          <w:p>
+            <w:pPr>
+              <w:pStyle w:val="TableText"/>
+            </w:pPr>
+            <w:r>
+              <w:rPr>
+                <w:b/>
+              </w:rPr>
+              <w:t xml:space="preserve">Phép đo / điều kiện</w:t>
+            </w:r>
+          </w:p>
+        </w:tc>
+        <w:tc>
+          <w:tcPr>
+            <w:tcW w:w="1814" w:type="dxa"/>
+            <w:shd w:fill="E8EEF4"/>
+            <w:vAlign w:val="center"/>
+          </w:tcPr>
+          <w:p>
+            <w:pPr>
+              <w:pStyle w:val="TableText"/>
+            </w:pPr>
+            <w:r>
+              <w:rPr>
+                <w:b/>
+              </w:rPr>
+              <w:t xml:space="preserve">Gốc</w:t>
+            </w:r>
+          </w:p>
+        </w:tc>
+        <w:tc>
+          <w:tcPr>
+            <w:tcW w:w="1814" w:type="dxa"/>
+            <w:shd w:fill="E8EEF4"/>
+            <w:vAlign w:val="center"/>
+          </w:tcPr>
+          <w:p>
+            <w:pPr>
+              <w:pStyle w:val="TableText"/>
+            </w:pPr>
+            <w:r>
+              <w:rPr>
+                <w:b/>
+              </w:rPr>
+              <w:t xml:space="preserve">Đo lại</w:t>
+            </w:r>
+          </w:p>
+        </w:tc>
+        <w:tc>
+          <w:tcPr>
+            <w:tcW w:w="1814" w:type="dxa"/>
+            <w:shd w:fill="E8EEF4"/>
+            <w:vAlign w:val="center"/>
+          </w:tcPr>
+          <w:p>
+            <w:pPr>
+              <w:pStyle w:val="TableText"/>
+            </w:pPr>
+            <w:r>
+              <w:rPr>
+                <w:b/>
+              </w:rPr>
+              <w:t xml:space="preserve">Hợp lệ gốc</w:t>
+            </w:r>
+          </w:p>
+        </w:tc>
+        <w:tc>
+          <w:tcPr>
+            <w:tcW w:w="1814" w:type="dxa"/>
+            <w:shd w:fill="E8EEF4"/>
+            <w:vAlign w:val="center"/>
+          </w:tcPr>
+          <w:p>
+            <w:pPr>
+              <w:pStyle w:val="TableText"/>
+            </w:pPr>
+            <w:r>
+              <w:rPr>
+                <w:b/>
+              </w:rPr>
+              <w:t xml:space="preserve">Hợp lệ đo lại</w:t>
+            </w:r>
+          </w:p>
+        </w:tc>
+      </w:tr>
+      <w:tr>
+        <w:trPr>
+          <w:cantSplit/>
+        </w:trPr>
+        <w:tc>
+          <w:tcPr>
+            <w:tcW w:w="1814" w:type="dxa"/>
+          </w:tcPr>
+          <w:p>
+            <w:pPr>
+              <w:pStyle w:val="TableText"/>
+            </w:pPr>
+            <w:r>
+              <w:rPr/>
+              <w:t xml:space="preserve">F1 mapped P50</w:t>
+            </w:r>
+          </w:p>
+        </w:tc>
+        <w:tc>
+          <w:tcPr>
+            <w:tcW w:w="1814" w:type="dxa"/>
+          </w:tcPr>
+          <w:p>
+            <w:pPr>
+              <w:pStyle w:val="TableText"/>
+            </w:pPr>
+            <w:r>
+              <w:rPr/>
+              <w:t xml:space="preserve">85.3566</w:t>
+            </w:r>
+          </w:p>
+        </w:tc>
+        <w:tc>
+          <w:tcPr>
+            <w:tcW w:w="1814" w:type="dxa"/>
+          </w:tcPr>
+          <w:p>
+            <w:pPr>
+              <w:pStyle w:val="TableText"/>
+            </w:pPr>
+            <w:r>
+              <w:rPr/>
+              <w:t xml:space="preserve">85.9999</w:t>
+            </w:r>
+          </w:p>
+        </w:tc>
+        <w:tc>
+          <w:tcPr>
+            <w:tcW w:w="1814" w:type="dxa"/>
+          </w:tcPr>
+          <w:p>
+            <w:pPr>
+              <w:pStyle w:val="TableText"/>
+            </w:pPr>
+            <w:r>
+              <w:rPr/>
+              <w:t xml:space="preserve">5/5</w:t>
+            </w:r>
+          </w:p>
+        </w:tc>
+        <w:tc>
+          <w:tcPr>
+            <w:tcW w:w="1814" w:type="dxa"/>
+          </w:tcPr>
+          <w:p>
+            <w:pPr>
+              <w:pStyle w:val="TableText"/>
+            </w:pPr>
+            <w:r>
+              <w:rPr/>
+              <w:t xml:space="preserve">5/5</w:t>
+            </w:r>
+          </w:p>
+        </w:tc>
+      </w:tr>
+      <w:tr>
+        <w:trPr>
+          <w:cantSplit/>
+        </w:trPr>
+        <w:tc>
+          <w:tcPr>
+            <w:tcW w:w="1814" w:type="dxa"/>
+          </w:tcPr>
+          <w:p>
+            <w:pPr>
+              <w:pStyle w:val="TableText"/>
+            </w:pPr>
+            <w:r>
+              <w:rPr/>
+              <w:t xml:space="preserve">F2 mapped P50</w:t>
+            </w:r>
+          </w:p>
+        </w:tc>
+        <w:tc>
+          <w:tcPr>
+            <w:tcW w:w="1814" w:type="dxa"/>
+          </w:tcPr>
+          <w:p>
+            <w:pPr>
+              <w:pStyle w:val="TableText"/>
+            </w:pPr>
+            <w:r>
+              <w:rPr/>
+              <w:t xml:space="preserve">85.7147</w:t>
+            </w:r>
+          </w:p>
+        </w:tc>
+        <w:tc>
+          <w:tcPr>
+            <w:tcW w:w="1814" w:type="dxa"/>
+          </w:tcPr>
+          <w:p>
+            <w:pPr>
+              <w:pStyle w:val="TableText"/>
+            </w:pPr>
+            <w:r>
+              <w:rPr/>
+              <w:t xml:space="preserve">84.8909</w:t>
+            </w:r>
+          </w:p>
+        </w:tc>
+        <w:tc>
+          <w:tcPr>
+            <w:tcW w:w="1814" w:type="dxa"/>
+          </w:tcPr>
+          <w:p>
+            <w:pPr>
+              <w:pStyle w:val="TableText"/>
+            </w:pPr>
+            <w:r>
+              <w:rPr/>
+              <w:t xml:space="preserve">5/5</w:t>
+            </w:r>
+          </w:p>
+        </w:tc>
+        <w:tc>
+          <w:tcPr>
+            <w:tcW w:w="1814" w:type="dxa"/>
+          </w:tcPr>
+          <w:p>
+            <w:pPr>
+              <w:pStyle w:val="TableText"/>
+            </w:pPr>
+            <w:r>
+              <w:rPr/>
+              <w:t xml:space="preserve">5/5</w:t>
+            </w:r>
+          </w:p>
+        </w:tc>
+      </w:tr>
+      <w:tr>
+        <w:trPr>
+          <w:cantSplit/>
+        </w:trPr>
+        <w:tc>
+          <w:tcPr>
+            <w:tcW w:w="1814" w:type="dxa"/>
+          </w:tcPr>
+          <w:p>
+            <w:pPr>
+              <w:pStyle w:val="TableText"/>
+            </w:pPr>
+            <w:r>
+              <w:rPr/>
+              <w:t xml:space="preserve">F3 mapped P50</w:t>
+            </w:r>
+          </w:p>
+        </w:tc>
+        <w:tc>
+          <w:tcPr>
+            <w:tcW w:w="1814" w:type="dxa"/>
+          </w:tcPr>
+          <w:p>
+            <w:pPr>
+              <w:pStyle w:val="TableText"/>
+            </w:pPr>
+            <w:r>
+              <w:rPr/>
+              <w:t xml:space="preserve">383.62</w:t>
+            </w:r>
+          </w:p>
+        </w:tc>
+        <w:tc>
+          <w:tcPr>
+            <w:tcW w:w="1814" w:type="dxa"/>
+          </w:tcPr>
+          <w:p>
+            <w:pPr>
+              <w:pStyle w:val="TableText"/>
+            </w:pPr>
+            <w:r>
+              <w:rPr/>
+              <w:t xml:space="preserve">385.344</w:t>
+            </w:r>
+          </w:p>
+        </w:tc>
+        <w:tc>
+          <w:tcPr>
+            <w:tcW w:w="1814" w:type="dxa"/>
+          </w:tcPr>
+          <w:p>
+            <w:pPr>
+              <w:pStyle w:val="TableText"/>
+            </w:pPr>
+            <w:r>
+              <w:rPr/>
+              <w:t xml:space="preserve">5/5</w:t>
+            </w:r>
+          </w:p>
+        </w:tc>
+        <w:tc>
+          <w:tcPr>
+            <w:tcW w:w="1814" w:type="dxa"/>
+          </w:tcPr>
+          <w:p>
+            <w:pPr>
+              <w:pStyle w:val="TableText"/>
+            </w:pPr>
+            <w:r>
+              <w:rPr/>
+              <w:t xml:space="preserve">5/5</w:t>
+            </w:r>
+          </w:p>
+        </w:tc>
+      </w:tr>
+      <w:tr>
+        <w:trPr>
+          <w:cantSplit/>
+        </w:trPr>
+        <w:tc>
+          <w:tcPr>
+            <w:tcW w:w="1814" w:type="dxa"/>
+          </w:tcPr>
+          <w:p>
+            <w:pPr>
+              <w:pStyle w:val="TableText"/>
+            </w:pPr>
+            <w:r>
+              <w:rPr/>
+              <w:t xml:space="preserve">F4 mapped P50</w:t>
+            </w:r>
+          </w:p>
+        </w:tc>
+        <w:tc>
+          <w:tcPr>
+            <w:tcW w:w="1814" w:type="dxa"/>
+          </w:tcPr>
+          <w:p>
+            <w:pPr>
+              <w:pStyle w:val="TableText"/>
+            </w:pPr>
+            <w:r>
+              <w:rPr/>
+              <w:t xml:space="preserve">87.2773</w:t>
+            </w:r>
+          </w:p>
+        </w:tc>
+        <w:tc>
+          <w:tcPr>
+            <w:tcW w:w="1814" w:type="dxa"/>
+          </w:tcPr>
+          <w:p>
+            <w:pPr>
+              <w:pStyle w:val="TableText"/>
+            </w:pPr>
+            <w:r>
+              <w:rPr/>
+              <w:t xml:space="preserve">87.2318</w:t>
+            </w:r>
+          </w:p>
+        </w:tc>
+        <w:tc>
+          <w:tcPr>
+            <w:tcW w:w="1814" w:type="dxa"/>
+          </w:tcPr>
+          <w:p>
+            <w:pPr>
+              <w:pStyle w:val="TableText"/>
+            </w:pPr>
+            <w:r>
+              <w:rPr/>
+              <w:t xml:space="preserve">7/14</w:t>
+            </w:r>
+          </w:p>
+        </w:tc>
+        <w:tc>
+          <w:tcPr>
+            <w:tcW w:w="1814" w:type="dxa"/>
+          </w:tcPr>
+          <w:p>
+            <w:pPr>
+              <w:pStyle w:val="TableText"/>
+            </w:pPr>
+            <w:r>
+              <w:rPr/>
+              <w:t xml:space="preserve">5/5</w:t>
+            </w:r>
+          </w:p>
+        </w:tc>
+      </w:tr>
+      <w:tr>
+        <w:trPr>
+          <w:cantSplit/>
+        </w:trPr>
+        <w:tc>
+          <w:tcPr>
+            <w:tcW w:w="1814" w:type="dxa"/>
+          </w:tcPr>
+          <w:p>
+            <w:pPr>
+              <w:pStyle w:val="TableText"/>
+            </w:pPr>
+            <w:r>
+              <w:rPr/>
+              <w:t xml:space="preserve">F5 mapped P50</w:t>
+            </w:r>
+          </w:p>
+        </w:tc>
+        <w:tc>
+          <w:tcPr>
+            <w:tcW w:w="1814" w:type="dxa"/>
+          </w:tcPr>
+          <w:p>
+            <w:pPr>
+              <w:pStyle w:val="TableText"/>
+            </w:pPr>
+            <w:r>
+              <w:rPr/>
+              <w:t xml:space="preserve">383.603</w:t>
+            </w:r>
+          </w:p>
+        </w:tc>
+        <w:tc>
+          <w:tcPr>
+            <w:tcW w:w="1814" w:type="dxa"/>
+          </w:tcPr>
+          <w:p>
+            <w:pPr>
+              <w:pStyle w:val="TableText"/>
+            </w:pPr>
+            <w:r>
+              <w:rPr/>
+              <w:t xml:space="preserve">384.179</w:t>
+            </w:r>
+          </w:p>
+        </w:tc>
+        <w:tc>
+          <w:tcPr>
+            <w:tcW w:w="1814" w:type="dxa"/>
+          </w:tcPr>
+          <w:p>
+            <w:pPr>
+              <w:pStyle w:val="TableText"/>
+            </w:pPr>
+            <w:r>
+              <w:rPr/>
+              <w:t xml:space="preserve">5/5</w:t>
+            </w:r>
+          </w:p>
+        </w:tc>
+        <w:tc>
+          <w:tcPr>
+            <w:tcW w:w="1814" w:type="dxa"/>
+          </w:tcPr>
+          <w:p>
+            <w:pPr>
+              <w:pStyle w:val="TableText"/>
+            </w:pPr>
+            <w:r>
+              <w:rPr/>
+              <w:t xml:space="preserve">5/5</w:t>
+            </w:r>
+          </w:p>
+        </w:tc>
+      </w:tr>
+    </w:tbl>
+    <w:p>
+      <w:pPr/>
+      <w:r>
+        <w:rPr/>
+        <w:t xml:space="preserve">F1, F2 và F4 đo FAILSAFE từ heartbeat cuối với mã nguyên nhân 3; F3 và F5 lấy inference cuối với mã 10. Đợt E4 mới có 25/25 lượt được chấp nhận trong chiến dịch đầy đủ, còn tập gốc ghép thêm cửa sổ ngắn F4/F5. Riêng F4 gốc gồm 2/5 lượt đầy đủ và 5/9 lượt bổ sung; chuyển đầu tiên trộn mã 3 với mã 9. Đợt mới có chuyển đầu tiên F4 theo mã 3, vì vậy không gộp các mốc tham chiếu để diễn giải. Thời gian ánh xạ từ lúc tiêm lỗi được tách khỏi thời gian MCU-local vì còn phụ thuộc phép khớp đồng hồ, trong khi MCU-local sử dụng mốc nhận heartbeat hoặc inference trên cùng bộ đếm của STM32. Có 25/25 lượt hợp lệ quan sát phục hồi, 0 lượt thiếu mốc FAILSAFE và 0 chuyển sai trong cửa sổ đã đo. Đây chưa phải giới hạn xác suất chuyển sai.</w:t>
+      </w:r>
+    </w:p>
+    <w:p>
+      <w:pPr/>
+      <w:r>
+        <w:rPr/>
+        <w:t xml:space="preserve">Bảng đo lại D. Đối chiếu logic analyzer, gốc ngày 12/10/2026; số lượt ở đây là capture phân tích được, chưa xác nhận toàn bộ điều kiện thu thập.</w:t>
+      </w:r>
+    </w:p>
+    <w:tbl>
+      <w:tblPr>
+        <w:tblW w:w="9071" w:type="dxa"/>
+        <w:tblBorders>
+          <w:top w:val="single" w:sz="4" w:color="808080"/>
+          <w:left w:val="single" w:sz="4" w:color="808080"/>
+          <w:bottom w:val="single" w:sz="4" w:color="808080"/>
+          <w:right w:val="single" w:sz="4" w:color="808080"/>
+          <w:insideH w:val="single" w:sz="4" w:color="808080"/>
+          <w:insideV w:val="single" w:sz="4" w:color="808080"/>
+        </w:tblBorders>
+        <w:tblLayout w:type="fixed"/>
+        <w:tblCellMar>
+          <w:top w:w="60" w:type="dxa"/>
+          <w:left w:w="115" w:type="dxa"/>
+          <w:bottom w:w="60" w:type="dxa"/>
+          <w:right w:w="115" w:type="dxa"/>
+        </w:tblCellMar>
+      </w:tblPr>
+      <w:tblGrid>
+        <w:gridCol w:w="1814"/>
+        <w:gridCol w:w="1814"/>
+        <w:gridCol w:w="1814"/>
+        <w:gridCol w:w="1814"/>
+        <w:gridCol w:w="1814"/>
+      </w:tblGrid>
+      <w:tr>
+        <w:trPr>
+          <w:cantSplit/>
+          <w:tblHeader/>
+        </w:trPr>
+        <w:tc>
+          <w:tcPr>
+            <w:tcW w:w="1814" w:type="dxa"/>
+            <w:shd w:fill="E8EEF4"/>
+            <w:vAlign w:val="center"/>
+          </w:tcPr>
+          <w:p>
+            <w:pPr>
+              <w:pStyle w:val="TableText"/>
+            </w:pPr>
+            <w:r>
+              <w:rPr>
+                <w:b/>
+              </w:rPr>
+              <w:t xml:space="preserve">Phép đo / điều kiện</w:t>
+            </w:r>
+          </w:p>
+        </w:tc>
+        <w:tc>
+          <w:tcPr>
+            <w:tcW w:w="1814" w:type="dxa"/>
+            <w:shd w:fill="E8EEF4"/>
+            <w:vAlign w:val="center"/>
+          </w:tcPr>
+          <w:p>
+            <w:pPr>
+              <w:pStyle w:val="TableText"/>
+            </w:pPr>
+            <w:r>
+              <w:rPr>
+                <w:b/>
+              </w:rPr>
+              <w:t xml:space="preserve">Gốc</w:t>
+            </w:r>
+          </w:p>
+        </w:tc>
+        <w:tc>
+          <w:tcPr>
+            <w:tcW w:w="1814" w:type="dxa"/>
+            <w:shd w:fill="E8EEF4"/>
+            <w:vAlign w:val="center"/>
+          </w:tcPr>
+          <w:p>
+            <w:pPr>
+              <w:pStyle w:val="TableText"/>
+            </w:pPr>
+            <w:r>
+              <w:rPr>
+                <w:b/>
+              </w:rPr>
+              <w:t xml:space="preserve">Đo lại</w:t>
+            </w:r>
+          </w:p>
+        </w:tc>
+        <w:tc>
+          <w:tcPr>
+            <w:tcW w:w="1814" w:type="dxa"/>
+            <w:shd w:fill="E8EEF4"/>
+            <w:vAlign w:val="center"/>
+          </w:tcPr>
+          <w:p>
+            <w:pPr>
+              <w:pStyle w:val="TableText"/>
+            </w:pPr>
+            <w:r>
+              <w:rPr>
+                <w:b/>
+              </w:rPr>
+              <w:t xml:space="preserve">Hợp lệ gốc</w:t>
+            </w:r>
+          </w:p>
+        </w:tc>
+        <w:tc>
+          <w:tcPr>
+            <w:tcW w:w="1814" w:type="dxa"/>
+            <w:shd w:fill="E8EEF4"/>
+            <w:vAlign w:val="center"/>
+          </w:tcPr>
+          <w:p>
+            <w:pPr>
+              <w:pStyle w:val="TableText"/>
+            </w:pPr>
+            <w:r>
+              <w:rPr>
+                <w:b/>
+              </w:rPr>
+              <w:t xml:space="preserve">Hợp lệ đo lại</w:t>
+            </w:r>
+          </w:p>
+        </w:tc>
+      </w:tr>
+      <w:tr>
+        <w:trPr>
+          <w:cantSplit/>
+        </w:trPr>
+        <w:tc>
+          <w:tcPr>
+            <w:tcW w:w="1814" w:type="dxa"/>
+          </w:tcPr>
+          <w:p>
+            <w:pPr>
+              <w:pStyle w:val="TableText"/>
+            </w:pPr>
+            <w:r>
+              <w:rPr/>
+              <w:t xml:space="preserve">Final HEARTBEAT</w:t>
+            </w:r>
+          </w:p>
+        </w:tc>
+        <w:tc>
+          <w:tcPr>
+            <w:tcW w:w="1814" w:type="dxa"/>
+          </w:tcPr>
+          <w:p>
+            <w:pPr>
+              <w:pStyle w:val="TableText"/>
+            </w:pPr>
+            <w:r>
+              <w:rPr/>
+              <w:t xml:space="preserve">10</w:t>
+            </w:r>
+          </w:p>
+        </w:tc>
+        <w:tc>
+          <w:tcPr>
+            <w:tcW w:w="1814" w:type="dxa"/>
+          </w:tcPr>
+          <w:p>
+            <w:pPr>
+              <w:pStyle w:val="TableText"/>
+            </w:pPr>
+            <w:r>
+              <w:rPr/>
+              <w:t xml:space="preserve">15</w:t>
+            </w:r>
+          </w:p>
+        </w:tc>
+        <w:tc>
+          <w:tcPr>
+            <w:tcW w:w="1814" w:type="dxa"/>
+          </w:tcPr>
+          <w:p>
+            <w:pPr>
+              <w:pStyle w:val="TableText"/>
+            </w:pPr>
+            <w:r>
+              <w:rPr/>
+              <w:t xml:space="preserve">15/15</w:t>
+            </w:r>
+          </w:p>
+        </w:tc>
+        <w:tc>
+          <w:tcPr>
+            <w:tcW w:w="1814" w:type="dxa"/>
+          </w:tcPr>
+          <w:p>
+            <w:pPr>
+              <w:pStyle w:val="TableText"/>
+            </w:pPr>
+            <w:r>
+              <w:rPr/>
+              <w:t xml:space="preserve">15/15</w:t>
+            </w:r>
+          </w:p>
+        </w:tc>
+      </w:tr>
+      <w:tr>
+        <w:trPr>
+          <w:cantSplit/>
+        </w:trPr>
+        <w:tc>
+          <w:tcPr>
+            <w:tcW w:w="1814" w:type="dxa"/>
+          </w:tcPr>
+          <w:p>
+            <w:pPr>
+              <w:pStyle w:val="TableText"/>
+            </w:pPr>
+            <w:r>
+              <w:rPr/>
+              <w:t xml:space="preserve">Delta min (µs)</w:t>
+            </w:r>
+          </w:p>
+        </w:tc>
+        <w:tc>
+          <w:tcPr>
+            <w:tcW w:w="1814" w:type="dxa"/>
+          </w:tcPr>
+          <w:p>
+            <w:pPr>
+              <w:pStyle w:val="TableText"/>
+            </w:pPr>
+            <w:r>
+              <w:rPr/>
+              <w:t xml:space="preserve">47.5243</w:t>
+            </w:r>
+          </w:p>
+        </w:tc>
+        <w:tc>
+          <w:tcPr>
+            <w:tcW w:w="1814" w:type="dxa"/>
+          </w:tcPr>
+          <w:p>
+            <w:pPr>
+              <w:pStyle w:val="TableText"/>
+            </w:pPr>
+            <w:r>
+              <w:rPr/>
+              <w:t xml:space="preserve">58.6493</w:t>
+            </w:r>
+          </w:p>
+        </w:tc>
+        <w:tc>
+          <w:tcPr>
+            <w:tcW w:w="1814" w:type="dxa"/>
+          </w:tcPr>
+          <w:p>
+            <w:pPr>
+              <w:pStyle w:val="TableText"/>
+            </w:pPr>
+            <w:r>
+              <w:rPr/>
+              <w:t xml:space="preserve">15/15</w:t>
+            </w:r>
+          </w:p>
+        </w:tc>
+        <w:tc>
+          <w:tcPr>
+            <w:tcW w:w="1814" w:type="dxa"/>
+          </w:tcPr>
+          <w:p>
+            <w:pPr>
+              <w:pStyle w:val="TableText"/>
+            </w:pPr>
+            <w:r>
+              <w:rPr/>
+              <w:t xml:space="preserve">15/15</w:t>
+            </w:r>
+          </w:p>
+        </w:tc>
+      </w:tr>
+      <w:tr>
+        <w:trPr>
+          <w:cantSplit/>
+        </w:trPr>
+        <w:tc>
+          <w:tcPr>
+            <w:tcW w:w="1814" w:type="dxa"/>
+          </w:tcPr>
+          <w:p>
+            <w:pPr>
+              <w:pStyle w:val="TableText"/>
+            </w:pPr>
+            <w:r>
+              <w:rPr/>
+              <w:t xml:space="preserve">Delta max (µs)</w:t>
+            </w:r>
+          </w:p>
+        </w:tc>
+        <w:tc>
+          <w:tcPr>
+            <w:tcW w:w="1814" w:type="dxa"/>
+          </w:tcPr>
+          <w:p>
+            <w:pPr>
+              <w:pStyle w:val="TableText"/>
+            </w:pPr>
+            <w:r>
+              <w:rPr/>
+              <w:t xml:space="preserve">67.6493</w:t>
+            </w:r>
+          </w:p>
+        </w:tc>
+        <w:tc>
+          <w:tcPr>
+            <w:tcW w:w="1814" w:type="dxa"/>
+          </w:tcPr>
+          <w:p>
+            <w:pPr>
+              <w:pStyle w:val="TableText"/>
+            </w:pPr>
+            <w:r>
+              <w:rPr/>
+              <w:t xml:space="preserve">102.649</w:t>
+            </w:r>
+          </w:p>
+        </w:tc>
+        <w:tc>
+          <w:tcPr>
+            <w:tcW w:w="1814" w:type="dxa"/>
+          </w:tcPr>
+          <w:p>
+            <w:pPr>
+              <w:pStyle w:val="TableText"/>
+            </w:pPr>
+            <w:r>
+              <w:rPr/>
+              <w:t xml:space="preserve">15/15</w:t>
+            </w:r>
+          </w:p>
+        </w:tc>
+        <w:tc>
+          <w:tcPr>
+            <w:tcW w:w="1814" w:type="dxa"/>
+          </w:tcPr>
+          <w:p>
+            <w:pPr>
+              <w:pStyle w:val="TableText"/>
+            </w:pPr>
+            <w:r>
+              <w:rPr/>
+              <w:t xml:space="preserve">15/15</w:t>
+            </w:r>
+          </w:p>
+        </w:tc>
+      </w:tr>
+      <w:tr>
+        <w:trPr>
+          <w:cantSplit/>
+        </w:trPr>
+        <w:tc>
+          <w:tcPr>
+            <w:tcW w:w="1814" w:type="dxa"/>
+          </w:tcPr>
+          <w:p>
+            <w:pPr>
+              <w:pStyle w:val="TableText"/>
+            </w:pPr>
+            <w:r>
+              <w:rPr/>
+              <w:t xml:space="preserve">F1 marker min (ms)</w:t>
+            </w:r>
+          </w:p>
+        </w:tc>
+        <w:tc>
+          <w:tcPr>
+            <w:tcW w:w="1814" w:type="dxa"/>
+          </w:tcPr>
+          <w:p>
+            <w:pPr>
+              <w:pStyle w:val="TableText"/>
+            </w:pPr>
+            <w:r>
+              <w:rPr/>
+              <w:t xml:space="preserve">86.9382</w:t>
+            </w:r>
+          </w:p>
+        </w:tc>
+        <w:tc>
+          <w:tcPr>
+            <w:tcW w:w="1814" w:type="dxa"/>
+          </w:tcPr>
+          <w:p>
+            <w:pPr>
+              <w:pStyle w:val="TableText"/>
+            </w:pPr>
+            <w:r>
+              <w:rPr/>
+              <w:t xml:space="preserve">82.6529</w:t>
+            </w:r>
+          </w:p>
+        </w:tc>
+        <w:tc>
+          <w:tcPr>
+            <w:tcW w:w="1814" w:type="dxa"/>
+          </w:tcPr>
+          <w:p>
+            <w:pPr>
+              <w:pStyle w:val="TableText"/>
+            </w:pPr>
+            <w:r>
+              <w:rPr/>
+              <w:t xml:space="preserve">15/15</w:t>
+            </w:r>
+          </w:p>
+        </w:tc>
+        <w:tc>
+          <w:tcPr>
+            <w:tcW w:w="1814" w:type="dxa"/>
+          </w:tcPr>
+          <w:p>
+            <w:pPr>
+              <w:pStyle w:val="TableText"/>
+            </w:pPr>
+            <w:r>
+              <w:rPr/>
+              <w:t xml:space="preserve">15/15</w:t>
+            </w:r>
+          </w:p>
+        </w:tc>
+      </w:tr>
+      <w:tr>
+        <w:trPr>
+          <w:cantSplit/>
+        </w:trPr>
+        <w:tc>
+          <w:tcPr>
+            <w:tcW w:w="1814" w:type="dxa"/>
+          </w:tcPr>
+          <w:p>
+            <w:pPr>
+              <w:pStyle w:val="TableText"/>
+            </w:pPr>
+            <w:r>
+              <w:rPr/>
+              <w:t xml:space="preserve">F1 marker max (ms)</w:t>
+            </w:r>
+          </w:p>
+        </w:tc>
+        <w:tc>
+          <w:tcPr>
+            <w:tcW w:w="1814" w:type="dxa"/>
+          </w:tcPr>
+          <w:p>
+            <w:pPr>
+              <w:pStyle w:val="TableText"/>
+            </w:pPr>
+            <w:r>
+              <w:rPr/>
+              <w:t xml:space="preserve">95.541</w:t>
+            </w:r>
+          </w:p>
+        </w:tc>
+        <w:tc>
+          <w:tcPr>
+            <w:tcW w:w="1814" w:type="dxa"/>
+          </w:tcPr>
+          <w:p>
+            <w:pPr>
+              <w:pStyle w:val="TableText"/>
+            </w:pPr>
+            <w:r>
+              <w:rPr/>
+              <w:t xml:space="preserve">90.6836</w:t>
+            </w:r>
+          </w:p>
+        </w:tc>
+        <w:tc>
+          <w:tcPr>
+            <w:tcW w:w="1814" w:type="dxa"/>
+          </w:tcPr>
+          <w:p>
+            <w:pPr>
+              <w:pStyle w:val="TableText"/>
+            </w:pPr>
+            <w:r>
+              <w:rPr/>
+              <w:t xml:space="preserve">15/15</w:t>
+            </w:r>
+          </w:p>
+        </w:tc>
+        <w:tc>
+          <w:tcPr>
+            <w:tcW w:w="1814" w:type="dxa"/>
+          </w:tcPr>
+          <w:p>
+            <w:pPr>
+              <w:pStyle w:val="TableText"/>
+            </w:pPr>
+            <w:r>
+              <w:rPr/>
+              <w:t xml:space="preserve">15/15</w:t>
+            </w:r>
+          </w:p>
+        </w:tc>
+      </w:tr>
+      <w:tr>
+        <w:trPr>
+          <w:cantSplit/>
+        </w:trPr>
+        <w:tc>
+          <w:tcPr>
+            <w:tcW w:w="1814" w:type="dxa"/>
+          </w:tcPr>
+          <w:p>
+            <w:pPr>
+              <w:pStyle w:val="TableText"/>
+            </w:pPr>
+            <w:r>
+              <w:rPr/>
+              <w:t xml:space="preserve">F2 marker min (ms)</w:t>
+            </w:r>
+          </w:p>
+        </w:tc>
+        <w:tc>
+          <w:tcPr>
+            <w:tcW w:w="1814" w:type="dxa"/>
+          </w:tcPr>
+          <w:p>
+            <w:pPr>
+              <w:pStyle w:val="TableText"/>
+            </w:pPr>
+            <w:r>
+              <w:rPr/>
+              <w:t xml:space="preserve">86.947</w:t>
+            </w:r>
+          </w:p>
+        </w:tc>
+        <w:tc>
+          <w:tcPr>
+            <w:tcW w:w="1814" w:type="dxa"/>
+          </w:tcPr>
+          <w:p>
+            <w:pPr>
+              <w:pStyle w:val="TableText"/>
+            </w:pPr>
+            <w:r>
+              <w:rPr/>
+              <w:t xml:space="preserve">83.1966</w:t>
+            </w:r>
+          </w:p>
+        </w:tc>
+        <w:tc>
+          <w:tcPr>
+            <w:tcW w:w="1814" w:type="dxa"/>
+          </w:tcPr>
+          <w:p>
+            <w:pPr>
+              <w:pStyle w:val="TableText"/>
+            </w:pPr>
+            <w:r>
+              <w:rPr/>
+              <w:t xml:space="preserve">15/15</w:t>
+            </w:r>
+          </w:p>
+        </w:tc>
+        <w:tc>
+          <w:tcPr>
+            <w:tcW w:w="1814" w:type="dxa"/>
+          </w:tcPr>
+          <w:p>
+            <w:pPr>
+              <w:pStyle w:val="TableText"/>
+            </w:pPr>
+            <w:r>
+              <w:rPr/>
+              <w:t xml:space="preserve">15/15</w:t>
+            </w:r>
+          </w:p>
+        </w:tc>
+      </w:tr>
+      <w:tr>
+        <w:trPr>
+          <w:cantSplit/>
+        </w:trPr>
+        <w:tc>
+          <w:tcPr>
+            <w:tcW w:w="1814" w:type="dxa"/>
+          </w:tcPr>
+          <w:p>
+            <w:pPr>
+              <w:pStyle w:val="TableText"/>
+            </w:pPr>
+            <w:r>
+              <w:rPr/>
+              <w:t xml:space="preserve">F2 marker max (ms)</w:t>
+            </w:r>
+          </w:p>
+        </w:tc>
+        <w:tc>
+          <w:tcPr>
+            <w:tcW w:w="1814" w:type="dxa"/>
+          </w:tcPr>
+          <w:p>
+            <w:pPr>
+              <w:pStyle w:val="TableText"/>
+            </w:pPr>
+            <w:r>
+              <w:rPr/>
+              <w:t xml:space="preserve">98.6757</w:t>
+            </w:r>
+          </w:p>
+        </w:tc>
+        <w:tc>
+          <w:tcPr>
+            <w:tcW w:w="1814" w:type="dxa"/>
+          </w:tcPr>
+          <w:p>
+            <w:pPr>
+              <w:pStyle w:val="TableText"/>
+            </w:pPr>
+            <w:r>
+              <w:rPr/>
+              <w:t xml:space="preserve">93.7774</w:t>
+            </w:r>
+          </w:p>
+        </w:tc>
+        <w:tc>
+          <w:tcPr>
+            <w:tcW w:w="1814" w:type="dxa"/>
+          </w:tcPr>
+          <w:p>
+            <w:pPr>
+              <w:pStyle w:val="TableText"/>
+            </w:pPr>
+            <w:r>
+              <w:rPr/>
+              <w:t xml:space="preserve">15/15</w:t>
+            </w:r>
+          </w:p>
+        </w:tc>
+        <w:tc>
+          <w:tcPr>
+            <w:tcW w:w="1814" w:type="dxa"/>
+          </w:tcPr>
+          <w:p>
+            <w:pPr>
+              <w:pStyle w:val="TableText"/>
+            </w:pPr>
+            <w:r>
+              <w:rPr/>
+              <w:t xml:space="preserve">15/15</w:t>
+            </w:r>
+          </w:p>
+        </w:tc>
+      </w:tr>
+      <w:tr>
+        <w:trPr>
+          <w:cantSplit/>
+        </w:trPr>
+        <w:tc>
+          <w:tcPr>
+            <w:tcW w:w="1814" w:type="dxa"/>
+          </w:tcPr>
+          <w:p>
+            <w:pPr>
+              <w:pStyle w:val="TableText"/>
+            </w:pPr>
+            <w:r>
+              <w:rPr/>
+              <w:t xml:space="preserve">F4 marker min (ms)</w:t>
+            </w:r>
+          </w:p>
+        </w:tc>
+        <w:tc>
+          <w:tcPr>
+            <w:tcW w:w="1814" w:type="dxa"/>
+          </w:tcPr>
+          <w:p>
+            <w:pPr>
+              <w:pStyle w:val="TableText"/>
+            </w:pPr>
+            <w:r>
+              <w:rPr/>
+              <w:t xml:space="preserve">82.8516</w:t>
+            </w:r>
+          </w:p>
+        </w:tc>
+        <w:tc>
+          <w:tcPr>
+            <w:tcW w:w="1814" w:type="dxa"/>
+          </w:tcPr>
+          <w:p>
+            <w:pPr>
+              <w:pStyle w:val="TableText"/>
+            </w:pPr>
+            <w:r>
+              <w:rPr/>
+              <w:t xml:space="preserve">89.9435</w:t>
+            </w:r>
+          </w:p>
+        </w:tc>
+        <w:tc>
+          <w:tcPr>
+            <w:tcW w:w="1814" w:type="dxa"/>
+          </w:tcPr>
+          <w:p>
+            <w:pPr>
+              <w:pStyle w:val="TableText"/>
+            </w:pPr>
+            <w:r>
+              <w:rPr/>
+              <w:t xml:space="preserve">15/15</w:t>
+            </w:r>
+          </w:p>
+        </w:tc>
+        <w:tc>
+          <w:tcPr>
+            <w:tcW w:w="1814" w:type="dxa"/>
+          </w:tcPr>
+          <w:p>
+            <w:pPr>
+              <w:pStyle w:val="TableText"/>
+            </w:pPr>
+            <w:r>
+              <w:rPr/>
+              <w:t xml:space="preserve">15/15</w:t>
+            </w:r>
+          </w:p>
+        </w:tc>
+      </w:tr>
+      <w:tr>
+        <w:trPr>
+          <w:cantSplit/>
+        </w:trPr>
+        <w:tc>
+          <w:tcPr>
+            <w:tcW w:w="1814" w:type="dxa"/>
+          </w:tcPr>
+          <w:p>
+            <w:pPr>
+              <w:pStyle w:val="TableText"/>
+            </w:pPr>
+            <w:r>
+              <w:rPr/>
+              <w:t xml:space="preserve">F4 marker max (ms)</w:t>
+            </w:r>
+          </w:p>
+        </w:tc>
+        <w:tc>
+          <w:tcPr>
+            <w:tcW w:w="1814" w:type="dxa"/>
+          </w:tcPr>
+          <w:p>
+            <w:pPr>
+              <w:pStyle w:val="TableText"/>
+            </w:pPr>
+            <w:r>
+              <w:rPr/>
+              <w:t xml:space="preserve">91.302</w:t>
+            </w:r>
+          </w:p>
+        </w:tc>
+        <w:tc>
+          <w:tcPr>
+            <w:tcW w:w="1814" w:type="dxa"/>
+          </w:tcPr>
+          <w:p>
+            <w:pPr>
+              <w:pStyle w:val="TableText"/>
+            </w:pPr>
+            <w:r>
+              <w:rPr/>
+              <w:t xml:space="preserve">99.0391</w:t>
+            </w:r>
+          </w:p>
+        </w:tc>
+        <w:tc>
+          <w:tcPr>
+            <w:tcW w:w="1814" w:type="dxa"/>
+          </w:tcPr>
+          <w:p>
+            <w:pPr>
+              <w:pStyle w:val="TableText"/>
+            </w:pPr>
+            <w:r>
+              <w:rPr/>
+              <w:t xml:space="preserve">15/15</w:t>
+            </w:r>
+          </w:p>
+        </w:tc>
+        <w:tc>
+          <w:tcPr>
+            <w:tcW w:w="1814" w:type="dxa"/>
+          </w:tcPr>
+          <w:p>
+            <w:pPr>
+              <w:pStyle w:val="TableText"/>
+            </w:pPr>
+            <w:r>
+              <w:rPr/>
+              <w:t xml:space="preserve">15/15</w:t>
+            </w:r>
+          </w:p>
+        </w:tc>
+      </w:tr>
+    </w:tbl>
+    <w:p>
+      <w:pPr/>
+      <w:r>
+        <w:rPr/>
+        <w:t xml:space="preserve">Logic analyzer dùng fx2lafw và ST-LINK cùng nối USB trên Pi; capture chạy ngay trên hệ thống được đo, ghim CPU 3. Tần số lấy mẫu là 8 MHz. Chu kỳ danh định 125 ns chưa được hiệu chuẩn tuyệt đối; delta lấy khoảng từ cuối byte UART tới khi cả hai GPIO xuống thấp trừ khoảng từ heartbeat được nhận tới sự kiện FAILSAFE. Chỉ các capture kết thúc bằng heartbeat phù hợp được dùng cho delta; mốc marker được giữ riêng trong bảng. Hoạt động USB và CPU của bộ thu là khác biệt phương pháp, chưa thể quy độ dịch delta cho firmware.</w:t>
+      </w:r>
+    </w:p>
+    <w:p>
+      <w:pPr/>
+      <w:r>
+        <w:rPr/>
+        <w:t xml:space="preserve">Bảng đo lại E. PS1 trên UART vật lý sau sửa dây; không có đối chứng PS1 gốc.</w:t>
+      </w:r>
+    </w:p>
+    <w:tbl>
+      <w:tblPr>
+        <w:tblW w:w="9071" w:type="dxa"/>
+        <w:tblBorders>
+          <w:top w:val="single" w:sz="4" w:color="808080"/>
+          <w:left w:val="single" w:sz="4" w:color="808080"/>
+          <w:bottom w:val="single" w:sz="4" w:color="808080"/>
+          <w:right w:val="single" w:sz="4" w:color="808080"/>
+          <w:insideH w:val="single" w:sz="4" w:color="808080"/>
+          <w:insideV w:val="single" w:sz="4" w:color="808080"/>
+        </w:tblBorders>
+        <w:tblLayout w:type="fixed"/>
+        <w:tblCellMar>
+          <w:top w:w="60" w:type="dxa"/>
+          <w:left w:w="115" w:type="dxa"/>
+          <w:bottom w:w="60" w:type="dxa"/>
+          <w:right w:w="115" w:type="dxa"/>
+        </w:tblCellMar>
+      </w:tblPr>
+      <w:tblGrid>
+        <w:gridCol w:w="1814"/>
+        <w:gridCol w:w="1814"/>
+        <w:gridCol w:w="1814"/>
+        <w:gridCol w:w="1814"/>
+        <w:gridCol w:w="1814"/>
+      </w:tblGrid>
+      <w:tr>
+        <w:trPr>
+          <w:cantSplit/>
+          <w:tblHeader/>
+        </w:trPr>
+        <w:tc>
+          <w:tcPr>
+            <w:tcW w:w="1814" w:type="dxa"/>
+            <w:shd w:fill="E8EEF4"/>
+            <w:vAlign w:val="center"/>
+          </w:tcPr>
+          <w:p>
+            <w:pPr>
+              <w:pStyle w:val="TableText"/>
+            </w:pPr>
+            <w:r>
+              <w:rPr>
+                <w:b/>
+              </w:rPr>
+              <w:t xml:space="preserve">Phép đo / điều kiện</w:t>
+            </w:r>
+          </w:p>
+        </w:tc>
+        <w:tc>
+          <w:tcPr>
+            <w:tcW w:w="1814" w:type="dxa"/>
+            <w:shd w:fill="E8EEF4"/>
+            <w:vAlign w:val="center"/>
+          </w:tcPr>
+          <w:p>
+            <w:pPr>
+              <w:pStyle w:val="TableText"/>
+            </w:pPr>
+            <w:r>
+              <w:rPr>
+                <w:b/>
+              </w:rPr>
+              <w:t xml:space="preserve">Gốc</w:t>
+            </w:r>
+          </w:p>
+        </w:tc>
+        <w:tc>
+          <w:tcPr>
+            <w:tcW w:w="1814" w:type="dxa"/>
+            <w:shd w:fill="E8EEF4"/>
+            <w:vAlign w:val="center"/>
+          </w:tcPr>
+          <w:p>
+            <w:pPr>
+              <w:pStyle w:val="TableText"/>
+            </w:pPr>
+            <w:r>
+              <w:rPr>
+                <w:b/>
+              </w:rPr>
+              <w:t xml:space="preserve">Đo lại</w:t>
+            </w:r>
+          </w:p>
+        </w:tc>
+        <w:tc>
+          <w:tcPr>
+            <w:tcW w:w="1814" w:type="dxa"/>
+            <w:shd w:fill="E8EEF4"/>
+            <w:vAlign w:val="center"/>
+          </w:tcPr>
+          <w:p>
+            <w:pPr>
+              <w:pStyle w:val="TableText"/>
+            </w:pPr>
+            <w:r>
+              <w:rPr>
+                <w:b/>
+              </w:rPr>
+              <w:t xml:space="preserve">Hợp lệ gốc</w:t>
+            </w:r>
+          </w:p>
+        </w:tc>
+        <w:tc>
+          <w:tcPr>
+            <w:tcW w:w="1814" w:type="dxa"/>
+            <w:shd w:fill="E8EEF4"/>
+            <w:vAlign w:val="center"/>
+          </w:tcPr>
+          <w:p>
+            <w:pPr>
+              <w:pStyle w:val="TableText"/>
+            </w:pPr>
+            <w:r>
+              <w:rPr>
+                <w:b/>
+              </w:rPr>
+              <w:t xml:space="preserve">Hợp lệ đo lại</w:t>
+            </w:r>
+          </w:p>
+        </w:tc>
+      </w:tr>
+      <w:tr>
+        <w:trPr>
+          <w:cantSplit/>
+        </w:trPr>
+        <w:tc>
+          <w:tcPr>
+            <w:tcW w:w="1814" w:type="dxa"/>
+          </w:tcPr>
+          <w:p>
+            <w:pPr>
+              <w:pStyle w:val="TableText"/>
+            </w:pPr>
+            <w:r>
+              <w:rPr/>
+              <w:t xml:space="preserve">Bridge sent</w:t>
+            </w:r>
+          </w:p>
+        </w:tc>
+        <w:tc>
+          <w:tcPr>
+            <w:tcW w:w="1814" w:type="dxa"/>
+          </w:tcPr>
+          <w:p>
+            <w:pPr>
+              <w:pStyle w:val="TableText"/>
+            </w:pPr>
+            <w:r>
+              <w:rPr/>
+              <w:t xml:space="preserve">—</w:t>
+            </w:r>
+          </w:p>
+        </w:tc>
+        <w:tc>
+          <w:tcPr>
+            <w:tcW w:w="1814" w:type="dxa"/>
+          </w:tcPr>
+          <w:p>
+            <w:pPr>
+              <w:pStyle w:val="TableText"/>
+            </w:pPr>
+            <w:r>
+              <w:rPr/>
+              <w:t xml:space="preserve">602</w:t>
+            </w:r>
+          </w:p>
+        </w:tc>
+        <w:tc>
+          <w:tcPr>
+            <w:tcW w:w="1814" w:type="dxa"/>
+          </w:tcPr>
+          <w:p>
+            <w:pPr>
+              <w:pStyle w:val="TableText"/>
+            </w:pPr>
+            <w:r>
+              <w:rPr/>
+              <w:t xml:space="preserve">0/0</w:t>
+            </w:r>
+          </w:p>
+        </w:tc>
+        <w:tc>
+          <w:tcPr>
+            <w:tcW w:w="1814" w:type="dxa"/>
+          </w:tcPr>
+          <w:p>
+            <w:pPr>
+              <w:pStyle w:val="TableText"/>
+            </w:pPr>
+            <w:r>
+              <w:rPr/>
+              <w:t xml:space="preserve">1/1</w:t>
+            </w:r>
+          </w:p>
+        </w:tc>
+      </w:tr>
+      <w:tr>
+        <w:trPr>
+          <w:cantSplit/>
+        </w:trPr>
+        <w:tc>
+          <w:tcPr>
+            <w:tcW w:w="1814" w:type="dxa"/>
+          </w:tcPr>
+          <w:p>
+            <w:pPr>
+              <w:pStyle w:val="TableText"/>
+            </w:pPr>
+            <w:r>
+              <w:rPr/>
+              <w:t xml:space="preserve">MCU status</w:t>
+            </w:r>
+          </w:p>
+        </w:tc>
+        <w:tc>
+          <w:tcPr>
+            <w:tcW w:w="1814" w:type="dxa"/>
+          </w:tcPr>
+          <w:p>
+            <w:pPr>
+              <w:pStyle w:val="TableText"/>
+            </w:pPr>
+            <w:r>
+              <w:rPr/>
+              <w:t xml:space="preserve">—</w:t>
+            </w:r>
+          </w:p>
+        </w:tc>
+        <w:tc>
+          <w:tcPr>
+            <w:tcW w:w="1814" w:type="dxa"/>
+          </w:tcPr>
+          <w:p>
+            <w:pPr>
+              <w:pStyle w:val="TableText"/>
+            </w:pPr>
+            <w:r>
+              <w:rPr/>
+              <w:t xml:space="preserve">616</w:t>
+            </w:r>
+          </w:p>
+        </w:tc>
+        <w:tc>
+          <w:tcPr>
+            <w:tcW w:w="1814" w:type="dxa"/>
+          </w:tcPr>
+          <w:p>
+            <w:pPr>
+              <w:pStyle w:val="TableText"/>
+            </w:pPr>
+            <w:r>
+              <w:rPr/>
+              <w:t xml:space="preserve">0/0</w:t>
+            </w:r>
+          </w:p>
+        </w:tc>
+        <w:tc>
+          <w:tcPr>
+            <w:tcW w:w="1814" w:type="dxa"/>
+          </w:tcPr>
+          <w:p>
+            <w:pPr>
+              <w:pStyle w:val="TableText"/>
+            </w:pPr>
+            <w:r>
+              <w:rPr/>
+              <w:t xml:space="preserve">1/1</w:t>
+            </w:r>
+          </w:p>
+        </w:tc>
+      </w:tr>
+      <w:tr>
+        <w:trPr>
+          <w:cantSplit/>
+        </w:trPr>
+        <w:tc>
+          <w:tcPr>
+            <w:tcW w:w="1814" w:type="dxa"/>
+          </w:tcPr>
+          <w:p>
+            <w:pPr>
+              <w:pStyle w:val="TableText"/>
+            </w:pPr>
+            <w:r>
+              <w:rPr/>
+              <w:t xml:space="preserve">Echo accepted</w:t>
+            </w:r>
+          </w:p>
+        </w:tc>
+        <w:tc>
+          <w:tcPr>
+            <w:tcW w:w="1814" w:type="dxa"/>
+          </w:tcPr>
+          <w:p>
+            <w:pPr>
+              <w:pStyle w:val="TableText"/>
+            </w:pPr>
+            <w:r>
+              <w:rPr/>
+              <w:t xml:space="preserve">—</w:t>
+            </w:r>
+          </w:p>
+        </w:tc>
+        <w:tc>
+          <w:tcPr>
+            <w:tcW w:w="1814" w:type="dxa"/>
+          </w:tcPr>
+          <w:p>
+            <w:pPr>
+              <w:pStyle w:val="TableText"/>
+            </w:pPr>
+            <w:r>
+              <w:rPr/>
+              <w:t xml:space="preserve">62</w:t>
+            </w:r>
+          </w:p>
+        </w:tc>
+        <w:tc>
+          <w:tcPr>
+            <w:tcW w:w="1814" w:type="dxa"/>
+          </w:tcPr>
+          <w:p>
+            <w:pPr>
+              <w:pStyle w:val="TableText"/>
+            </w:pPr>
+            <w:r>
+              <w:rPr/>
+              <w:t xml:space="preserve">0/0</w:t>
+            </w:r>
+          </w:p>
+        </w:tc>
+        <w:tc>
+          <w:tcPr>
+            <w:tcW w:w="1814" w:type="dxa"/>
+          </w:tcPr>
+          <w:p>
+            <w:pPr>
+              <w:pStyle w:val="TableText"/>
+            </w:pPr>
+            <w:r>
+              <w:rPr/>
+              <w:t xml:space="preserve">1/1</w:t>
+            </w:r>
+          </w:p>
+        </w:tc>
+      </w:tr>
+      <w:tr>
+        <w:trPr>
+          <w:cantSplit/>
+        </w:trPr>
+        <w:tc>
+          <w:tcPr>
+            <w:tcW w:w="1814" w:type="dxa"/>
+          </w:tcPr>
+          <w:p>
+            <w:pPr>
+              <w:pStyle w:val="TableText"/>
+            </w:pPr>
+            <w:r>
+              <w:rPr/>
+              <w:t xml:space="preserve">Done-to-send P50 (µs)</w:t>
+            </w:r>
+          </w:p>
+        </w:tc>
+        <w:tc>
+          <w:tcPr>
+            <w:tcW w:w="1814" w:type="dxa"/>
+          </w:tcPr>
+          <w:p>
+            <w:pPr>
+              <w:pStyle w:val="TableText"/>
+            </w:pPr>
+            <w:r>
+              <w:rPr/>
+              <w:t xml:space="preserve">—</w:t>
+            </w:r>
+          </w:p>
+        </w:tc>
+        <w:tc>
+          <w:tcPr>
+            <w:tcW w:w="1814" w:type="dxa"/>
+          </w:tcPr>
+          <w:p>
+            <w:pPr>
+              <w:pStyle w:val="TableText"/>
+            </w:pPr>
+            <w:r>
+              <w:rPr/>
+              <w:t xml:space="preserve">21.833</w:t>
+            </w:r>
+          </w:p>
+        </w:tc>
+        <w:tc>
+          <w:tcPr>
+            <w:tcW w:w="1814" w:type="dxa"/>
+          </w:tcPr>
+          <w:p>
+            <w:pPr>
+              <w:pStyle w:val="TableText"/>
+            </w:pPr>
+            <w:r>
+              <w:rPr/>
+              <w:t xml:space="preserve">0/0</w:t>
+            </w:r>
+          </w:p>
+        </w:tc>
+        <w:tc>
+          <w:tcPr>
+            <w:tcW w:w="1814" w:type="dxa"/>
+          </w:tcPr>
+          <w:p>
+            <w:pPr>
+              <w:pStyle w:val="TableText"/>
+            </w:pPr>
+            <w:r>
+              <w:rPr/>
+              <w:t xml:space="preserve">1/1</w:t>
+            </w:r>
+          </w:p>
+        </w:tc>
+      </w:tr>
+      <w:tr>
+        <w:trPr>
+          <w:cantSplit/>
+        </w:trPr>
+        <w:tc>
+          <w:tcPr>
+            <w:tcW w:w="1814" w:type="dxa"/>
+          </w:tcPr>
+          <w:p>
+            <w:pPr>
+              <w:pStyle w:val="TableText"/>
+            </w:pPr>
+            <w:r>
+              <w:rPr/>
+              <w:t xml:space="preserve">Done-to-send P99 (µs)</w:t>
+            </w:r>
+          </w:p>
+        </w:tc>
+        <w:tc>
+          <w:tcPr>
+            <w:tcW w:w="1814" w:type="dxa"/>
+          </w:tcPr>
+          <w:p>
+            <w:pPr>
+              <w:pStyle w:val="TableText"/>
+            </w:pPr>
+            <w:r>
+              <w:rPr/>
+              <w:t xml:space="preserve">—</w:t>
+            </w:r>
+          </w:p>
+        </w:tc>
+        <w:tc>
+          <w:tcPr>
+            <w:tcW w:w="1814" w:type="dxa"/>
+          </w:tcPr>
+          <w:p>
+            <w:pPr>
+              <w:pStyle w:val="TableText"/>
+            </w:pPr>
+            <w:r>
+              <w:rPr/>
+              <w:t xml:space="preserve">42.278</w:t>
+            </w:r>
+          </w:p>
+        </w:tc>
+        <w:tc>
+          <w:tcPr>
+            <w:tcW w:w="1814" w:type="dxa"/>
+          </w:tcPr>
+          <w:p>
+            <w:pPr>
+              <w:pStyle w:val="TableText"/>
+            </w:pPr>
+            <w:r>
+              <w:rPr/>
+              <w:t xml:space="preserve">0/0</w:t>
+            </w:r>
+          </w:p>
+        </w:tc>
+        <w:tc>
+          <w:tcPr>
+            <w:tcW w:w="1814" w:type="dxa"/>
+          </w:tcPr>
+          <w:p>
+            <w:pPr>
+              <w:pStyle w:val="TableText"/>
+            </w:pPr>
+            <w:r>
+              <w:rPr/>
+              <w:t xml:space="preserve">1/1</w:t>
+            </w:r>
+          </w:p>
+        </w:tc>
+      </w:tr>
+      <w:tr>
+        <w:trPr>
+          <w:cantSplit/>
+        </w:trPr>
+        <w:tc>
+          <w:tcPr>
+            <w:tcW w:w="1814" w:type="dxa"/>
+          </w:tcPr>
+          <w:p>
+            <w:pPr>
+              <w:pStyle w:val="TableText"/>
+            </w:pPr>
+            <w:r>
+              <w:rPr/>
+              <w:t xml:space="preserve">Done-to-send max (µs)</w:t>
+            </w:r>
+          </w:p>
+        </w:tc>
+        <w:tc>
+          <w:tcPr>
+            <w:tcW w:w="1814" w:type="dxa"/>
+          </w:tcPr>
+          <w:p>
+            <w:pPr>
+              <w:pStyle w:val="TableText"/>
+            </w:pPr>
+            <w:r>
+              <w:rPr/>
+              <w:t xml:space="preserve">—</w:t>
+            </w:r>
+          </w:p>
+        </w:tc>
+        <w:tc>
+          <w:tcPr>
+            <w:tcW w:w="1814" w:type="dxa"/>
+          </w:tcPr>
+          <w:p>
+            <w:pPr>
+              <w:pStyle w:val="TableText"/>
+            </w:pPr>
+            <w:r>
+              <w:rPr/>
+              <w:t xml:space="preserve">595.723</w:t>
+            </w:r>
+          </w:p>
+        </w:tc>
+        <w:tc>
+          <w:tcPr>
+            <w:tcW w:w="1814" w:type="dxa"/>
+          </w:tcPr>
+          <w:p>
+            <w:pPr>
+              <w:pStyle w:val="TableText"/>
+            </w:pPr>
+            <w:r>
+              <w:rPr/>
+              <w:t xml:space="preserve">0/0</w:t>
+            </w:r>
+          </w:p>
+        </w:tc>
+        <w:tc>
+          <w:tcPr>
+            <w:tcW w:w="1814" w:type="dxa"/>
+          </w:tcPr>
+          <w:p>
+            <w:pPr>
+              <w:pStyle w:val="TableText"/>
+            </w:pPr>
+            <w:r>
+              <w:rPr/>
+              <w:t xml:space="preserve">1/1</w:t>
+            </w:r>
+          </w:p>
+        </w:tc>
+      </w:tr>
+    </w:tbl>
+    <w:p>
+      <w:pPr/>
+      <w:r>
+        <w:rPr/>
+        <w:t xml:space="preserve">Lần PS1 đầu không nhận byte nào từ STM32 vì jumper STM32-TX sang Pi được cắm nhầm chân; sau khi chuyển về chân vật lý 10 của Pi, nhóm chạy lại cửa sổ liên kết và giữ kết quả sau sửa dây. Echo nhận và chấp nhận đều là 62; các phân vị trong bảng đo từ hoàn tất inference tới gửi, không phải AoI xuyên miền. Tóm tắt thô vẫn giữ nhãn chưa kiểm chứng trên phần cứng; chấp nhận phân tích liên kết chưa chứng minh mọi thuộc tính firmware. S1 và PS1 bổ sung bằng chứng nạp và liên lạc, chưa xác nhận biên mất DMA, stack hoặc cận trễ truyền.</w:t>
+      </w:r>
+    </w:p>
+    <w:p>
+      <w:pPr/>
+      <w:r>
+        <w:rPr/>
+        <w:t xml:space="preserve">Bảng đo lại F. Vị trí cập nhật E1–E3B, đơn vị ms; gốc E1–E3 ngày 11/10, E3B ngày 12/10/2026.</w:t>
+      </w:r>
+    </w:p>
+    <w:tbl>
+      <w:tblPr>
+        <w:tblW w:w="9071" w:type="dxa"/>
+        <w:tblBorders>
+          <w:top w:val="single" w:sz="4" w:color="808080"/>
+          <w:left w:val="single" w:sz="4" w:color="808080"/>
+          <w:bottom w:val="single" w:sz="4" w:color="808080"/>
+          <w:right w:val="single" w:sz="4" w:color="808080"/>
+          <w:insideH w:val="single" w:sz="4" w:color="808080"/>
+          <w:insideV w:val="single" w:sz="4" w:color="808080"/>
+        </w:tblBorders>
+        <w:tblLayout w:type="fixed"/>
+        <w:tblCellMar>
+          <w:top w:w="60" w:type="dxa"/>
+          <w:left w:w="115" w:type="dxa"/>
+          <w:bottom w:w="60" w:type="dxa"/>
+          <w:right w:w="115" w:type="dxa"/>
+        </w:tblCellMar>
+      </w:tblPr>
+      <w:tblGrid>
+        <w:gridCol w:w="1814"/>
+        <w:gridCol w:w="1814"/>
+        <w:gridCol w:w="1814"/>
+        <w:gridCol w:w="1814"/>
+        <w:gridCol w:w="1814"/>
+      </w:tblGrid>
+      <w:tr>
+        <w:trPr>
+          <w:cantSplit/>
+          <w:tblHeader/>
+        </w:trPr>
+        <w:tc>
+          <w:tcPr>
+            <w:tcW w:w="1814" w:type="dxa"/>
+            <w:shd w:fill="E8EEF4"/>
+            <w:vAlign w:val="center"/>
+          </w:tcPr>
+          <w:p>
+            <w:pPr>
+              <w:pStyle w:val="TableText"/>
+            </w:pPr>
+            <w:r>
+              <w:rPr>
+                <w:b/>
+              </w:rPr>
+              <w:t xml:space="preserve">Phép đo / điều kiện</w:t>
+            </w:r>
+          </w:p>
+        </w:tc>
+        <w:tc>
+          <w:tcPr>
+            <w:tcW w:w="1814" w:type="dxa"/>
+            <w:shd w:fill="E8EEF4"/>
+            <w:vAlign w:val="center"/>
+          </w:tcPr>
+          <w:p>
+            <w:pPr>
+              <w:pStyle w:val="TableText"/>
+            </w:pPr>
+            <w:r>
+              <w:rPr>
+                <w:b/>
+              </w:rPr>
+              <w:t xml:space="preserve">Gốc</w:t>
+            </w:r>
+          </w:p>
+        </w:tc>
+        <w:tc>
+          <w:tcPr>
+            <w:tcW w:w="1814" w:type="dxa"/>
+            <w:shd w:fill="E8EEF4"/>
+            <w:vAlign w:val="center"/>
+          </w:tcPr>
+          <w:p>
+            <w:pPr>
+              <w:pStyle w:val="TableText"/>
+            </w:pPr>
+            <w:r>
+              <w:rPr>
+                <w:b/>
+              </w:rPr>
+              <w:t xml:space="preserve">Đo lại</w:t>
+            </w:r>
+          </w:p>
+        </w:tc>
+        <w:tc>
+          <w:tcPr>
+            <w:tcW w:w="1814" w:type="dxa"/>
+            <w:shd w:fill="E8EEF4"/>
+            <w:vAlign w:val="center"/>
+          </w:tcPr>
+          <w:p>
+            <w:pPr>
+              <w:pStyle w:val="TableText"/>
+            </w:pPr>
+            <w:r>
+              <w:rPr>
+                <w:b/>
+              </w:rPr>
+              <w:t xml:space="preserve">Hợp lệ gốc</w:t>
+            </w:r>
+          </w:p>
+        </w:tc>
+        <w:tc>
+          <w:tcPr>
+            <w:tcW w:w="1814" w:type="dxa"/>
+            <w:shd w:fill="E8EEF4"/>
+            <w:vAlign w:val="center"/>
+          </w:tcPr>
+          <w:p>
+            <w:pPr>
+              <w:pStyle w:val="TableText"/>
+            </w:pPr>
+            <w:r>
+              <w:rPr>
+                <w:b/>
+              </w:rPr>
+              <w:t xml:space="preserve">Hợp lệ đo lại</w:t>
+            </w:r>
+          </w:p>
+        </w:tc>
+      </w:tr>
+      <w:tr>
+        <w:trPr>
+          <w:cantSplit/>
+        </w:trPr>
+        <w:tc>
+          <w:tcPr>
+            <w:tcW w:w="1814" w:type="dxa"/>
+          </w:tcPr>
+          <w:p>
+            <w:pPr>
+              <w:pStyle w:val="TableText"/>
+            </w:pPr>
+            <w:r>
+              <w:rPr/>
+              <w:t xml:space="preserve">E1 memrate P99</w:t>
+            </w:r>
+          </w:p>
+        </w:tc>
+        <w:tc>
+          <w:tcPr>
+            <w:tcW w:w="1814" w:type="dxa"/>
+          </w:tcPr>
+          <w:p>
+            <w:pPr>
+              <w:pStyle w:val="TableText"/>
+            </w:pPr>
+            <w:r>
+              <w:rPr/>
+              <w:t xml:space="preserve">13977.2</w:t>
+            </w:r>
+          </w:p>
+        </w:tc>
+        <w:tc>
+          <w:tcPr>
+            <w:tcW w:w="1814" w:type="dxa"/>
+          </w:tcPr>
+          <w:p>
+            <w:pPr>
+              <w:pStyle w:val="TableText"/>
+            </w:pPr>
+            <w:r>
+              <w:rPr/>
+              <w:t xml:space="preserve">pending</w:t>
+            </w:r>
+          </w:p>
+        </w:tc>
+        <w:tc>
+          <w:tcPr>
+            <w:tcW w:w="1814" w:type="dxa"/>
+          </w:tcPr>
+          <w:p>
+            <w:pPr>
+              <w:pStyle w:val="TableText"/>
+            </w:pPr>
+            <w:r>
+              <w:rPr/>
+              <w:t xml:space="preserve">3/3</w:t>
+            </w:r>
+          </w:p>
+        </w:tc>
+        <w:tc>
+          <w:tcPr>
+            <w:tcW w:w="1814" w:type="dxa"/>
+          </w:tcPr>
+          <w:p>
+            <w:pPr>
+              <w:pStyle w:val="TableText"/>
+            </w:pPr>
+            <w:r>
+              <w:rPr/>
+              <w:t xml:space="preserve">0/0</w:t>
+            </w:r>
+          </w:p>
+        </w:tc>
+      </w:tr>
+      <w:tr>
+        <w:trPr>
+          <w:cantSplit/>
+        </w:trPr>
+        <w:tc>
+          <w:tcPr>
+            <w:tcW w:w="1814" w:type="dxa"/>
+          </w:tcPr>
+          <w:p>
+            <w:pPr>
+              <w:pStyle w:val="TableText"/>
+            </w:pPr>
+            <w:r>
+              <w:rPr/>
+              <w:t xml:space="preserve">E2 P1 cache P99</w:t>
+            </w:r>
+          </w:p>
+        </w:tc>
+        <w:tc>
+          <w:tcPr>
+            <w:tcW w:w="1814" w:type="dxa"/>
+          </w:tcPr>
+          <w:p>
+            <w:pPr>
+              <w:pStyle w:val="TableText"/>
+            </w:pPr>
+            <w:r>
+              <w:rPr/>
+              <w:t xml:space="preserve">97.1552</w:t>
+            </w:r>
+          </w:p>
+        </w:tc>
+        <w:tc>
+          <w:tcPr>
+            <w:tcW w:w="1814" w:type="dxa"/>
+          </w:tcPr>
+          <w:p>
+            <w:pPr>
+              <w:pStyle w:val="TableText"/>
+            </w:pPr>
+            <w:r>
+              <w:rPr/>
+              <w:t xml:space="preserve">pending</w:t>
+            </w:r>
+          </w:p>
+        </w:tc>
+        <w:tc>
+          <w:tcPr>
+            <w:tcW w:w="1814" w:type="dxa"/>
+          </w:tcPr>
+          <w:p>
+            <w:pPr>
+              <w:pStyle w:val="TableText"/>
+            </w:pPr>
+            <w:r>
+              <w:rPr/>
+              <w:t xml:space="preserve">3/3</w:t>
+            </w:r>
+          </w:p>
+        </w:tc>
+        <w:tc>
+          <w:tcPr>
+            <w:tcW w:w="1814" w:type="dxa"/>
+          </w:tcPr>
+          <w:p>
+            <w:pPr>
+              <w:pStyle w:val="TableText"/>
+            </w:pPr>
+            <w:r>
+              <w:rPr/>
+              <w:t xml:space="preserve">0/0</w:t>
+            </w:r>
+          </w:p>
+        </w:tc>
+      </w:tr>
+      <w:tr>
+        <w:trPr>
+          <w:cantSplit/>
+        </w:trPr>
+        <w:tc>
+          <w:tcPr>
+            <w:tcW w:w="1814" w:type="dxa"/>
+          </w:tcPr>
+          <w:p>
+            <w:pPr>
+              <w:pStyle w:val="TableText"/>
+            </w:pPr>
+            <w:r>
+              <w:rPr/>
+              <w:t xml:space="preserve">E3 memrate latest AoI</w:t>
+            </w:r>
+          </w:p>
+        </w:tc>
+        <w:tc>
+          <w:tcPr>
+            <w:tcW w:w="1814" w:type="dxa"/>
+          </w:tcPr>
+          <w:p>
+            <w:pPr>
+              <w:pStyle w:val="TableText"/>
+            </w:pPr>
+            <w:r>
+              <w:rPr/>
+              <w:t xml:space="preserve">6957.88</w:t>
+            </w:r>
+          </w:p>
+        </w:tc>
+        <w:tc>
+          <w:tcPr>
+            <w:tcW w:w="1814" w:type="dxa"/>
+          </w:tcPr>
+          <w:p>
+            <w:pPr>
+              <w:pStyle w:val="TableText"/>
+            </w:pPr>
+            <w:r>
+              <w:rPr/>
+              <w:t xml:space="preserve">pending</w:t>
+            </w:r>
+          </w:p>
+        </w:tc>
+        <w:tc>
+          <w:tcPr>
+            <w:tcW w:w="1814" w:type="dxa"/>
+          </w:tcPr>
+          <w:p>
+            <w:pPr>
+              <w:pStyle w:val="TableText"/>
+            </w:pPr>
+            <w:r>
+              <w:rPr/>
+              <w:t xml:space="preserve">3/3</w:t>
+            </w:r>
+          </w:p>
+        </w:tc>
+        <w:tc>
+          <w:tcPr>
+            <w:tcW w:w="1814" w:type="dxa"/>
+          </w:tcPr>
+          <w:p>
+            <w:pPr>
+              <w:pStyle w:val="TableText"/>
+            </w:pPr>
+            <w:r>
+              <w:rPr/>
+              <w:t xml:space="preserve">0/0</w:t>
+            </w:r>
+          </w:p>
+        </w:tc>
+      </w:tr>
+      <w:tr>
+        <w:trPr>
+          <w:cantSplit/>
+        </w:trPr>
+        <w:tc>
+          <w:tcPr>
+            <w:tcW w:w="1814" w:type="dxa"/>
+          </w:tcPr>
+          <w:p>
+            <w:pPr>
+              <w:pStyle w:val="TableText"/>
+            </w:pPr>
+            <w:r>
+              <w:rPr/>
+              <w:t xml:space="preserve">E3B input latest P99</w:t>
+            </w:r>
+          </w:p>
+        </w:tc>
+        <w:tc>
+          <w:tcPr>
+            <w:tcW w:w="1814" w:type="dxa"/>
+          </w:tcPr>
+          <w:p>
+            <w:pPr>
+              <w:pStyle w:val="TableText"/>
+            </w:pPr>
+            <w:r>
+              <w:rPr/>
+              <w:t xml:space="preserve">failed: no valid runs</w:t>
+            </w:r>
+          </w:p>
+        </w:tc>
+        <w:tc>
+          <w:tcPr>
+            <w:tcW w:w="1814" w:type="dxa"/>
+          </w:tcPr>
+          <w:p>
+            <w:pPr>
+              <w:pStyle w:val="TableText"/>
+            </w:pPr>
+            <w:r>
+              <w:rPr/>
+              <w:t xml:space="preserve">pending</w:t>
+            </w:r>
+          </w:p>
+        </w:tc>
+        <w:tc>
+          <w:tcPr>
+            <w:tcW w:w="1814" w:type="dxa"/>
+          </w:tcPr>
+          <w:p>
+            <w:pPr>
+              <w:pStyle w:val="TableText"/>
+            </w:pPr>
+            <w:r>
+              <w:rPr/>
+              <w:t xml:space="preserve">0/3</w:t>
+            </w:r>
+          </w:p>
+        </w:tc>
+        <w:tc>
+          <w:tcPr>
+            <w:tcW w:w="1814" w:type="dxa"/>
+          </w:tcPr>
+          <w:p>
+            <w:pPr>
+              <w:pStyle w:val="TableText"/>
+            </w:pPr>
+            <w:r>
+              <w:rPr/>
+              <w:t xml:space="preserve">0/0</w:t>
+            </w:r>
+          </w:p>
+        </w:tc>
+      </w:tr>
+    </w:tbl>
+    <w:p>
+      <w:pPr/>
+      <w:r>
+        <w:rPr/>
+        <w:t xml:space="preserve">Các ô pending đang chờ dữ liệu E1–E3B và chưa được xem là kết quả đo trong đợt bổ sung này. Khi bổ sung chiến dịch, bảng được tạo lại từ tệp đối chiếu, giữ nguyên tải, profile, chính sách đầu vào và bridge tương ứng. E3 trình bày AoI trung bình đã khởi tạo; E1, E2 và E3B trình bày P99 chuyển giao, nên các hàng có ý nghĩa khác nhau. Các lượt E3B gốc có tải không hợp lệ không được dùng làm đối chứng sạch cho lợi ích của input-latest. Thí nghiệm inference độc lập và so sánh chính sách E3 trên UART vật lý chưa được lặp lại trong bố cục này.</w:t>
       </w:r>
     </w:p>
     <w:p>

</xml_diff>

<commit_message>
Add E1-E3B re-run results (57/57 valid) and rebuild deck and report
</commit_message>
<xml_diff>
--- a/report_vi/BaoCao_HDH_Nhom3Stars.docx
+++ b/report_vi/BaoCao_HDH_Nhom3Stars.docx
@@ -8799,6 +8799,81 @@
             </w:pPr>
             <w:r>
               <w:rPr/>
+              <w:t xml:space="preserve">10752.7</w:t>
+            </w:r>
+          </w:p>
+        </w:tc>
+        <w:tc>
+          <w:tcPr>
+            <w:tcW w:w="1814" w:type="dxa"/>
+          </w:tcPr>
+          <w:p>
+            <w:pPr>
+              <w:pStyle w:val="TableText"/>
+            </w:pPr>
+            <w:r>
+              <w:rPr/>
+              <w:t xml:space="preserve">3/3</w:t>
+            </w:r>
+          </w:p>
+        </w:tc>
+        <w:tc>
+          <w:tcPr>
+            <w:tcW w:w="1814" w:type="dxa"/>
+          </w:tcPr>
+          <w:p>
+            <w:pPr>
+              <w:pStyle w:val="TableText"/>
+            </w:pPr>
+            <w:r>
+              <w:rPr/>
+              <w:t xml:space="preserve">3/3</w:t>
+            </w:r>
+          </w:p>
+        </w:tc>
+      </w:tr>
+      <w:tr>
+        <w:trPr>
+          <w:cantSplit/>
+        </w:trPr>
+        <w:tc>
+          <w:tcPr>
+            <w:tcW w:w="1814" w:type="dxa"/>
+          </w:tcPr>
+          <w:p>
+            <w:pPr>
+              <w:pStyle w:val="TableText"/>
+            </w:pPr>
+            <w:r>
+              <w:rPr/>
+              <w:t xml:space="preserve">E2 P1 cache P99</w:t>
+            </w:r>
+          </w:p>
+        </w:tc>
+        <w:tc>
+          <w:tcPr>
+            <w:tcW w:w="1814" w:type="dxa"/>
+          </w:tcPr>
+          <w:p>
+            <w:pPr>
+              <w:pStyle w:val="TableText"/>
+            </w:pPr>
+            <w:r>
+              <w:rPr/>
+              <w:t xml:space="preserve">97.1552</w:t>
+            </w:r>
+          </w:p>
+        </w:tc>
+        <w:tc>
+          <w:tcPr>
+            <w:tcW w:w="1814" w:type="dxa"/>
+          </w:tcPr>
+          <w:p>
+            <w:pPr>
+              <w:pStyle w:val="TableText"/>
+            </w:pPr>
+            <w:r>
+              <w:rPr/>
               <w:t xml:space="preserve">pending</w:t>
             </w:r>
           </w:p>
@@ -8846,35 +8921,35 @@
             </w:pPr>
             <w:r>
               <w:rPr/>
-              <w:t xml:space="preserve">E2 P1 cache P99</w:t>
-            </w:r>
-          </w:p>
-        </w:tc>
-        <w:tc>
-          <w:tcPr>
-            <w:tcW w:w="1814" w:type="dxa"/>
-          </w:tcPr>
-          <w:p>
-            <w:pPr>
-              <w:pStyle w:val="TableText"/>
-            </w:pPr>
-            <w:r>
-              <w:rPr/>
-              <w:t xml:space="preserve">97.1552</w:t>
-            </w:r>
-          </w:p>
-        </w:tc>
-        <w:tc>
-          <w:tcPr>
-            <w:tcW w:w="1814" w:type="dxa"/>
-          </w:tcPr>
-          <w:p>
-            <w:pPr>
-              <w:pStyle w:val="TableText"/>
-            </w:pPr>
-            <w:r>
-              <w:rPr/>
-              <w:t xml:space="preserve">pending</w:t>
+              <w:t xml:space="preserve">E3 memrate latest AoI</w:t>
+            </w:r>
+          </w:p>
+        </w:tc>
+        <w:tc>
+          <w:tcPr>
+            <w:tcW w:w="1814" w:type="dxa"/>
+          </w:tcPr>
+          <w:p>
+            <w:pPr>
+              <w:pStyle w:val="TableText"/>
+            </w:pPr>
+            <w:r>
+              <w:rPr/>
+              <w:t xml:space="preserve">6957.88</w:t>
+            </w:r>
+          </w:p>
+        </w:tc>
+        <w:tc>
+          <w:tcPr>
+            <w:tcW w:w="1814" w:type="dxa"/>
+          </w:tcPr>
+          <w:p>
+            <w:pPr>
+              <w:pStyle w:val="TableText"/>
+            </w:pPr>
+            <w:r>
+              <w:rPr/>
+              <w:t xml:space="preserve">2645.45</w:t>
             </w:r>
           </w:p>
         </w:tc>
@@ -8902,85 +8977,10 @@
             </w:pPr>
             <w:r>
               <w:rPr/>
-              <w:t xml:space="preserve">0/0</w:t>
-            </w:r>
-          </w:p>
-        </w:tc>
-      </w:tr>
-      <w:tr>
-        <w:trPr>
-          <w:cantSplit/>
-        </w:trPr>
-        <w:tc>
-          <w:tcPr>
-            <w:tcW w:w="1814" w:type="dxa"/>
-          </w:tcPr>
-          <w:p>
-            <w:pPr>
-              <w:pStyle w:val="TableText"/>
-            </w:pPr>
-            <w:r>
-              <w:rPr/>
-              <w:t xml:space="preserve">E3 memrate latest AoI</w:t>
-            </w:r>
-          </w:p>
-        </w:tc>
-        <w:tc>
-          <w:tcPr>
-            <w:tcW w:w="1814" w:type="dxa"/>
-          </w:tcPr>
-          <w:p>
-            <w:pPr>
-              <w:pStyle w:val="TableText"/>
-            </w:pPr>
-            <w:r>
-              <w:rPr/>
-              <w:t xml:space="preserve">6957.88</w:t>
-            </w:r>
-          </w:p>
-        </w:tc>
-        <w:tc>
-          <w:tcPr>
-            <w:tcW w:w="1814" w:type="dxa"/>
-          </w:tcPr>
-          <w:p>
-            <w:pPr>
-              <w:pStyle w:val="TableText"/>
-            </w:pPr>
-            <w:r>
-              <w:rPr/>
-              <w:t xml:space="preserve">pending</w:t>
-            </w:r>
-          </w:p>
-        </w:tc>
-        <w:tc>
-          <w:tcPr>
-            <w:tcW w:w="1814" w:type="dxa"/>
-          </w:tcPr>
-          <w:p>
-            <w:pPr>
-              <w:pStyle w:val="TableText"/>
-            </w:pPr>
-            <w:r>
-              <w:rPr/>
               <w:t xml:space="preserve">3/3</w:t>
             </w:r>
           </w:p>
         </w:tc>
-        <w:tc>
-          <w:tcPr>
-            <w:tcW w:w="1814" w:type="dxa"/>
-          </w:tcPr>
-          <w:p>
-            <w:pPr>
-              <w:pStyle w:val="TableText"/>
-            </w:pPr>
-            <w:r>
-              <w:rPr/>
-              <w:t xml:space="preserve">0/0</w:t>
-            </w:r>
-          </w:p>
-        </w:tc>
       </w:tr>
       <w:tr>
         <w:trPr>
@@ -9024,7 +9024,7 @@
             </w:pPr>
             <w:r>
               <w:rPr/>
-              <w:t xml:space="preserve">pending</w:t>
+              <w:t xml:space="preserve">225</w:t>
             </w:r>
           </w:p>
         </w:tc>
@@ -9052,7 +9052,7 @@
             </w:pPr>
             <w:r>
               <w:rPr/>
-              <w:t xml:space="preserve">0/0</w:t>
+              <w:t xml:space="preserve">3/3</w:t>
             </w:r>
           </w:p>
         </w:tc>

</xml_diff>

<commit_message>
Re-run docs: E2 like-for-like comparison, data-driven availability text, interpretations
</commit_message>
<xml_diff>
--- a/report_vi/BaoCao_HDH_Nhom3Stars.docx
+++ b/report_vi/BaoCao_HDH_Nhom3Stars.docx
@@ -8632,7 +8632,7 @@
       <w:pPr/>
       <w:r>
         <w:rPr/>
-        <w:t xml:space="preserve">Bảng đo lại F. Vị trí cập nhật E1–E3B, đơn vị ms; gốc E1–E3 ngày 11/10, E3B ngày 12/10/2026.</w:t>
+        <w:t xml:space="preserve">Bảng đo lại F. Kết quả đo E1–E3B trên PTY, đơn vị ms; gốc E1–E3 ngày 11/10, E3B ngày 12/10/2026.</w:t>
       </w:r>
     </w:p>
     <w:tbl>
@@ -8846,35 +8846,35 @@
             </w:pPr>
             <w:r>
               <w:rPr/>
-              <w:t xml:space="preserve">E2 P1 cache P99</w:t>
-            </w:r>
-          </w:p>
-        </w:tc>
-        <w:tc>
-          <w:tcPr>
-            <w:tcW w:w="1814" w:type="dxa"/>
-          </w:tcPr>
-          <w:p>
-            <w:pPr>
-              <w:pStyle w:val="TableText"/>
-            </w:pPr>
-            <w:r>
-              <w:rPr/>
-              <w:t xml:space="preserve">97.1552</w:t>
-            </w:r>
-          </w:p>
-        </w:tc>
-        <w:tc>
-          <w:tcPr>
-            <w:tcW w:w="1814" w:type="dxa"/>
-          </w:tcPr>
-          <w:p>
-            <w:pPr>
-              <w:pStyle w:val="TableText"/>
-            </w:pPr>
-            <w:r>
-              <w:rPr/>
-              <w:t xml:space="preserve">pending</w:t>
+              <w:t xml:space="preserve">E2 P1 memrate P99</w:t>
+            </w:r>
+          </w:p>
+        </w:tc>
+        <w:tc>
+          <w:tcPr>
+            <w:tcW w:w="1814" w:type="dxa"/>
+          </w:tcPr>
+          <w:p>
+            <w:pPr>
+              <w:pStyle w:val="TableText"/>
+            </w:pPr>
+            <w:r>
+              <w:rPr/>
+              <w:t xml:space="preserve">12890.2</w:t>
+            </w:r>
+          </w:p>
+        </w:tc>
+        <w:tc>
+          <w:tcPr>
+            <w:tcW w:w="1814" w:type="dxa"/>
+          </w:tcPr>
+          <w:p>
+            <w:pPr>
+              <w:pStyle w:val="TableText"/>
+            </w:pPr>
+            <w:r>
+              <w:rPr/>
+              <w:t xml:space="preserve">8357.15</w:t>
             </w:r>
           </w:p>
         </w:tc>
@@ -8902,10 +8902,85 @@
             </w:pPr>
             <w:r>
               <w:rPr/>
+              <w:t xml:space="preserve">3/3</w:t>
+            </w:r>
+          </w:p>
+        </w:tc>
+      </w:tr>
+      <w:tr>
+        <w:trPr>
+          <w:cantSplit/>
+        </w:trPr>
+        <w:tc>
+          <w:tcPr>
+            <w:tcW w:w="1814" w:type="dxa"/>
+          </w:tcPr>
+          <w:p>
+            <w:pPr>
+              <w:pStyle w:val="TableText"/>
+            </w:pPr>
+            <w:r>
+              <w:rPr/>
+              <w:t xml:space="preserve">E2 P1 stream P99</w:t>
+            </w:r>
+          </w:p>
+        </w:tc>
+        <w:tc>
+          <w:tcPr>
+            <w:tcW w:w="1814" w:type="dxa"/>
+          </w:tcPr>
+          <w:p>
+            <w:pPr>
+              <w:pStyle w:val="TableText"/>
+            </w:pPr>
+            <w:r>
+              <w:rPr/>
+              <w:t xml:space="preserve">—</w:t>
+            </w:r>
+          </w:p>
+        </w:tc>
+        <w:tc>
+          <w:tcPr>
+            <w:tcW w:w="1814" w:type="dxa"/>
+          </w:tcPr>
+          <w:p>
+            <w:pPr>
+              <w:pStyle w:val="TableText"/>
+            </w:pPr>
+            <w:r>
+              <w:rPr/>
+              <w:t xml:space="preserve">83.2902</w:t>
+            </w:r>
+          </w:p>
+        </w:tc>
+        <w:tc>
+          <w:tcPr>
+            <w:tcW w:w="1814" w:type="dxa"/>
+          </w:tcPr>
+          <w:p>
+            <w:pPr>
+              <w:pStyle w:val="TableText"/>
+            </w:pPr>
+            <w:r>
+              <w:rPr/>
               <w:t xml:space="preserve">0/0</w:t>
             </w:r>
           </w:p>
         </w:tc>
+        <w:tc>
+          <w:tcPr>
+            <w:tcW w:w="1814" w:type="dxa"/>
+          </w:tcPr>
+          <w:p>
+            <w:pPr>
+              <w:pStyle w:val="TableText"/>
+            </w:pPr>
+            <w:r>
+              <w:rPr/>
+              <w:t xml:space="preserve">3/3</w:t>
+            </w:r>
+          </w:p>
+        </w:tc>
       </w:tr>
       <w:tr>
         <w:trPr>
@@ -9062,7 +9137,42 @@
       <w:pPr/>
       <w:r>
         <w:rPr/>
-        <w:t xml:space="preserve">Các ô pending đang chờ dữ liệu E1–E3B và chưa được xem là kết quả đo trong đợt bổ sung này. Khi bổ sung chiến dịch, bảng được tạo lại từ tệp đối chiếu, giữ nguyên tải, profile, chính sách đầu vào và bridge tương ứng. E3 trình bày AoI trung bình đã khởi tạo; E1, E2 và E3B trình bày P99 chuyển giao, nên các hàng có ý nghĩa khác nhau. Các lượt E3B gốc có tải không hợp lệ không được dùng làm đối chứng sạch cho lợi ích của input-latest. Thí nghiệm inference độc lập và so sánh chính sách E3 trên UART vật lý chưa được lặp lại trong bố cục này.</w:t>
+        <w:t xml:space="preserve">Bằng chứng pipeline hiện có: E1, E2, E3, E3B. Xếp hạng E1 thay đổi: memrate + cache thành memrate + stream; cache không được chạy trong E2 lần này. Stream không có đối chứng E2 gốc; memrate được đối chiếu cùng điều kiện. Bảng được tạo từ tệp đối chiếu theo tải, profile, chính sách đầu vào và bridge tương ứng. E3 trình bày AoI trung bình đã khởi tạo; E1, E2 và E3B trình bày P99 chuyển giao, nên các hàng có ý nghĩa khác nhau. Các lượt E3B gốc có tải không hợp lệ không được dùng làm đối chứng sạch cho lợi ích của input-latest. Thí nghiệm inference độc lập và so sánh chính sách E3 trên UART vật lý chưa được lặp lại trong bố cục này.</w:t>
+      </w:r>
+    </w:p>
+    <w:p>
+      <w:pPr/>
+      <w:r>
+        <w:rPr/>
+        <w:t xml:space="preserve">E1: P99 tải memrate so với nhàn rỗi; tranh chấp làm chậm chuyển giao: 10752.7 &gt; 45.7999 ms (bằng chứng đo).</w:t>
+      </w:r>
+    </w:p>
+    <w:p>
+      <w:pPr/>
+      <w:r>
+        <w:rPr/>
+        <w:t xml:space="preserve">E2: P99 memrate P0 so với P1; tinh chỉnh vẫn để lại tồn đọng: 13169.4 &gt; 8357.15 ms (bằng chứng đo).</w:t>
+      </w:r>
+    </w:p>
+    <w:p>
+      <w:pPr/>
+      <w:r>
+        <w:rPr/>
+        <w:t xml:space="preserve">E3: AoI bridge FIFO so với latest; tồn đọng phía trước vẫn còn: 3680.48 &gt; 2645.45 ms (bằng chứng đo).</w:t>
+      </w:r>
+    </w:p>
+    <w:p>
+      <w:pPr/>
+      <w:r>
+        <w:rPr/>
+        <w:t xml:space="preserve">E3B: P99 input FIFO so với latest; thay mẫu để giữ độ mới: 4698.46 &gt; 225 ms (bằng chứng đo).</w:t>
+      </w:r>
+    </w:p>
+    <w:p>
+      <w:pPr/>
+      <w:r>
+        <w:rPr/>
+        <w:t xml:space="preserve">Các diễn giải trên dùng bằng chứng PTY đo lại, không xác nhận AoI trên UART vật lý hoặc cận trễ. E3B mới có đối chứng input FIFO/latest hợp lệ riêng; không suy lợi ích từ các lượt tải gốc không hợp lệ.</w:t>
       </w:r>
     </w:p>
     <w:p>

</xml_diff>